<commit_message>
S156 QC pass: 4 modal fixes + QC_REVIEW.md (128 issues, 4 fixed, 124 pending Leonard review)
- 4 surgical modal fixes: sen 須每年→宜每年; gifted 須協調→應協調; qa 須不記名→應不記名; qa 須制訂→應制訂+法團校董會→校董會/學管會
- 6 docx regenerated: sen×2, gifted×2, qa_inspection×2
- QC_REVIEW.md: full 128-issue categorized table with fix actions
- SESSION_HANDOFF + SESSION_LOG + BATCH_STATE + START_NEXT_SESSION_PROMPT updated

Co-Authored-By: Claude Sonnet 4.6 <noreply@anthropic.com>
</commit_message>
<xml_diff>
--- a/dev/checklists/gifted/本校資優教育政策_學校版_DRAFT.docx
+++ b/dev/checklists/gifted/本校資優教育政策_學校版_DRAFT.docx
@@ -2295,7 +2295,7 @@
         </w:rPr>
         <w:t xml:space="preserve">1　</w:t>
       </w:r>
-      <w:hyperlink w:history="1" r:id="rIde8nr44lp6sxuspixxaftc">
+      <w:hyperlink w:history="1" r:id="rIdtxm9ai4arvpaw1udlsozt">
         <w:r>
           <w:rPr>
             <w:rStyle w:val="Hyperlink"/>
@@ -2321,7 +2321,7 @@
         </w:rPr>
         <w:t xml:space="preserve">2　</w:t>
       </w:r>
-      <w:hyperlink w:history="1" r:id="rIdlvtskthby7nywmdf1sswu">
+      <w:hyperlink w:history="1" r:id="rIdyghiq1c5wtt-b8ibjjxct">
         <w:r>
           <w:rPr>
             <w:rStyle w:val="Hyperlink"/>
@@ -2347,7 +2347,7 @@
         </w:rPr>
         <w:t xml:space="preserve">3, 14　</w:t>
       </w:r>
-      <w:hyperlink w:history="1" r:id="rIdwmn7clwqjk1imr1x_jrrv">
+      <w:hyperlink w:history="1" r:id="rIdzkpy4mzchkh9bifhb1ljf">
         <w:r>
           <w:rPr>
             <w:rStyle w:val="Hyperlink"/>
@@ -2373,7 +2373,7 @@
         </w:rPr>
         <w:t xml:space="preserve">4　</w:t>
       </w:r>
-      <w:hyperlink w:history="1" r:id="rIdturr-z4gsnnbdebmxrqd5">
+      <w:hyperlink w:history="1" r:id="rIdt3fypc7l_xm69fdxodl99">
         <w:r>
           <w:rPr>
             <w:rStyle w:val="Hyperlink"/>
@@ -2399,7 +2399,7 @@
         </w:rPr>
         <w:t xml:space="preserve">5　</w:t>
       </w:r>
-      <w:hyperlink w:history="1" r:id="rId_cf9756-xaxcd0pwvt-sr">
+      <w:hyperlink w:history="1" r:id="rIduev_ge6gq-vcl0u5bipdo">
         <w:r>
           <w:rPr>
             <w:rStyle w:val="Hyperlink"/>
@@ -2425,7 +2425,7 @@
         </w:rPr>
         <w:t xml:space="preserve">6　</w:t>
       </w:r>
-      <w:hyperlink w:history="1" r:id="rIdxjbyz0vf4mv-hs4f76mv_">
+      <w:hyperlink w:history="1" r:id="rIdyxggs92cxf44_ngmzh_di">
         <w:r>
           <w:rPr>
             <w:rStyle w:val="Hyperlink"/>
@@ -2451,7 +2451,7 @@
         </w:rPr>
         <w:t xml:space="preserve">7, 20　</w:t>
       </w:r>
-      <w:hyperlink w:history="1" r:id="rId2g-htvmqt58thkxqtyofx">
+      <w:hyperlink w:history="1" r:id="rId55k3bq32bmrjg209yobvz">
         <w:r>
           <w:rPr>
             <w:rStyle w:val="Hyperlink"/>
@@ -2477,7 +2477,7 @@
         </w:rPr>
         <w:t xml:space="preserve">8　</w:t>
       </w:r>
-      <w:hyperlink w:history="1" r:id="rId94q5xiypzuwzexs7g7nhl">
+      <w:hyperlink w:history="1" r:id="rIdpivdod6wiu19m9rlhbpsm">
         <w:r>
           <w:rPr>
             <w:rStyle w:val="Hyperlink"/>
@@ -2503,7 +2503,7 @@
         </w:rPr>
         <w:t xml:space="preserve">9, 12　</w:t>
       </w:r>
-      <w:hyperlink w:history="1" r:id="rIdyapgg3ov30ocbv_kh209a">
+      <w:hyperlink w:history="1" r:id="rIdethjnzjsoivyowug0hpdw">
         <w:r>
           <w:rPr>
             <w:rStyle w:val="Hyperlink"/>
@@ -2529,7 +2529,7 @@
         </w:rPr>
         <w:t xml:space="preserve">10　</w:t>
       </w:r>
-      <w:hyperlink w:history="1" r:id="rIdqcfn82eda1kntqttewcem">
+      <w:hyperlink w:history="1" r:id="rIdjinswjs_fp0bjy0_1zv85">
         <w:r>
           <w:rPr>
             <w:rStyle w:val="Hyperlink"/>
@@ -2555,7 +2555,7 @@
         </w:rPr>
         <w:t xml:space="preserve">11　</w:t>
       </w:r>
-      <w:hyperlink w:history="1" r:id="rIdwupk_2p1oemx5g3ezyimb">
+      <w:hyperlink w:history="1" r:id="rIdpaxwgegi3ylvtfiyosyku">
         <w:r>
           <w:rPr>
             <w:rStyle w:val="Hyperlink"/>
@@ -2581,7 +2581,7 @@
         </w:rPr>
         <w:t xml:space="preserve">13　</w:t>
       </w:r>
-      <w:hyperlink w:history="1" r:id="rIdvx8hekbk-hkuattq9w3qk">
+      <w:hyperlink w:history="1" r:id="rId8bh9lpusltxx8qauskwwb">
         <w:r>
           <w:rPr>
             <w:rStyle w:val="Hyperlink"/>
@@ -2607,7 +2607,7 @@
         </w:rPr>
         <w:t xml:space="preserve">15　</w:t>
       </w:r>
-      <w:hyperlink w:history="1" r:id="rIdtbrjvpbvnbcspxcv4wtkv">
+      <w:hyperlink w:history="1" r:id="rIdcaukzhbxv3awuenbekkao">
         <w:r>
           <w:rPr>
             <w:rStyle w:val="Hyperlink"/>
@@ -2633,7 +2633,7 @@
         </w:rPr>
         <w:t xml:space="preserve">16　</w:t>
       </w:r>
-      <w:hyperlink w:history="1" r:id="rIdlihm64r-yuaotirjmyym5">
+      <w:hyperlink w:history="1" r:id="rIdq2tsboewgbh9gio4zud3o">
         <w:r>
           <w:rPr>
             <w:rStyle w:val="Hyperlink"/>
@@ -2659,7 +2659,7 @@
         </w:rPr>
         <w:t xml:space="preserve">17　</w:t>
       </w:r>
-      <w:hyperlink w:history="1" r:id="rIdozyr-ta5av92ygfz8dhu7">
+      <w:hyperlink w:history="1" r:id="rIdt1pt9ri5ahzjfdaycqr89">
         <w:r>
           <w:rPr>
             <w:rStyle w:val="Hyperlink"/>
@@ -2685,7 +2685,7 @@
         </w:rPr>
         <w:t xml:space="preserve">18　</w:t>
       </w:r>
-      <w:hyperlink w:history="1" r:id="rId0ki6dpvx9yg3nymr_k4nq">
+      <w:hyperlink w:history="1" r:id="rIdu8ciq0-kjazjn1yiyxsyo">
         <w:r>
           <w:rPr>
             <w:rStyle w:val="Hyperlink"/>
@@ -2711,7 +2711,7 @@
         </w:rPr>
         <w:t xml:space="preserve">19　</w:t>
       </w:r>
-      <w:hyperlink w:history="1" r:id="rIdbpnxm329zlyrbogcwq8ex">
+      <w:hyperlink w:history="1" r:id="rId3s1msa2lbyyqrtdbcg1-q">
         <w:r>
           <w:rPr>
             <w:rStyle w:val="Hyperlink"/>
@@ -4332,7 +4332,7 @@
           <w:sz w:val="22"/>
           <w:szCs w:val="22"/>
         </w:rPr>
-        <w:t xml:space="preserve">須協調校內</w:t>
+        <w:t xml:space="preserve">應協調校內</w:t>
       </w:r>
       <w:r>
         <w:rPr>
@@ -4759,7 +4759,7 @@
         </w:rPr>
         <w:t xml:space="preserve">1, 2, 4, 6, 14, 15, 16　</w:t>
       </w:r>
-      <w:hyperlink w:history="1" r:id="rIdznbib_tokb5pok97abrsv">
+      <w:hyperlink w:history="1" r:id="rIdjlkoftywmv07u1duje2kd">
         <w:r>
           <w:rPr>
             <w:rStyle w:val="Hyperlink"/>
@@ -4785,7 +4785,7 @@
         </w:rPr>
         <w:t xml:space="preserve">3　</w:t>
       </w:r>
-      <w:hyperlink w:history="1" r:id="rIdp6_gtkkht1xqzxrq-tbn9">
+      <w:hyperlink w:history="1" r:id="rIdwwhd0fmju1cttxtotbxdg">
         <w:r>
           <w:rPr>
             <w:rStyle w:val="Hyperlink"/>
@@ -4811,7 +4811,7 @@
         </w:rPr>
         <w:t xml:space="preserve">5　</w:t>
       </w:r>
-      <w:hyperlink w:history="1" r:id="rIdz5t-wzspxfp27qd5l8cva">
+      <w:hyperlink w:history="1" r:id="rId8ael38_2jiwopnhjwgtuj">
         <w:r>
           <w:rPr>
             <w:rStyle w:val="Hyperlink"/>
@@ -4837,7 +4837,7 @@
         </w:rPr>
         <w:t xml:space="preserve">7　</w:t>
       </w:r>
-      <w:hyperlink w:history="1" r:id="rIden_mnkjhrer3f2ggb1ohm">
+      <w:hyperlink w:history="1" r:id="rIdvdy9sen0kcal9sphxs34f">
         <w:r>
           <w:rPr>
             <w:rStyle w:val="Hyperlink"/>
@@ -4863,7 +4863,7 @@
         </w:rPr>
         <w:t xml:space="preserve">8, 11　</w:t>
       </w:r>
-      <w:hyperlink w:history="1" r:id="rIdj7x_na82yl4xkbncriofb">
+      <w:hyperlink w:history="1" r:id="rIdxkoxla4ux7psnih72vpus">
         <w:r>
           <w:rPr>
             <w:rStyle w:val="Hyperlink"/>
@@ -4889,7 +4889,7 @@
         </w:rPr>
         <w:t xml:space="preserve">9　</w:t>
       </w:r>
-      <w:hyperlink w:history="1" r:id="rIdnfybc8dkdfnsmckbjwaxe">
+      <w:hyperlink w:history="1" r:id="rIdzucclyw5fbvf9gp0v10ro">
         <w:r>
           <w:rPr>
             <w:rStyle w:val="Hyperlink"/>
@@ -4915,7 +4915,7 @@
         </w:rPr>
         <w:t xml:space="preserve">10　</w:t>
       </w:r>
-      <w:hyperlink w:history="1" r:id="rIdrivwpf1ucyq85y_cz0-mb">
+      <w:hyperlink w:history="1" r:id="rIdzcnvfqwze2ps3yvfcsmci">
         <w:r>
           <w:rPr>
             <w:rStyle w:val="Hyperlink"/>
@@ -4941,7 +4941,7 @@
         </w:rPr>
         <w:t xml:space="preserve">12　</w:t>
       </w:r>
-      <w:hyperlink w:history="1" r:id="rIdhtdi-9aso9g62pb-_46lw">
+      <w:hyperlink w:history="1" r:id="rIdiqpsm14jdx2fbxkvz8nht">
         <w:r>
           <w:rPr>
             <w:rStyle w:val="Hyperlink"/>
@@ -4967,7 +4967,7 @@
         </w:rPr>
         <w:t xml:space="preserve">13　</w:t>
       </w:r>
-      <w:hyperlink w:history="1" r:id="rIdbqrylywnqbn91xfjkf_km">
+      <w:hyperlink w:history="1" r:id="rId6o2y2klkhhwu-fuqcqpsd">
         <w:r>
           <w:rPr>
             <w:rStyle w:val="Hyperlink"/>
@@ -4993,7 +4993,7 @@
         </w:rPr>
         <w:t xml:space="preserve">17　</w:t>
       </w:r>
-      <w:hyperlink w:history="1" r:id="rId2a6vab_vkgu9il-xaxdxj">
+      <w:hyperlink w:history="1" r:id="rIdrrartewd5ol5sypxeuxsl">
         <w:r>
           <w:rPr>
             <w:rStyle w:val="Hyperlink"/>
@@ -5019,7 +5019,7 @@
         </w:rPr>
         <w:t xml:space="preserve">18　</w:t>
       </w:r>
-      <w:hyperlink w:history="1" r:id="rId2yiz8wj5a9wepwycsngit">
+      <w:hyperlink w:history="1" r:id="rIdtbdtvx4voe46cuikdep_6">
         <w:r>
           <w:rPr>
             <w:rStyle w:val="Hyperlink"/>
@@ -5045,7 +5045,7 @@
         </w:rPr>
         <w:t xml:space="preserve">19　</w:t>
       </w:r>
-      <w:hyperlink w:history="1" r:id="rIdcuwezuvstswmlwarix2fm">
+      <w:hyperlink w:history="1" r:id="rIdpr1p_9asgl9htayvchsze">
         <w:r>
           <w:rPr>
             <w:rStyle w:val="Hyperlink"/>
@@ -5071,7 +5071,7 @@
         </w:rPr>
         <w:t xml:space="preserve">20　</w:t>
       </w:r>
-      <w:hyperlink w:history="1" r:id="rIdldwl1uucjt8bo8zeei6fl">
+      <w:hyperlink w:history="1" r:id="rIdya84osafg5p2opzfkluxk">
         <w:r>
           <w:rPr>
             <w:rStyle w:val="Hyperlink"/>
@@ -5097,7 +5097,7 @@
         </w:rPr>
         <w:t xml:space="preserve">21　</w:t>
       </w:r>
-      <w:hyperlink w:history="1" r:id="rIdziz-etlc8jarcgefkotai">
+      <w:hyperlink w:history="1" r:id="rIdvgb5kqalsplvmshbyjzgp">
         <w:r>
           <w:rPr>
             <w:rStyle w:val="Hyperlink"/>
@@ -7054,7 +7054,7 @@
         </w:rPr>
         <w:t xml:space="preserve">1, 4, 11　</w:t>
       </w:r>
-      <w:hyperlink w:history="1" r:id="rIdafwaagbikx-a0knn1yxbj">
+      <w:hyperlink w:history="1" r:id="rIdqpobqwptuuhsw6sea-vxt">
         <w:r>
           <w:rPr>
             <w:rStyle w:val="Hyperlink"/>
@@ -7080,7 +7080,7 @@
         </w:rPr>
         <w:t xml:space="preserve">2, 7, 12, 40　</w:t>
       </w:r>
-      <w:hyperlink w:history="1" r:id="rId8oebdcsm5inbz90jlyrmb">
+      <w:hyperlink w:history="1" r:id="rId1gjg1vydwka21ls5e-0ts">
         <w:r>
           <w:rPr>
             <w:rStyle w:val="Hyperlink"/>
@@ -7106,7 +7106,7 @@
         </w:rPr>
         <w:t xml:space="preserve">3　</w:t>
       </w:r>
-      <w:hyperlink w:history="1" r:id="rIdjvrmhis3pnsnmkteqbl4r">
+      <w:hyperlink w:history="1" r:id="rIdh08evvf0rmna7gqdeuexp">
         <w:r>
           <w:rPr>
             <w:rStyle w:val="Hyperlink"/>
@@ -7132,7 +7132,7 @@
         </w:rPr>
         <w:t xml:space="preserve">5　</w:t>
       </w:r>
-      <w:hyperlink w:history="1" r:id="rIduof4fnkueymgffovq7sxq">
+      <w:hyperlink w:history="1" r:id="rId7lwlfk_sbfrnhu1b4srml">
         <w:r>
           <w:rPr>
             <w:rStyle w:val="Hyperlink"/>
@@ -7158,7 +7158,7 @@
         </w:rPr>
         <w:t xml:space="preserve">6　</w:t>
       </w:r>
-      <w:hyperlink w:history="1" r:id="rIdji2umnxf4peoqb9qpmkbu">
+      <w:hyperlink w:history="1" r:id="rIdrwnyrd-pluskxqmg8to5r">
         <w:r>
           <w:rPr>
             <w:rStyle w:val="Hyperlink"/>
@@ -7184,7 +7184,7 @@
         </w:rPr>
         <w:t xml:space="preserve">8, 22　</w:t>
       </w:r>
-      <w:hyperlink w:history="1" r:id="rIdqaqyyhl9zaih549eysfec">
+      <w:hyperlink w:history="1" r:id="rIdjgwivxzdewlgjoejtbogm">
         <w:r>
           <w:rPr>
             <w:rStyle w:val="Hyperlink"/>
@@ -7210,7 +7210,7 @@
         </w:rPr>
         <w:t xml:space="preserve">9　</w:t>
       </w:r>
-      <w:hyperlink w:history="1" r:id="rId0ynqbwxdltsi6h48ir1lz">
+      <w:hyperlink w:history="1" r:id="rIdngbw4dfze0etanu47vcro">
         <w:r>
           <w:rPr>
             <w:rStyle w:val="Hyperlink"/>
@@ -7236,7 +7236,7 @@
         </w:rPr>
         <w:t xml:space="preserve">10　</w:t>
       </w:r>
-      <w:hyperlink w:history="1" r:id="rIdmrojhlsmewvgr2bma_1-h">
+      <w:hyperlink w:history="1" r:id="rIdejsbz1ndpd6hpmlw0hhzx">
         <w:r>
           <w:rPr>
             <w:rStyle w:val="Hyperlink"/>
@@ -7262,7 +7262,7 @@
         </w:rPr>
         <w:t xml:space="preserve">13　</w:t>
       </w:r>
-      <w:hyperlink w:history="1" r:id="rIdbjep5kdw6ouccu0jknjrp">
+      <w:hyperlink w:history="1" r:id="rIdlspof__ckjewyqqli_edc">
         <w:r>
           <w:rPr>
             <w:rStyle w:val="Hyperlink"/>
@@ -7288,7 +7288,7 @@
         </w:rPr>
         <w:t xml:space="preserve">14　</w:t>
       </w:r>
-      <w:hyperlink w:history="1" r:id="rId_l7f7ngfeelxhnszgnopk">
+      <w:hyperlink w:history="1" r:id="rIdgdgkd2ogj9et5dvyub692">
         <w:r>
           <w:rPr>
             <w:rStyle w:val="Hyperlink"/>
@@ -7314,7 +7314,7 @@
         </w:rPr>
         <w:t xml:space="preserve">15, 18　</w:t>
       </w:r>
-      <w:hyperlink w:history="1" r:id="rIdt6qwxadxykjvmt3bt0nkg">
+      <w:hyperlink w:history="1" r:id="rIdbkwa0uggufxkpuqdeko9k">
         <w:r>
           <w:rPr>
             <w:rStyle w:val="Hyperlink"/>
@@ -7340,7 +7340,7 @@
         </w:rPr>
         <w:t xml:space="preserve">16, 19, 32, 38, 39　</w:t>
       </w:r>
-      <w:hyperlink w:history="1" r:id="rIdylw2z8_w9x39qujkzublx">
+      <w:hyperlink w:history="1" r:id="rIdkrqr3jowv3ngovp_egbp2">
         <w:r>
           <w:rPr>
             <w:rStyle w:val="Hyperlink"/>
@@ -7366,7 +7366,7 @@
         </w:rPr>
         <w:t xml:space="preserve">17　</w:t>
       </w:r>
-      <w:hyperlink w:history="1" r:id="rIdxrnba_x_7hi_o8iipm0hl">
+      <w:hyperlink w:history="1" r:id="rIdcfjmbo5dzbf6gdln5puda">
         <w:r>
           <w:rPr>
             <w:rStyle w:val="Hyperlink"/>
@@ -7392,7 +7392,7 @@
         </w:rPr>
         <w:t xml:space="preserve">20　</w:t>
       </w:r>
-      <w:hyperlink w:history="1" r:id="rId7xkpnsg9muzbe-hzk0udm">
+      <w:hyperlink w:history="1" r:id="rIdfjp1vsdvhxkkhouqnfksy">
         <w:r>
           <w:rPr>
             <w:rStyle w:val="Hyperlink"/>
@@ -7418,7 +7418,7 @@
         </w:rPr>
         <w:t xml:space="preserve">21　</w:t>
       </w:r>
-      <w:hyperlink w:history="1" r:id="rIdxrd8sjdvhz5gnwrq-er8m">
+      <w:hyperlink w:history="1" r:id="rIdq8znwsuebqd7rftyu2yek">
         <w:r>
           <w:rPr>
             <w:rStyle w:val="Hyperlink"/>
@@ -7444,7 +7444,7 @@
         </w:rPr>
         <w:t xml:space="preserve">23　</w:t>
       </w:r>
-      <w:hyperlink w:history="1" r:id="rId3t7eadvlwxkxswrzsre6g">
+      <w:hyperlink w:history="1" r:id="rId0e-4nkjbb88chj3emzhel">
         <w:r>
           <w:rPr>
             <w:rStyle w:val="Hyperlink"/>
@@ -7470,7 +7470,7 @@
         </w:rPr>
         <w:t xml:space="preserve">24　</w:t>
       </w:r>
-      <w:hyperlink w:history="1" r:id="rIdqrc7acyvxjdxma2ajopih">
+      <w:hyperlink w:history="1" r:id="rIdhqmjth9esfqjv_fbmwuef">
         <w:r>
           <w:rPr>
             <w:rStyle w:val="Hyperlink"/>
@@ -7496,7 +7496,7 @@
         </w:rPr>
         <w:t xml:space="preserve">25, 29　</w:t>
       </w:r>
-      <w:hyperlink w:history="1" r:id="rIdq6cwlhd_7pxjch9w0dq81">
+      <w:hyperlink w:history="1" r:id="rIda23bgqgmlivrzbcjcrz_8">
         <w:r>
           <w:rPr>
             <w:rStyle w:val="Hyperlink"/>
@@ -7522,7 +7522,7 @@
         </w:rPr>
         <w:t xml:space="preserve">26　</w:t>
       </w:r>
-      <w:hyperlink w:history="1" r:id="rIdiewh1ntlpoasjumfltunu">
+      <w:hyperlink w:history="1" r:id="rIdmpfgfpjzkqimt3k9lnfc_">
         <w:r>
           <w:rPr>
             <w:rStyle w:val="Hyperlink"/>
@@ -7548,7 +7548,7 @@
         </w:rPr>
         <w:t xml:space="preserve">27　</w:t>
       </w:r>
-      <w:hyperlink w:history="1" r:id="rIdwvprbnduotgzvkg6su-si">
+      <w:hyperlink w:history="1" r:id="rIdax5mcfsbjozbzvuzcenmi">
         <w:r>
           <w:rPr>
             <w:rStyle w:val="Hyperlink"/>
@@ -7574,7 +7574,7 @@
         </w:rPr>
         <w:t xml:space="preserve">28　</w:t>
       </w:r>
-      <w:hyperlink w:history="1" r:id="rIdhvfbzvmmrruczs9sxlx29">
+      <w:hyperlink w:history="1" r:id="rIdyixwe1zulimroztiaweqh">
         <w:r>
           <w:rPr>
             <w:rStyle w:val="Hyperlink"/>
@@ -7600,7 +7600,7 @@
         </w:rPr>
         <w:t xml:space="preserve">30　</w:t>
       </w:r>
-      <w:hyperlink w:history="1" r:id="rIdr1881fxcdhxgffxfudbnh">
+      <w:hyperlink w:history="1" r:id="rIdt5qr3wlirvoz1rss6asa_">
         <w:r>
           <w:rPr>
             <w:rStyle w:val="Hyperlink"/>
@@ -7626,7 +7626,7 @@
         </w:rPr>
         <w:t xml:space="preserve">31　</w:t>
       </w:r>
-      <w:hyperlink w:history="1" r:id="rIdjcglqmqwr2_v4ycw1ac9k">
+      <w:hyperlink w:history="1" r:id="rIdwkw7razdmzauxocaskckj">
         <w:r>
           <w:rPr>
             <w:rStyle w:val="Hyperlink"/>
@@ -7652,7 +7652,7 @@
         </w:rPr>
         <w:t xml:space="preserve">33, 37　</w:t>
       </w:r>
-      <w:hyperlink w:history="1" r:id="rIdtrno14d0inwufdtqwme8z">
+      <w:hyperlink w:history="1" r:id="rId6ijxhb-yzrtpley3phmb-">
         <w:r>
           <w:rPr>
             <w:rStyle w:val="Hyperlink"/>
@@ -7678,7 +7678,7 @@
         </w:rPr>
         <w:t xml:space="preserve">34　</w:t>
       </w:r>
-      <w:hyperlink w:history="1" r:id="rIdl1yealk1cxudhgcus8er_">
+      <w:hyperlink w:history="1" r:id="rIdz98rfx3tz9o6vu6dt_79w">
         <w:r>
           <w:rPr>
             <w:rStyle w:val="Hyperlink"/>
@@ -7704,7 +7704,7 @@
         </w:rPr>
         <w:t xml:space="preserve">35　</w:t>
       </w:r>
-      <w:hyperlink w:history="1" r:id="rIdu2_b4brogcz37ssmx7-hn">
+      <w:hyperlink w:history="1" r:id="rIdpwhyguoyxfiqfirzzoind">
         <w:r>
           <w:rPr>
             <w:rStyle w:val="Hyperlink"/>
@@ -7730,7 +7730,7 @@
         </w:rPr>
         <w:t xml:space="preserve">36　</w:t>
       </w:r>
-      <w:hyperlink w:history="1" r:id="rIdp6i6cz4u7pcn5jctqckqi">
+      <w:hyperlink w:history="1" r:id="rIdjepied7tgvfz6d2skeail">
         <w:r>
           <w:rPr>
             <w:rStyle w:val="Hyperlink"/>
@@ -7756,7 +7756,7 @@
         </w:rPr>
         <w:t xml:space="preserve">41　</w:t>
       </w:r>
-      <w:hyperlink w:history="1" r:id="rIdln4to4hjucbujbmpcjhra">
+      <w:hyperlink w:history="1" r:id="rIdple3jjfktx4m5xz9a5kti">
         <w:r>
           <w:rPr>
             <w:rStyle w:val="Hyperlink"/>
@@ -7782,7 +7782,7 @@
         </w:rPr>
         <w:t xml:space="preserve">42　</w:t>
       </w:r>
-      <w:hyperlink w:history="1" r:id="rId04gvgvkwj1ill680crlwz">
+      <w:hyperlink w:history="1" r:id="rIdgdpt4n28x_rslp6f5sc-m">
         <w:r>
           <w:rPr>
             <w:rStyle w:val="Hyperlink"/>
@@ -8543,7 +8543,7 @@
         </w:rPr>
         <w:t xml:space="preserve">1, 4, 6　</w:t>
       </w:r>
-      <w:hyperlink w:history="1" r:id="rIdgrga7teepoetwza-b2-22">
+      <w:hyperlink w:history="1" r:id="rId3xdk2awyjx4fryonujmt0">
         <w:r>
           <w:rPr>
             <w:rStyle w:val="Hyperlink"/>
@@ -8569,7 +8569,7 @@
         </w:rPr>
         <w:t xml:space="preserve">2　</w:t>
       </w:r>
-      <w:hyperlink w:history="1" r:id="rIdjb6lmqnu1zddqlcufghm0">
+      <w:hyperlink w:history="1" r:id="rIdzs5qai6flqomcwpun5p_m">
         <w:r>
           <w:rPr>
             <w:rStyle w:val="Hyperlink"/>
@@ -8595,7 +8595,7 @@
         </w:rPr>
         <w:t xml:space="preserve">3　</w:t>
       </w:r>
-      <w:hyperlink w:history="1" r:id="rIdekkii8rjxkrdk76xh2qpd">
+      <w:hyperlink w:history="1" r:id="rId5ckymvt3tvlxe_m0kgjlv">
         <w:r>
           <w:rPr>
             <w:rStyle w:val="Hyperlink"/>
@@ -8621,7 +8621,7 @@
         </w:rPr>
         <w:t xml:space="preserve">5　</w:t>
       </w:r>
-      <w:hyperlink w:history="1" r:id="rIdltcn3ddit9w13n549bh0g">
+      <w:hyperlink w:history="1" r:id="rId9uxno2jyyj7qbhrmhkd3_">
         <w:r>
           <w:rPr>
             <w:rStyle w:val="Hyperlink"/>
@@ -8647,7 +8647,7 @@
         </w:rPr>
         <w:t xml:space="preserve">7　</w:t>
       </w:r>
-      <w:hyperlink w:history="1" r:id="rIdbbkofae8gf0usgrlro0nx">
+      <w:hyperlink w:history="1" r:id="rIdlypnhfbszjjml3bk-6vry">
         <w:r>
           <w:rPr>
             <w:rStyle w:val="Hyperlink"/>
@@ -8673,7 +8673,7 @@
         </w:rPr>
         <w:t xml:space="preserve">8　</w:t>
       </w:r>
-      <w:hyperlink w:history="1" r:id="rIdxsaq39laekbq7mjywa-xx">
+      <w:hyperlink w:history="1" r:id="rIdywjlb75dnccetsgfbdpc7">
         <w:r>
           <w:rPr>
             <w:rStyle w:val="Hyperlink"/>
@@ -8699,7 +8699,7 @@
         </w:rPr>
         <w:t xml:space="preserve">9　</w:t>
       </w:r>
-      <w:hyperlink w:history="1" r:id="rIdgir1nl7brs4o3kuxgm1pr">
+      <w:hyperlink w:history="1" r:id="rIdabocb2kz50r6jqs-kikcp">
         <w:r>
           <w:rPr>
             <w:rStyle w:val="Hyperlink"/>
@@ -8725,7 +8725,7 @@
         </w:rPr>
         <w:t xml:space="preserve">10　</w:t>
       </w:r>
-      <w:hyperlink w:history="1" r:id="rIdip38hdz-ssk49lbqotonw">
+      <w:hyperlink w:history="1" r:id="rIdm4ucy9rpq_pqfyewhlmny">
         <w:r>
           <w:rPr>
             <w:rStyle w:val="Hyperlink"/>
@@ -8751,7 +8751,7 @@
         </w:rPr>
         <w:t xml:space="preserve">11　</w:t>
       </w:r>
-      <w:hyperlink w:history="1" r:id="rIdfevi-9siqceoyg0kk770f">
+      <w:hyperlink w:history="1" r:id="rIdjzumsfmfzikenpzgtsnry">
         <w:r>
           <w:rPr>
             <w:rStyle w:val="Hyperlink"/>
@@ -8777,7 +8777,7 @@
         </w:rPr>
         <w:t xml:space="preserve">12　</w:t>
       </w:r>
-      <w:hyperlink w:history="1" r:id="rIdpyxpoekgfsw6dh0dy50t5">
+      <w:hyperlink w:history="1" r:id="rIduslelk_iargfiyp0xa4oj">
         <w:r>
           <w:rPr>
             <w:rStyle w:val="Hyperlink"/>
@@ -8803,7 +8803,7 @@
         </w:rPr>
         <w:t xml:space="preserve">13　</w:t>
       </w:r>
-      <w:hyperlink w:history="1" r:id="rIdlgkmbzgftfdvc4n3u311n">
+      <w:hyperlink w:history="1" r:id="rIdzthdpnouvs0urpjes6u4e">
         <w:r>
           <w:rPr>
             <w:rStyle w:val="Hyperlink"/>
@@ -8829,7 +8829,7 @@
         </w:rPr>
         <w:t xml:space="preserve">14　</w:t>
       </w:r>
-      <w:hyperlink w:history="1" r:id="rIdewi7sva7cwtmb49a5g-v6">
+      <w:hyperlink w:history="1" r:id="rIdj5mquvhu7styhqiecvfrf">
         <w:r>
           <w:rPr>
             <w:rStyle w:val="Hyperlink"/>
@@ -8855,7 +8855,7 @@
         </w:rPr>
         <w:t xml:space="preserve">15　</w:t>
       </w:r>
-      <w:hyperlink w:history="1" r:id="rIdvymhth--u_qdvx2einzq0">
+      <w:hyperlink w:history="1" r:id="rIdqcgi7noaqr-xpdsf3gf5z">
         <w:r>
           <w:rPr>
             <w:rStyle w:val="Hyperlink"/>
@@ -10561,7 +10561,7 @@
         </w:rPr>
         <w:t xml:space="preserve">1　</w:t>
       </w:r>
-      <w:hyperlink w:history="1" r:id="rIdwd41uaayrhaz8dvx0koow">
+      <w:hyperlink w:history="1" r:id="rIdaxgsen3rny6v4cgnbhuku">
         <w:r>
           <w:rPr>
             <w:rStyle w:val="Hyperlink"/>
@@ -10587,7 +10587,7 @@
         </w:rPr>
         <w:t xml:space="preserve">2　</w:t>
       </w:r>
-      <w:hyperlink w:history="1" r:id="rId78z8ogpn4hcbgruahpugj">
+      <w:hyperlink w:history="1" r:id="rIdf2arloc2mn82uucd-mpcu">
         <w:r>
           <w:rPr>
             <w:rStyle w:val="Hyperlink"/>
@@ -10613,7 +10613,7 @@
         </w:rPr>
         <w:t xml:space="preserve">3　</w:t>
       </w:r>
-      <w:hyperlink w:history="1" r:id="rIdpsajwhh7acxbgyzyowqp5">
+      <w:hyperlink w:history="1" r:id="rIdyu8rhxagqjhxnuashrbpl">
         <w:r>
           <w:rPr>
             <w:rStyle w:val="Hyperlink"/>
@@ -10639,7 +10639,7 @@
         </w:rPr>
         <w:t xml:space="preserve">4　</w:t>
       </w:r>
-      <w:hyperlink w:history="1" r:id="rIdnmndsffba1oadymyk3hc1">
+      <w:hyperlink w:history="1" r:id="rIdirp31ccbypqn1hx79gpyy">
         <w:r>
           <w:rPr>
             <w:rStyle w:val="Hyperlink"/>
@@ -10665,7 +10665,7 @@
         </w:rPr>
         <w:t xml:space="preserve">5　</w:t>
       </w:r>
-      <w:hyperlink w:history="1" r:id="rIditm1hshm6tyqppncms_11">
+      <w:hyperlink w:history="1" r:id="rIdokf80vfjth50k-apbbyka">
         <w:r>
           <w:rPr>
             <w:rStyle w:val="Hyperlink"/>
@@ -10691,7 +10691,7 @@
         </w:rPr>
         <w:t xml:space="preserve">6, 7, 8　</w:t>
       </w:r>
-      <w:hyperlink w:history="1" r:id="rIdcklhaygmzvotocwn7dwc1">
+      <w:hyperlink w:history="1" r:id="rIddp8xcddc2eewixzlarx8z">
         <w:r>
           <w:rPr>
             <w:rStyle w:val="Hyperlink"/>
@@ -10717,7 +10717,7 @@
         </w:rPr>
         <w:t xml:space="preserve">9　</w:t>
       </w:r>
-      <w:hyperlink w:history="1" r:id="rIdgs2bfukq9lrpfjfoxerkr">
+      <w:hyperlink w:history="1" r:id="rIdrmvg-a2magevy-idvaej2">
         <w:r>
           <w:rPr>
             <w:rStyle w:val="Hyperlink"/>
@@ -11594,7 +11594,7 @@
         </w:rPr>
         <w:t xml:space="preserve">1　</w:t>
       </w:r>
-      <w:hyperlink w:history="1" r:id="rIdzdpcbk8rq4qvpdngtptkw">
+      <w:hyperlink w:history="1" r:id="rIdzg0cta2e3wvdvhlfoog8h">
         <w:r>
           <w:rPr>
             <w:rStyle w:val="Hyperlink"/>
@@ -11620,7 +11620,7 @@
         </w:rPr>
         <w:t xml:space="preserve">2　</w:t>
       </w:r>
-      <w:hyperlink w:history="1" r:id="rIdrate5sjlo4dxjsfekcuvt">
+      <w:hyperlink w:history="1" r:id="rIdl-vaxu5hvnsbuwtpyjuhw">
         <w:r>
           <w:rPr>
             <w:rStyle w:val="Hyperlink"/>
@@ -11646,7 +11646,7 @@
         </w:rPr>
         <w:t xml:space="preserve">3　</w:t>
       </w:r>
-      <w:hyperlink w:history="1" r:id="rIdgn4bbmpmhtcd_hh3mpqgy">
+      <w:hyperlink w:history="1" r:id="rIdlmaf9jpzjsq9stp0cs7a3">
         <w:r>
           <w:rPr>
             <w:rStyle w:val="Hyperlink"/>
@@ -11672,7 +11672,7 @@
         </w:rPr>
         <w:t xml:space="preserve">4　</w:t>
       </w:r>
-      <w:hyperlink w:history="1" r:id="rIdlx-omnkibyk5dwwspugbb">
+      <w:hyperlink w:history="1" r:id="rIdmhwi5dau4q6ie1ti0rlyp">
         <w:r>
           <w:rPr>
             <w:rStyle w:val="Hyperlink"/>
@@ -11698,7 +11698,7 @@
         </w:rPr>
         <w:t xml:space="preserve">5　</w:t>
       </w:r>
-      <w:hyperlink w:history="1" r:id="rId6wrxvneowvsiv4y4czqg2">
+      <w:hyperlink w:history="1" r:id="rIdqjxnsmpbhchl8vlqc515j">
         <w:r>
           <w:rPr>
             <w:rStyle w:val="Hyperlink"/>
@@ -11724,7 +11724,7 @@
         </w:rPr>
         <w:t xml:space="preserve">6　</w:t>
       </w:r>
-      <w:hyperlink w:history="1" r:id="rIdp7mwih_nz2ibg0lk9gjs2">
+      <w:hyperlink w:history="1" r:id="rIdgqbvuu3sxarlpimrbucke">
         <w:r>
           <w:rPr>
             <w:rStyle w:val="Hyperlink"/>
@@ -11750,7 +11750,7 @@
         </w:rPr>
         <w:t xml:space="preserve">7　</w:t>
       </w:r>
-      <w:hyperlink w:history="1" r:id="rId5-cqcjrrsljxqhfdjkogl">
+      <w:hyperlink w:history="1" r:id="rIdqqtc-trvm1hogi6abzqxt">
         <w:r>
           <w:rPr>
             <w:rStyle w:val="Hyperlink"/>
@@ -11776,7 +11776,7 @@
         </w:rPr>
         <w:t xml:space="preserve">8, 13　</w:t>
       </w:r>
-      <w:hyperlink w:history="1" r:id="rIdmhertbywmzkkoudcby3z2">
+      <w:hyperlink w:history="1" r:id="rId5t3fs3ot6vgunj0shae-l">
         <w:r>
           <w:rPr>
             <w:rStyle w:val="Hyperlink"/>
@@ -11802,7 +11802,7 @@
         </w:rPr>
         <w:t xml:space="preserve">9　</w:t>
       </w:r>
-      <w:hyperlink w:history="1" r:id="rIdw4ewfttex23uhye21zapa">
+      <w:hyperlink w:history="1" r:id="rIdhzzw8du_plynpvf1lzrfo">
         <w:r>
           <w:rPr>
             <w:rStyle w:val="Hyperlink"/>
@@ -11828,7 +11828,7 @@
         </w:rPr>
         <w:t xml:space="preserve">10　</w:t>
       </w:r>
-      <w:hyperlink w:history="1" r:id="rIdatnfnt1sulwj7q2d03lmg">
+      <w:hyperlink w:history="1" r:id="rId9eslcovhtz8sary6rumfr">
         <w:r>
           <w:rPr>
             <w:rStyle w:val="Hyperlink"/>
@@ -11854,7 +11854,7 @@
         </w:rPr>
         <w:t xml:space="preserve">11　</w:t>
       </w:r>
-      <w:hyperlink w:history="1" r:id="rIdzs7vbs63p6p1lvcgrpduz">
+      <w:hyperlink w:history="1" r:id="rIdugcmub2wzung2shccz0ca">
         <w:r>
           <w:rPr>
             <w:rStyle w:val="Hyperlink"/>
@@ -11880,7 +11880,7 @@
         </w:rPr>
         <w:t xml:space="preserve">12　</w:t>
       </w:r>
-      <w:hyperlink w:history="1" r:id="rId8fe05qtq-5opx1ekrjfwf">
+      <w:hyperlink w:history="1" r:id="rId_hstot9fhbz1_30r9pynk">
         <w:r>
           <w:rPr>
             <w:rStyle w:val="Hyperlink"/>
@@ -11906,7 +11906,7 @@
         </w:rPr>
         <w:t xml:space="preserve">14　</w:t>
       </w:r>
-      <w:hyperlink w:history="1" r:id="rId77t-7rh3aaosfp-8tszzj">
+      <w:hyperlink w:history="1" r:id="rIdmcbkfrnamzav7u12yjkvv">
         <w:r>
           <w:rPr>
             <w:rStyle w:val="Hyperlink"/>
@@ -11932,7 +11932,7 @@
         </w:rPr>
         <w:t xml:space="preserve">15　</w:t>
       </w:r>
-      <w:hyperlink w:history="1" r:id="rIdjc-5kgc9tugvt8ehahz-b">
+      <w:hyperlink w:history="1" r:id="rIdozb0labrcnxgeuswzfzwl">
         <w:r>
           <w:rPr>
             <w:rStyle w:val="Hyperlink"/>
@@ -11958,7 +11958,7 @@
         </w:rPr>
         <w:t xml:space="preserve">16　</w:t>
       </w:r>
-      <w:hyperlink w:history="1" r:id="rId6gph9z2qyizadsa_mxtp9">
+      <w:hyperlink w:history="1" r:id="rId_xylcw-vxywbritkat6ov">
         <w:r>
           <w:rPr>
             <w:rStyle w:val="Hyperlink"/>
@@ -13223,7 +13223,7 @@
         </w:rPr>
         <w:t xml:space="preserve">1　</w:t>
       </w:r>
-      <w:hyperlink w:history="1" r:id="rIdh9bv4mwhaxsifavrg4-ie">
+      <w:hyperlink w:history="1" r:id="rIdcfpfwrdfbt3eutiew9pfb">
         <w:r>
           <w:rPr>
             <w:rStyle w:val="Hyperlink"/>
@@ -13249,7 +13249,7 @@
         </w:rPr>
         <w:t xml:space="preserve">2, 14　</w:t>
       </w:r>
-      <w:hyperlink w:history="1" r:id="rIds-b0rsaqdvwzohx1_lxqq">
+      <w:hyperlink w:history="1" r:id="rIddcqgu1zziwyqevp2ujosh">
         <w:r>
           <w:rPr>
             <w:rStyle w:val="Hyperlink"/>
@@ -13275,7 +13275,7 @@
         </w:rPr>
         <w:t xml:space="preserve">3, 17　</w:t>
       </w:r>
-      <w:hyperlink w:history="1" r:id="rIdoaepgak4qk78fdrgkxqct">
+      <w:hyperlink w:history="1" r:id="rIdb48s9uvu8xfxxra6tiwru">
         <w:r>
           <w:rPr>
             <w:rStyle w:val="Hyperlink"/>
@@ -13301,7 +13301,7 @@
         </w:rPr>
         <w:t xml:space="preserve">4, 9　</w:t>
       </w:r>
-      <w:hyperlink w:history="1" r:id="rIdin4e-wbhqxvfdfxoeicji">
+      <w:hyperlink w:history="1" r:id="rIdbgwlskfzgniwmr-x5liv6">
         <w:r>
           <w:rPr>
             <w:rStyle w:val="Hyperlink"/>
@@ -13327,7 +13327,7 @@
         </w:rPr>
         <w:t xml:space="preserve">5, 11　</w:t>
       </w:r>
-      <w:hyperlink w:history="1" r:id="rIdq1rnw0h_yfnk9bburkmss">
+      <w:hyperlink w:history="1" r:id="rIdfkzel7mkq8knkhytluyxa">
         <w:r>
           <w:rPr>
             <w:rStyle w:val="Hyperlink"/>
@@ -13353,7 +13353,7 @@
         </w:rPr>
         <w:t xml:space="preserve">6　</w:t>
       </w:r>
-      <w:hyperlink w:history="1" r:id="rIdrvjf7mvcadssosaaz43ss">
+      <w:hyperlink w:history="1" r:id="rId9xdltqny6kphpb20j2lex">
         <w:r>
           <w:rPr>
             <w:rStyle w:val="Hyperlink"/>
@@ -13379,7 +13379,7 @@
         </w:rPr>
         <w:t xml:space="preserve">7, 10, 12　</w:t>
       </w:r>
-      <w:hyperlink w:history="1" r:id="rId52cfbiwxfga-5fp4kx_d1">
+      <w:hyperlink w:history="1" r:id="rIdi48jxfgtaexz62a2dlfjp">
         <w:r>
           <w:rPr>
             <w:rStyle w:val="Hyperlink"/>
@@ -13405,7 +13405,7 @@
         </w:rPr>
         <w:t xml:space="preserve">8　</w:t>
       </w:r>
-      <w:hyperlink w:history="1" r:id="rIdraezy_h2vwlz5l7fwh39h">
+      <w:hyperlink w:history="1" r:id="rIdkko4trnk1s-4dk_trbgpv">
         <w:r>
           <w:rPr>
             <w:rStyle w:val="Hyperlink"/>
@@ -13431,7 +13431,7 @@
         </w:rPr>
         <w:t xml:space="preserve">13　</w:t>
       </w:r>
-      <w:hyperlink w:history="1" r:id="rIdjxeu-cno9iu8lwxepmiz9">
+      <w:hyperlink w:history="1" r:id="rIdgsquddxx605lovw5zngsm">
         <w:r>
           <w:rPr>
             <w:rStyle w:val="Hyperlink"/>
@@ -13457,7 +13457,7 @@
         </w:rPr>
         <w:t xml:space="preserve">15　</w:t>
       </w:r>
-      <w:hyperlink w:history="1" r:id="rIdywjlpux28kajbffezt21h">
+      <w:hyperlink w:history="1" r:id="rIdt8xaff12p7abndbjzdsib">
         <w:r>
           <w:rPr>
             <w:rStyle w:val="Hyperlink"/>
@@ -13483,7 +13483,7 @@
         </w:rPr>
         <w:t xml:space="preserve">16　</w:t>
       </w:r>
-      <w:hyperlink w:history="1" r:id="rIdzp1-mie5ackalvtwa2kjr">
+      <w:hyperlink w:history="1" r:id="rIdsdfmffrhuvm2d4svfzwot">
         <w:r>
           <w:rPr>
             <w:rStyle w:val="Hyperlink"/>
@@ -13509,7 +13509,7 @@
         </w:rPr>
         <w:t xml:space="preserve">18　</w:t>
       </w:r>
-      <w:hyperlink w:history="1" r:id="rIdk8ptxmtupfhi8cz5g2hp8">
+      <w:hyperlink w:history="1" r:id="rIdpoeohjhd325x3g4fic1l1">
         <w:r>
           <w:rPr>
             <w:rStyle w:val="Hyperlink"/>
@@ -13535,7 +13535,7 @@
         </w:rPr>
         <w:t xml:space="preserve">19, 21　</w:t>
       </w:r>
-      <w:hyperlink w:history="1" r:id="rId4q-cmmbinxh8e1s_yiscc">
+      <w:hyperlink w:history="1" r:id="rIdor2yrckwxyts7akday1va">
         <w:r>
           <w:rPr>
             <w:rStyle w:val="Hyperlink"/>
@@ -13561,7 +13561,7 @@
         </w:rPr>
         <w:t xml:space="preserve">20　</w:t>
       </w:r>
-      <w:hyperlink w:history="1" r:id="rIdliszhvg_xzsrorxjmcevg">
+      <w:hyperlink w:history="1" r:id="rIdoy3jk1vufomt3kppckwor">
         <w:r>
           <w:rPr>
             <w:rStyle w:val="Hyperlink"/>
@@ -14268,7 +14268,7 @@
         </w:rPr>
         <w:t xml:space="preserve">1　</w:t>
       </w:r>
-      <w:hyperlink w:history="1" r:id="rIdw8jfxkgeqtrgfutwvmfec">
+      <w:hyperlink w:history="1" r:id="rIdfj-wmtzektny2rry__ilc">
         <w:r>
           <w:rPr>
             <w:rStyle w:val="Hyperlink"/>
@@ -14294,7 +14294,7 @@
         </w:rPr>
         <w:t xml:space="preserve">2　</w:t>
       </w:r>
-      <w:hyperlink w:history="1" r:id="rId1dezgq4eaz37qwp3-w5wr">
+      <w:hyperlink w:history="1" r:id="rIdlk0is7bnamajsfx6qkb7c">
         <w:r>
           <w:rPr>
             <w:rStyle w:val="Hyperlink"/>
@@ -14320,7 +14320,7 @@
         </w:rPr>
         <w:t xml:space="preserve">3　</w:t>
       </w:r>
-      <w:hyperlink w:history="1" r:id="rIdbtrtvihtwfcze-khioahi">
+      <w:hyperlink w:history="1" r:id="rIdyyyudogewurdaukn8lkpy">
         <w:r>
           <w:rPr>
             <w:rStyle w:val="Hyperlink"/>
@@ -14346,7 +14346,7 @@
         </w:rPr>
         <w:t xml:space="preserve">4　</w:t>
       </w:r>
-      <w:hyperlink w:history="1" r:id="rIdkkhfhjuohjqaho10ykraa">
+      <w:hyperlink w:history="1" r:id="rIdz3sbi8y2pimxrcmvzfbej">
         <w:r>
           <w:rPr>
             <w:rStyle w:val="Hyperlink"/>
@@ -14372,7 +14372,7 @@
         </w:rPr>
         <w:t xml:space="preserve">5　</w:t>
       </w:r>
-      <w:hyperlink w:history="1" r:id="rIdgc9urn0yedrym0llhhuhq">
+      <w:hyperlink w:history="1" r:id="rIdjab8x33rtnto6jytfw05h">
         <w:r>
           <w:rPr>
             <w:rStyle w:val="Hyperlink"/>
@@ -14398,7 +14398,7 @@
         </w:rPr>
         <w:t xml:space="preserve">6　</w:t>
       </w:r>
-      <w:hyperlink w:history="1" r:id="rId6vqbtwurpg2xx4tniabaz">
+      <w:hyperlink w:history="1" r:id="rIdfyxs7d6vrpczpniuusq4v">
         <w:r>
           <w:rPr>
             <w:rStyle w:val="Hyperlink"/>
@@ -14424,7 +14424,7 @@
         </w:rPr>
         <w:t xml:space="preserve">7　</w:t>
       </w:r>
-      <w:hyperlink w:history="1" r:id="rIdqwcmzmiur3bivoum_zi6p">
+      <w:hyperlink w:history="1" r:id="rIddxrhqqjyktykpzyqdwpdp">
         <w:r>
           <w:rPr>
             <w:rStyle w:val="Hyperlink"/>
@@ -14450,7 +14450,7 @@
         </w:rPr>
         <w:t xml:space="preserve">8　</w:t>
       </w:r>
-      <w:hyperlink w:history="1" r:id="rIdbpy-at16wnhpxch51fw3u">
+      <w:hyperlink w:history="1" r:id="rIdvbmxhc-ndlnln00uxh85f">
         <w:r>
           <w:rPr>
             <w:rStyle w:val="Hyperlink"/>
@@ -15019,7 +15019,7 @@
         </w:rPr>
         <w:t xml:space="preserve">1, 2　</w:t>
       </w:r>
-      <w:hyperlink w:history="1" r:id="rIdhohnoqpku5a_5c9idab8q">
+      <w:hyperlink w:history="1" r:id="rIdsp4ia3lhk-fno0gxhgtj3">
         <w:r>
           <w:rPr>
             <w:rStyle w:val="Hyperlink"/>
@@ -15045,7 +15045,7 @@
         </w:rPr>
         <w:t xml:space="preserve">3　</w:t>
       </w:r>
-      <w:hyperlink w:history="1" r:id="rId_tlvhajjovv9v6megmm2g">
+      <w:hyperlink w:history="1" r:id="rIdzoi3wohvxantmnwmbhoek">
         <w:r>
           <w:rPr>
             <w:rStyle w:val="Hyperlink"/>
@@ -15071,7 +15071,7 @@
         </w:rPr>
         <w:t xml:space="preserve">4　</w:t>
       </w:r>
-      <w:hyperlink w:history="1" r:id="rId--2xsercrtol98lqo_pas">
+      <w:hyperlink w:history="1" r:id="rIdeabjiy3rgnlfqpjhpx5_o">
         <w:r>
           <w:rPr>
             <w:rStyle w:val="Hyperlink"/>
@@ -15743,7 +15743,7 @@
         </w:rPr>
         <w:t xml:space="preserve">1　</w:t>
       </w:r>
-      <w:hyperlink w:history="1" r:id="rIdffcnh-lpwyynmyslgzb-o">
+      <w:hyperlink w:history="1" r:id="rIdv3wa_p11w4wkrvao-vgvh">
         <w:r>
           <w:rPr>
             <w:rStyle w:val="Hyperlink"/>
@@ -15769,7 +15769,7 @@
         </w:rPr>
         <w:t xml:space="preserve">2, 16　</w:t>
       </w:r>
-      <w:hyperlink w:history="1" r:id="rIdulsekchegbaaia2re9kez">
+      <w:hyperlink w:history="1" r:id="rIdevgf2_am0ucluegyajip7">
         <w:r>
           <w:rPr>
             <w:rStyle w:val="Hyperlink"/>
@@ -15795,7 +15795,7 @@
         </w:rPr>
         <w:t xml:space="preserve">3　</w:t>
       </w:r>
-      <w:hyperlink w:history="1" r:id="rIdmrhz2iydrgu3-mzsw6naf">
+      <w:hyperlink w:history="1" r:id="rIdarmazmcr9xcmuol9ls7oh">
         <w:r>
           <w:rPr>
             <w:rStyle w:val="Hyperlink"/>
@@ -15821,7 +15821,7 @@
         </w:rPr>
         <w:t xml:space="preserve">4, 5　</w:t>
       </w:r>
-      <w:hyperlink w:history="1" r:id="rIdpt0aqvffehr2djeawbtws">
+      <w:hyperlink w:history="1" r:id="rIded-3zmhjrsn85knbeodus">
         <w:r>
           <w:rPr>
             <w:rStyle w:val="Hyperlink"/>
@@ -15847,7 +15847,7 @@
         </w:rPr>
         <w:t xml:space="preserve">6　</w:t>
       </w:r>
-      <w:hyperlink w:history="1" r:id="rIdbq6-byzxnbrpymo4zvgng">
+      <w:hyperlink w:history="1" r:id="rIdy_gm1u6ehlif8fviet92i">
         <w:r>
           <w:rPr>
             <w:rStyle w:val="Hyperlink"/>
@@ -15873,7 +15873,7 @@
         </w:rPr>
         <w:t xml:space="preserve">7　</w:t>
       </w:r>
-      <w:hyperlink w:history="1" r:id="rIdlrxtuecdjhncxeblpvkf3">
+      <w:hyperlink w:history="1" r:id="rIdwjucru26j7hp_tik0kj2y">
         <w:r>
           <w:rPr>
             <w:rStyle w:val="Hyperlink"/>
@@ -15899,7 +15899,7 @@
         </w:rPr>
         <w:t xml:space="preserve">8　</w:t>
       </w:r>
-      <w:hyperlink w:history="1" r:id="rIdco-3hwiqipftc-qp8jjr0">
+      <w:hyperlink w:history="1" r:id="rIdbooeykddlpmaetguk1mxu">
         <w:r>
           <w:rPr>
             <w:rStyle w:val="Hyperlink"/>
@@ -15925,7 +15925,7 @@
         </w:rPr>
         <w:t xml:space="preserve">9　</w:t>
       </w:r>
-      <w:hyperlink w:history="1" r:id="rIdabsq4gomrv5mxa9as6sur">
+      <w:hyperlink w:history="1" r:id="rId06sngc8xpjb3udqbqwvqr">
         <w:r>
           <w:rPr>
             <w:rStyle w:val="Hyperlink"/>
@@ -15951,7 +15951,7 @@
         </w:rPr>
         <w:t xml:space="preserve">10　</w:t>
       </w:r>
-      <w:hyperlink w:history="1" r:id="rIdn2jcuawf7jjimmq83kn4p">
+      <w:hyperlink w:history="1" r:id="rIdvjf4uyr_lvihe2_lyya-5">
         <w:r>
           <w:rPr>
             <w:rStyle w:val="Hyperlink"/>
@@ -15977,7 +15977,7 @@
         </w:rPr>
         <w:t xml:space="preserve">11　</w:t>
       </w:r>
-      <w:hyperlink w:history="1" r:id="rIdtvyirkqgmqalphs_cf2dn">
+      <w:hyperlink w:history="1" r:id="rIdauckdmvp1inn4dy-fcs0y">
         <w:r>
           <w:rPr>
             <w:rStyle w:val="Hyperlink"/>
@@ -16003,7 +16003,7 @@
         </w:rPr>
         <w:t xml:space="preserve">12　</w:t>
       </w:r>
-      <w:hyperlink w:history="1" r:id="rIdy-q53n7zuiz_y_r8oiypu">
+      <w:hyperlink w:history="1" r:id="rIdvdzeigegmpvamapchzkjg">
         <w:r>
           <w:rPr>
             <w:rStyle w:val="Hyperlink"/>
@@ -16029,7 +16029,7 @@
         </w:rPr>
         <w:t xml:space="preserve">13　</w:t>
       </w:r>
-      <w:hyperlink w:history="1" r:id="rIdjraupfjbxxcmzh20lnh68">
+      <w:hyperlink w:history="1" r:id="rIdicy_bdwh1yp6apf1rvvt2">
         <w:r>
           <w:rPr>
             <w:rStyle w:val="Hyperlink"/>
@@ -16055,7 +16055,7 @@
         </w:rPr>
         <w:t xml:space="preserve">14　</w:t>
       </w:r>
-      <w:hyperlink w:history="1" r:id="rId_ri5f9thtkagwlkwbaasq">
+      <w:hyperlink w:history="1" r:id="rIdh-0tfvyyh17tmoggphvte">
         <w:r>
           <w:rPr>
             <w:rStyle w:val="Hyperlink"/>
@@ -16081,7 +16081,7 @@
         </w:rPr>
         <w:t xml:space="preserve">15, 18　</w:t>
       </w:r>
-      <w:hyperlink w:history="1" r:id="rIdu4-7m2xyeo6wnz6fi4uzy">
+      <w:hyperlink w:history="1" r:id="rIdcntjz6i4o4kyov5tr0dbh">
         <w:r>
           <w:rPr>
             <w:rStyle w:val="Hyperlink"/>
@@ -16107,7 +16107,7 @@
         </w:rPr>
         <w:t xml:space="preserve">17　</w:t>
       </w:r>
-      <w:hyperlink w:history="1" r:id="rIdnrig8t4vo4baux2hjtrys">
+      <w:hyperlink w:history="1" r:id="rIdnrejkyx6mleikeokk0ibz">
         <w:r>
           <w:rPr>
             <w:rStyle w:val="Hyperlink"/>
@@ -16133,7 +16133,7 @@
         </w:rPr>
         <w:t xml:space="preserve">19　</w:t>
       </w:r>
-      <w:hyperlink w:history="1" r:id="rIdjg69ajqsz0zds46_dpyol">
+      <w:hyperlink w:history="1" r:id="rIdnrruc4mb5bnoxgyh19ibu">
         <w:r>
           <w:rPr>
             <w:rStyle w:val="Hyperlink"/>
@@ -16159,7 +16159,7 @@
         </w:rPr>
         <w:t xml:space="preserve">20　</w:t>
       </w:r>
-      <w:hyperlink w:history="1" r:id="rIds3gatdfqos6k5umz9tv8j">
+      <w:hyperlink w:history="1" r:id="rIdcogdv8ojvwctjex85jnmi">
         <w:r>
           <w:rPr>
             <w:rStyle w:val="Hyperlink"/>
@@ -16185,7 +16185,7 @@
         </w:rPr>
         <w:t xml:space="preserve">21　</w:t>
       </w:r>
-      <w:hyperlink w:history="1" r:id="rIdxlziqzzkirtf7kxruwh-b">
+      <w:hyperlink w:history="1" r:id="rIdrrs53tl5rhjderc9yhv9x">
         <w:r>
           <w:rPr>
             <w:rStyle w:val="Hyperlink"/>
@@ -16575,7 +16575,7 @@
         </w:rPr>
         <w:t xml:space="preserve">1, 3　</w:t>
       </w:r>
-      <w:hyperlink w:history="1" r:id="rId04l6_dj_cgz9cd-eqvnjg">
+      <w:hyperlink w:history="1" r:id="rIdp1ii-67yfkgdzlnps-69f">
         <w:r>
           <w:rPr>
             <w:rStyle w:val="Hyperlink"/>
@@ -16601,7 +16601,7 @@
         </w:rPr>
         <w:t xml:space="preserve">2　</w:t>
       </w:r>
-      <w:hyperlink w:history="1" r:id="rIdqlqmzzbxl8g-s9omkywxn">
+      <w:hyperlink w:history="1" r:id="rIdkxv7zeqscdedfvx5rsxcc">
         <w:r>
           <w:rPr>
             <w:rStyle w:val="Hyperlink"/>
@@ -16627,7 +16627,7 @@
         </w:rPr>
         <w:t xml:space="preserve">4　</w:t>
       </w:r>
-      <w:hyperlink w:history="1" r:id="rIdmj_jvxwntqgia6snt7uyj">
+      <w:hyperlink w:history="1" r:id="rIdbgucypkjrv98kar7gl74u">
         <w:r>
           <w:rPr>
             <w:rStyle w:val="Hyperlink"/>

</xml_diff>

<commit_message>
checklist QC: fix 17 verify_issues (9 scope + 8 modal/entity) in sen/gifted/gov_admin school-version clauses
Scope/eligibility (9): restore 特殊學校/中學/官立及資助小學/按位津貼學校 qualifiers silently expanded or narrowed; all source-verified against items_verified.json. Regenerated school-version docx.

Modal/terminology/entity (8): 須->應 (sen teacher PD), insert 應/宜/可因應 to match source modality, 第三層支援->第三層級, 學校概覽->中、小學概覽, 法團校董會->校董會. qa_inspection[9] verified-correct (no change); gov_admin[0] kept per Leonard (書面 qualifier).

QC_REVIEW.md: 22 fixed / 106 pending.

Co-Authored-By: Claude Fable 5 <noreply@anthropic.com>
</commit_message>
<xml_diff>
--- a/dev/checklists/gifted/本校資優教育政策_學校版_DRAFT.docx
+++ b/dev/checklists/gifted/本校資優教育政策_學校版_DRAFT.docx
@@ -2295,7 +2295,7 @@
         </w:rPr>
         <w:t xml:space="preserve">1　</w:t>
       </w:r>
-      <w:hyperlink w:history="1" r:id="rIdtxm9ai4arvpaw1udlsozt">
+      <w:hyperlink w:history="1" r:id="rIdgvpp6p8rz1xfscdgtu9zr">
         <w:r>
           <w:rPr>
             <w:rStyle w:val="Hyperlink"/>
@@ -2321,7 +2321,7 @@
         </w:rPr>
         <w:t xml:space="preserve">2　</w:t>
       </w:r>
-      <w:hyperlink w:history="1" r:id="rIdyghiq1c5wtt-b8ibjjxct">
+      <w:hyperlink w:history="1" r:id="rIdrjw8oca-lqwe6tm-ytb-y">
         <w:r>
           <w:rPr>
             <w:rStyle w:val="Hyperlink"/>
@@ -2347,7 +2347,7 @@
         </w:rPr>
         <w:t xml:space="preserve">3, 14　</w:t>
       </w:r>
-      <w:hyperlink w:history="1" r:id="rIdzkpy4mzchkh9bifhb1ljf">
+      <w:hyperlink w:history="1" r:id="rIducf8cknkgbf6439ubkv3h">
         <w:r>
           <w:rPr>
             <w:rStyle w:val="Hyperlink"/>
@@ -2373,7 +2373,7 @@
         </w:rPr>
         <w:t xml:space="preserve">4　</w:t>
       </w:r>
-      <w:hyperlink w:history="1" r:id="rIdt3fypc7l_xm69fdxodl99">
+      <w:hyperlink w:history="1" r:id="rIdoxjpaza68zsqvpl1wfum3">
         <w:r>
           <w:rPr>
             <w:rStyle w:val="Hyperlink"/>
@@ -2399,7 +2399,7 @@
         </w:rPr>
         <w:t xml:space="preserve">5　</w:t>
       </w:r>
-      <w:hyperlink w:history="1" r:id="rIduev_ge6gq-vcl0u5bipdo">
+      <w:hyperlink w:history="1" r:id="rIdsshzv6kush1q4k3vvo0wy">
         <w:r>
           <w:rPr>
             <w:rStyle w:val="Hyperlink"/>
@@ -2425,7 +2425,7 @@
         </w:rPr>
         <w:t xml:space="preserve">6　</w:t>
       </w:r>
-      <w:hyperlink w:history="1" r:id="rIdyxggs92cxf44_ngmzh_di">
+      <w:hyperlink w:history="1" r:id="rIdjvjovscrdo7waqb1brolr">
         <w:r>
           <w:rPr>
             <w:rStyle w:val="Hyperlink"/>
@@ -2451,7 +2451,7 @@
         </w:rPr>
         <w:t xml:space="preserve">7, 20　</w:t>
       </w:r>
-      <w:hyperlink w:history="1" r:id="rId55k3bq32bmrjg209yobvz">
+      <w:hyperlink w:history="1" r:id="rIdbl9ju7ncou7ezfdu6bms-">
         <w:r>
           <w:rPr>
             <w:rStyle w:val="Hyperlink"/>
@@ -2477,7 +2477,7 @@
         </w:rPr>
         <w:t xml:space="preserve">8　</w:t>
       </w:r>
-      <w:hyperlink w:history="1" r:id="rIdpivdod6wiu19m9rlhbpsm">
+      <w:hyperlink w:history="1" r:id="rIdqdcfacobkxrebvmc-_gtr">
         <w:r>
           <w:rPr>
             <w:rStyle w:val="Hyperlink"/>
@@ -2503,7 +2503,7 @@
         </w:rPr>
         <w:t xml:space="preserve">9, 12　</w:t>
       </w:r>
-      <w:hyperlink w:history="1" r:id="rIdethjnzjsoivyowug0hpdw">
+      <w:hyperlink w:history="1" r:id="rIdmivlrazbqcf9gpkzbk2_v">
         <w:r>
           <w:rPr>
             <w:rStyle w:val="Hyperlink"/>
@@ -2529,7 +2529,7 @@
         </w:rPr>
         <w:t xml:space="preserve">10　</w:t>
       </w:r>
-      <w:hyperlink w:history="1" r:id="rIdjinswjs_fp0bjy0_1zv85">
+      <w:hyperlink w:history="1" r:id="rIdc6wwbzisvolrkapg-ygwz">
         <w:r>
           <w:rPr>
             <w:rStyle w:val="Hyperlink"/>
@@ -2555,7 +2555,7 @@
         </w:rPr>
         <w:t xml:space="preserve">11　</w:t>
       </w:r>
-      <w:hyperlink w:history="1" r:id="rIdpaxwgegi3ylvtfiyosyku">
+      <w:hyperlink w:history="1" r:id="rId4ypquwpdzo0klmkqdv0sa">
         <w:r>
           <w:rPr>
             <w:rStyle w:val="Hyperlink"/>
@@ -2581,7 +2581,7 @@
         </w:rPr>
         <w:t xml:space="preserve">13　</w:t>
       </w:r>
-      <w:hyperlink w:history="1" r:id="rId8bh9lpusltxx8qauskwwb">
+      <w:hyperlink w:history="1" r:id="rIdq6phsdumhmqql4x5nmfgc">
         <w:r>
           <w:rPr>
             <w:rStyle w:val="Hyperlink"/>
@@ -2607,7 +2607,7 @@
         </w:rPr>
         <w:t xml:space="preserve">15　</w:t>
       </w:r>
-      <w:hyperlink w:history="1" r:id="rIdcaukzhbxv3awuenbekkao">
+      <w:hyperlink w:history="1" r:id="rIdmabivowirne18mzgwsxtk">
         <w:r>
           <w:rPr>
             <w:rStyle w:val="Hyperlink"/>
@@ -2633,7 +2633,7 @@
         </w:rPr>
         <w:t xml:space="preserve">16　</w:t>
       </w:r>
-      <w:hyperlink w:history="1" r:id="rIdq2tsboewgbh9gio4zud3o">
+      <w:hyperlink w:history="1" r:id="rIdgqhmabsetc-ly_dlppife">
         <w:r>
           <w:rPr>
             <w:rStyle w:val="Hyperlink"/>
@@ -2659,7 +2659,7 @@
         </w:rPr>
         <w:t xml:space="preserve">17　</w:t>
       </w:r>
-      <w:hyperlink w:history="1" r:id="rIdt1pt9ri5ahzjfdaycqr89">
+      <w:hyperlink w:history="1" r:id="rIdfffqx7p_lnsptlxomwgcv">
         <w:r>
           <w:rPr>
             <w:rStyle w:val="Hyperlink"/>
@@ -2685,7 +2685,7 @@
         </w:rPr>
         <w:t xml:space="preserve">18　</w:t>
       </w:r>
-      <w:hyperlink w:history="1" r:id="rIdu8ciq0-kjazjn1yiyxsyo">
+      <w:hyperlink w:history="1" r:id="rIdrrre60l-_dglyl1ebox3f">
         <w:r>
           <w:rPr>
             <w:rStyle w:val="Hyperlink"/>
@@ -2711,7 +2711,7 @@
         </w:rPr>
         <w:t xml:space="preserve">19　</w:t>
       </w:r>
-      <w:hyperlink w:history="1" r:id="rId3s1msa2lbyyqrtdbcg1-q">
+      <w:hyperlink w:history="1" r:id="rIdvyav9slwuwcr5q6nlulmg">
         <w:r>
           <w:rPr>
             <w:rStyle w:val="Hyperlink"/>
@@ -3067,7 +3067,7 @@
                 <w:sz w:val="20"/>
                 <w:szCs w:val="20"/>
               </w:rPr>
-              <w:t xml:space="preserve">按學生特性、教師專業知識等校情，配合教育局的資優教育政策，自行擬定校本資優培育計劃</w:t>
+              <w:t xml:space="preserve">可因應學生特性、教師專業知識等校情，配合教育局的資優教育政策，自行擬定校本資優培育計劃</w:t>
             </w:r>
           </w:p>
         </w:tc>
@@ -4759,7 +4759,7 @@
         </w:rPr>
         <w:t xml:space="preserve">1, 2, 4, 6, 14, 15, 16　</w:t>
       </w:r>
-      <w:hyperlink w:history="1" r:id="rIdjlkoftywmv07u1duje2kd">
+      <w:hyperlink w:history="1" r:id="rIdwxzubjjlpkg4iht_5ytuw">
         <w:r>
           <w:rPr>
             <w:rStyle w:val="Hyperlink"/>
@@ -4785,7 +4785,7 @@
         </w:rPr>
         <w:t xml:space="preserve">3　</w:t>
       </w:r>
-      <w:hyperlink w:history="1" r:id="rIdwwhd0fmju1cttxtotbxdg">
+      <w:hyperlink w:history="1" r:id="rIdlxme9xtqktlmijlzbfdjf">
         <w:r>
           <w:rPr>
             <w:rStyle w:val="Hyperlink"/>
@@ -4811,7 +4811,7 @@
         </w:rPr>
         <w:t xml:space="preserve">5　</w:t>
       </w:r>
-      <w:hyperlink w:history="1" r:id="rId8ael38_2jiwopnhjwgtuj">
+      <w:hyperlink w:history="1" r:id="rIdcuxr_rb3bassonyubuzdc">
         <w:r>
           <w:rPr>
             <w:rStyle w:val="Hyperlink"/>
@@ -4837,7 +4837,7 @@
         </w:rPr>
         <w:t xml:space="preserve">7　</w:t>
       </w:r>
-      <w:hyperlink w:history="1" r:id="rIdvdy9sen0kcal9sphxs34f">
+      <w:hyperlink w:history="1" r:id="rIdoagpk4spuxp07gkh-urdr">
         <w:r>
           <w:rPr>
             <w:rStyle w:val="Hyperlink"/>
@@ -4863,7 +4863,7 @@
         </w:rPr>
         <w:t xml:space="preserve">8, 11　</w:t>
       </w:r>
-      <w:hyperlink w:history="1" r:id="rIdxkoxla4ux7psnih72vpus">
+      <w:hyperlink w:history="1" r:id="rIdp3lyyed9zjw3rcumkzfjd">
         <w:r>
           <w:rPr>
             <w:rStyle w:val="Hyperlink"/>
@@ -4889,7 +4889,7 @@
         </w:rPr>
         <w:t xml:space="preserve">9　</w:t>
       </w:r>
-      <w:hyperlink w:history="1" r:id="rIdzucclyw5fbvf9gp0v10ro">
+      <w:hyperlink w:history="1" r:id="rIdxx5y0ktfsnrazuaojhdtt">
         <w:r>
           <w:rPr>
             <w:rStyle w:val="Hyperlink"/>
@@ -4915,7 +4915,7 @@
         </w:rPr>
         <w:t xml:space="preserve">10　</w:t>
       </w:r>
-      <w:hyperlink w:history="1" r:id="rIdzcnvfqwze2ps3yvfcsmci">
+      <w:hyperlink w:history="1" r:id="rIdh6ztfdtfqumga85lvpvpx">
         <w:r>
           <w:rPr>
             <w:rStyle w:val="Hyperlink"/>
@@ -4941,7 +4941,7 @@
         </w:rPr>
         <w:t xml:space="preserve">12　</w:t>
       </w:r>
-      <w:hyperlink w:history="1" r:id="rIdiqpsm14jdx2fbxkvz8nht">
+      <w:hyperlink w:history="1" r:id="rIdsnwvvvoeu6dc_m849f7a0">
         <w:r>
           <w:rPr>
             <w:rStyle w:val="Hyperlink"/>
@@ -4967,7 +4967,7 @@
         </w:rPr>
         <w:t xml:space="preserve">13　</w:t>
       </w:r>
-      <w:hyperlink w:history="1" r:id="rId6o2y2klkhhwu-fuqcqpsd">
+      <w:hyperlink w:history="1" r:id="rIdyevigcz31pi-oyubvf3yl">
         <w:r>
           <w:rPr>
             <w:rStyle w:val="Hyperlink"/>
@@ -4993,7 +4993,7 @@
         </w:rPr>
         <w:t xml:space="preserve">17　</w:t>
       </w:r>
-      <w:hyperlink w:history="1" r:id="rIdrrartewd5ol5sypxeuxsl">
+      <w:hyperlink w:history="1" r:id="rIdn8yjnbmsc0uefjf6kyvqb">
         <w:r>
           <w:rPr>
             <w:rStyle w:val="Hyperlink"/>
@@ -5019,7 +5019,7 @@
         </w:rPr>
         <w:t xml:space="preserve">18　</w:t>
       </w:r>
-      <w:hyperlink w:history="1" r:id="rIdtbdtvx4voe46cuikdep_6">
+      <w:hyperlink w:history="1" r:id="rIdd9f85oacsetagvgcpjazm">
         <w:r>
           <w:rPr>
             <w:rStyle w:val="Hyperlink"/>
@@ -5045,7 +5045,7 @@
         </w:rPr>
         <w:t xml:space="preserve">19　</w:t>
       </w:r>
-      <w:hyperlink w:history="1" r:id="rIdpr1p_9asgl9htayvchsze">
+      <w:hyperlink w:history="1" r:id="rIdbq-akfao36y2d6drqdp0d">
         <w:r>
           <w:rPr>
             <w:rStyle w:val="Hyperlink"/>
@@ -5071,7 +5071,7 @@
         </w:rPr>
         <w:t xml:space="preserve">20　</w:t>
       </w:r>
-      <w:hyperlink w:history="1" r:id="rIdya84osafg5p2opzfkluxk">
+      <w:hyperlink w:history="1" r:id="rIduw-0h-1byzcxhh6aeyoy-">
         <w:r>
           <w:rPr>
             <w:rStyle w:val="Hyperlink"/>
@@ -5097,7 +5097,7 @@
         </w:rPr>
         <w:t xml:space="preserve">21　</w:t>
       </w:r>
-      <w:hyperlink w:history="1" r:id="rIdvgb5kqalsplvmshbyjzgp">
+      <w:hyperlink w:history="1" r:id="rIdcloikzeoi5via8-r7exmv">
         <w:r>
           <w:rPr>
             <w:rStyle w:val="Hyperlink"/>
@@ -7054,7 +7054,7 @@
         </w:rPr>
         <w:t xml:space="preserve">1, 4, 11　</w:t>
       </w:r>
-      <w:hyperlink w:history="1" r:id="rIdqpobqwptuuhsw6sea-vxt">
+      <w:hyperlink w:history="1" r:id="rIdxwa0iujo_dndc9tatxx3r">
         <w:r>
           <w:rPr>
             <w:rStyle w:val="Hyperlink"/>
@@ -7080,7 +7080,7 @@
         </w:rPr>
         <w:t xml:space="preserve">2, 7, 12, 40　</w:t>
       </w:r>
-      <w:hyperlink w:history="1" r:id="rId1gjg1vydwka21ls5e-0ts">
+      <w:hyperlink w:history="1" r:id="rIdysl2ossd2i3qimaxwt29c">
         <w:r>
           <w:rPr>
             <w:rStyle w:val="Hyperlink"/>
@@ -7106,7 +7106,7 @@
         </w:rPr>
         <w:t xml:space="preserve">3　</w:t>
       </w:r>
-      <w:hyperlink w:history="1" r:id="rIdh08evvf0rmna7gqdeuexp">
+      <w:hyperlink w:history="1" r:id="rId01rtknsfltew3umx3epq6">
         <w:r>
           <w:rPr>
             <w:rStyle w:val="Hyperlink"/>
@@ -7132,7 +7132,7 @@
         </w:rPr>
         <w:t xml:space="preserve">5　</w:t>
       </w:r>
-      <w:hyperlink w:history="1" r:id="rId7lwlfk_sbfrnhu1b4srml">
+      <w:hyperlink w:history="1" r:id="rIdzegnnyaki_cea8goqwejl">
         <w:r>
           <w:rPr>
             <w:rStyle w:val="Hyperlink"/>
@@ -7158,7 +7158,7 @@
         </w:rPr>
         <w:t xml:space="preserve">6　</w:t>
       </w:r>
-      <w:hyperlink w:history="1" r:id="rIdrwnyrd-pluskxqmg8to5r">
+      <w:hyperlink w:history="1" r:id="rIdrzcyue4p0ciek30tm6ebf">
         <w:r>
           <w:rPr>
             <w:rStyle w:val="Hyperlink"/>
@@ -7184,7 +7184,7 @@
         </w:rPr>
         <w:t xml:space="preserve">8, 22　</w:t>
       </w:r>
-      <w:hyperlink w:history="1" r:id="rIdjgwivxzdewlgjoejtbogm">
+      <w:hyperlink w:history="1" r:id="rId690syriduu47jzwzqezcc">
         <w:r>
           <w:rPr>
             <w:rStyle w:val="Hyperlink"/>
@@ -7210,7 +7210,7 @@
         </w:rPr>
         <w:t xml:space="preserve">9　</w:t>
       </w:r>
-      <w:hyperlink w:history="1" r:id="rIdngbw4dfze0etanu47vcro">
+      <w:hyperlink w:history="1" r:id="rIdy71vfameor-yfa_i-_gbg">
         <w:r>
           <w:rPr>
             <w:rStyle w:val="Hyperlink"/>
@@ -7236,7 +7236,7 @@
         </w:rPr>
         <w:t xml:space="preserve">10　</w:t>
       </w:r>
-      <w:hyperlink w:history="1" r:id="rIdejsbz1ndpd6hpmlw0hhzx">
+      <w:hyperlink w:history="1" r:id="rIdfezoeamqb5qcf0psdzrqe">
         <w:r>
           <w:rPr>
             <w:rStyle w:val="Hyperlink"/>
@@ -7262,7 +7262,7 @@
         </w:rPr>
         <w:t xml:space="preserve">13　</w:t>
       </w:r>
-      <w:hyperlink w:history="1" r:id="rIdlspof__ckjewyqqli_edc">
+      <w:hyperlink w:history="1" r:id="rIde4hsmlzit3ijonb7jetcm">
         <w:r>
           <w:rPr>
             <w:rStyle w:val="Hyperlink"/>
@@ -7288,7 +7288,7 @@
         </w:rPr>
         <w:t xml:space="preserve">14　</w:t>
       </w:r>
-      <w:hyperlink w:history="1" r:id="rIdgdgkd2ogj9et5dvyub692">
+      <w:hyperlink w:history="1" r:id="rIdkx8gylonjdh1rgpantuqn">
         <w:r>
           <w:rPr>
             <w:rStyle w:val="Hyperlink"/>
@@ -7314,7 +7314,7 @@
         </w:rPr>
         <w:t xml:space="preserve">15, 18　</w:t>
       </w:r>
-      <w:hyperlink w:history="1" r:id="rIdbkwa0uggufxkpuqdeko9k">
+      <w:hyperlink w:history="1" r:id="rIdzxnu4ds559avu8q7vy6dw">
         <w:r>
           <w:rPr>
             <w:rStyle w:val="Hyperlink"/>
@@ -7340,7 +7340,7 @@
         </w:rPr>
         <w:t xml:space="preserve">16, 19, 32, 38, 39　</w:t>
       </w:r>
-      <w:hyperlink w:history="1" r:id="rIdkrqr3jowv3ngovp_egbp2">
+      <w:hyperlink w:history="1" r:id="rIdiggpn3ow-ayuw-z8gwyoh">
         <w:r>
           <w:rPr>
             <w:rStyle w:val="Hyperlink"/>
@@ -7366,7 +7366,7 @@
         </w:rPr>
         <w:t xml:space="preserve">17　</w:t>
       </w:r>
-      <w:hyperlink w:history="1" r:id="rIdcfjmbo5dzbf6gdln5puda">
+      <w:hyperlink w:history="1" r:id="rIdx9zuqglsekdkbtmvk2l-k">
         <w:r>
           <w:rPr>
             <w:rStyle w:val="Hyperlink"/>
@@ -7392,7 +7392,7 @@
         </w:rPr>
         <w:t xml:space="preserve">20　</w:t>
       </w:r>
-      <w:hyperlink w:history="1" r:id="rIdfjp1vsdvhxkkhouqnfksy">
+      <w:hyperlink w:history="1" r:id="rIdwt7az8kqt9gvpzu22dm2f">
         <w:r>
           <w:rPr>
             <w:rStyle w:val="Hyperlink"/>
@@ -7418,7 +7418,7 @@
         </w:rPr>
         <w:t xml:space="preserve">21　</w:t>
       </w:r>
-      <w:hyperlink w:history="1" r:id="rIdq8znwsuebqd7rftyu2yek">
+      <w:hyperlink w:history="1" r:id="rIdyg9wb22lh98qxgfc0o1iy">
         <w:r>
           <w:rPr>
             <w:rStyle w:val="Hyperlink"/>
@@ -7444,7 +7444,7 @@
         </w:rPr>
         <w:t xml:space="preserve">23　</w:t>
       </w:r>
-      <w:hyperlink w:history="1" r:id="rId0e-4nkjbb88chj3emzhel">
+      <w:hyperlink w:history="1" r:id="rIdd9pvmxo55wfatum7veyn0">
         <w:r>
           <w:rPr>
             <w:rStyle w:val="Hyperlink"/>
@@ -7470,7 +7470,7 @@
         </w:rPr>
         <w:t xml:space="preserve">24　</w:t>
       </w:r>
-      <w:hyperlink w:history="1" r:id="rIdhqmjth9esfqjv_fbmwuef">
+      <w:hyperlink w:history="1" r:id="rId_b_nxwinxjcpoaj6yq8wq">
         <w:r>
           <w:rPr>
             <w:rStyle w:val="Hyperlink"/>
@@ -7496,7 +7496,7 @@
         </w:rPr>
         <w:t xml:space="preserve">25, 29　</w:t>
       </w:r>
-      <w:hyperlink w:history="1" r:id="rIda23bgqgmlivrzbcjcrz_8">
+      <w:hyperlink w:history="1" r:id="rIdxza3w1o5f6p5lvm3cpwsb">
         <w:r>
           <w:rPr>
             <w:rStyle w:val="Hyperlink"/>
@@ -7522,7 +7522,7 @@
         </w:rPr>
         <w:t xml:space="preserve">26　</w:t>
       </w:r>
-      <w:hyperlink w:history="1" r:id="rIdmpfgfpjzkqimt3k9lnfc_">
+      <w:hyperlink w:history="1" r:id="rIdlx-j5eobc5aywwcgq6_-o">
         <w:r>
           <w:rPr>
             <w:rStyle w:val="Hyperlink"/>
@@ -7548,7 +7548,7 @@
         </w:rPr>
         <w:t xml:space="preserve">27　</w:t>
       </w:r>
-      <w:hyperlink w:history="1" r:id="rIdax5mcfsbjozbzvuzcenmi">
+      <w:hyperlink w:history="1" r:id="rIdea_fpbefohlg_pnf2p028">
         <w:r>
           <w:rPr>
             <w:rStyle w:val="Hyperlink"/>
@@ -7574,7 +7574,7 @@
         </w:rPr>
         <w:t xml:space="preserve">28　</w:t>
       </w:r>
-      <w:hyperlink w:history="1" r:id="rIdyixwe1zulimroztiaweqh">
+      <w:hyperlink w:history="1" r:id="rId9sxn8kicxm71hdvstqysi">
         <w:r>
           <w:rPr>
             <w:rStyle w:val="Hyperlink"/>
@@ -7600,7 +7600,7 @@
         </w:rPr>
         <w:t xml:space="preserve">30　</w:t>
       </w:r>
-      <w:hyperlink w:history="1" r:id="rIdt5qr3wlirvoz1rss6asa_">
+      <w:hyperlink w:history="1" r:id="rIdfbv7lfzfb81xg06bv2ise">
         <w:r>
           <w:rPr>
             <w:rStyle w:val="Hyperlink"/>
@@ -7626,7 +7626,7 @@
         </w:rPr>
         <w:t xml:space="preserve">31　</w:t>
       </w:r>
-      <w:hyperlink w:history="1" r:id="rIdwkw7razdmzauxocaskckj">
+      <w:hyperlink w:history="1" r:id="rIdlo4n_i1kdtbhouofubr9l">
         <w:r>
           <w:rPr>
             <w:rStyle w:val="Hyperlink"/>
@@ -7652,7 +7652,7 @@
         </w:rPr>
         <w:t xml:space="preserve">33, 37　</w:t>
       </w:r>
-      <w:hyperlink w:history="1" r:id="rId6ijxhb-yzrtpley3phmb-">
+      <w:hyperlink w:history="1" r:id="rId6zmpxl1fydppdu8dkppet">
         <w:r>
           <w:rPr>
             <w:rStyle w:val="Hyperlink"/>
@@ -7678,7 +7678,7 @@
         </w:rPr>
         <w:t xml:space="preserve">34　</w:t>
       </w:r>
-      <w:hyperlink w:history="1" r:id="rIdz98rfx3tz9o6vu6dt_79w">
+      <w:hyperlink w:history="1" r:id="rIdfd28y5orpfn5pbqt9ew_q">
         <w:r>
           <w:rPr>
             <w:rStyle w:val="Hyperlink"/>
@@ -7704,7 +7704,7 @@
         </w:rPr>
         <w:t xml:space="preserve">35　</w:t>
       </w:r>
-      <w:hyperlink w:history="1" r:id="rIdpwhyguoyxfiqfirzzoind">
+      <w:hyperlink w:history="1" r:id="rId0xgrzaiulrc5ev5eeduut">
         <w:r>
           <w:rPr>
             <w:rStyle w:val="Hyperlink"/>
@@ -7730,7 +7730,7 @@
         </w:rPr>
         <w:t xml:space="preserve">36　</w:t>
       </w:r>
-      <w:hyperlink w:history="1" r:id="rIdjepied7tgvfz6d2skeail">
+      <w:hyperlink w:history="1" r:id="rIdedsjsj4hnr2kmgh7zaaor">
         <w:r>
           <w:rPr>
             <w:rStyle w:val="Hyperlink"/>
@@ -7756,7 +7756,7 @@
         </w:rPr>
         <w:t xml:space="preserve">41　</w:t>
       </w:r>
-      <w:hyperlink w:history="1" r:id="rIdple3jjfktx4m5xz9a5kti">
+      <w:hyperlink w:history="1" r:id="rId-l2rg7opbt-k7vqkrha3f">
         <w:r>
           <w:rPr>
             <w:rStyle w:val="Hyperlink"/>
@@ -7782,7 +7782,7 @@
         </w:rPr>
         <w:t xml:space="preserve">42　</w:t>
       </w:r>
-      <w:hyperlink w:history="1" r:id="rIdgdpt4n28x_rslp6f5sc-m">
+      <w:hyperlink w:history="1" r:id="rIdugu3fcofhj1kqxkukk5a9">
         <w:r>
           <w:rPr>
             <w:rStyle w:val="Hyperlink"/>
@@ -8543,7 +8543,7 @@
         </w:rPr>
         <w:t xml:space="preserve">1, 4, 6　</w:t>
       </w:r>
-      <w:hyperlink w:history="1" r:id="rId3xdk2awyjx4fryonujmt0">
+      <w:hyperlink w:history="1" r:id="rIdkpyn1qj8wz11tjb5qmhkt">
         <w:r>
           <w:rPr>
             <w:rStyle w:val="Hyperlink"/>
@@ -8569,7 +8569,7 @@
         </w:rPr>
         <w:t xml:space="preserve">2　</w:t>
       </w:r>
-      <w:hyperlink w:history="1" r:id="rIdzs5qai6flqomcwpun5p_m">
+      <w:hyperlink w:history="1" r:id="rIde1pn07nzaovoqgyvu9uo0">
         <w:r>
           <w:rPr>
             <w:rStyle w:val="Hyperlink"/>
@@ -8595,7 +8595,7 @@
         </w:rPr>
         <w:t xml:space="preserve">3　</w:t>
       </w:r>
-      <w:hyperlink w:history="1" r:id="rId5ckymvt3tvlxe_m0kgjlv">
+      <w:hyperlink w:history="1" r:id="rIdoge1lvokgefewwvlnokno">
         <w:r>
           <w:rPr>
             <w:rStyle w:val="Hyperlink"/>
@@ -8621,7 +8621,7 @@
         </w:rPr>
         <w:t xml:space="preserve">5　</w:t>
       </w:r>
-      <w:hyperlink w:history="1" r:id="rId9uxno2jyyj7qbhrmhkd3_">
+      <w:hyperlink w:history="1" r:id="rIdkxmykwdqemzcifuavejat">
         <w:r>
           <w:rPr>
             <w:rStyle w:val="Hyperlink"/>
@@ -8647,7 +8647,7 @@
         </w:rPr>
         <w:t xml:space="preserve">7　</w:t>
       </w:r>
-      <w:hyperlink w:history="1" r:id="rIdlypnhfbszjjml3bk-6vry">
+      <w:hyperlink w:history="1" r:id="rId6t4nd-pi2mmzcckbfnihc">
         <w:r>
           <w:rPr>
             <w:rStyle w:val="Hyperlink"/>
@@ -8673,7 +8673,7 @@
         </w:rPr>
         <w:t xml:space="preserve">8　</w:t>
       </w:r>
-      <w:hyperlink w:history="1" r:id="rIdywjlb75dnccetsgfbdpc7">
+      <w:hyperlink w:history="1" r:id="rId4rbbmopj4tls50ir38zol">
         <w:r>
           <w:rPr>
             <w:rStyle w:val="Hyperlink"/>
@@ -8699,7 +8699,7 @@
         </w:rPr>
         <w:t xml:space="preserve">9　</w:t>
       </w:r>
-      <w:hyperlink w:history="1" r:id="rIdabocb2kz50r6jqs-kikcp">
+      <w:hyperlink w:history="1" r:id="rId3lfamkstpo_xh77dqn0ci">
         <w:r>
           <w:rPr>
             <w:rStyle w:val="Hyperlink"/>
@@ -8725,7 +8725,7 @@
         </w:rPr>
         <w:t xml:space="preserve">10　</w:t>
       </w:r>
-      <w:hyperlink w:history="1" r:id="rIdm4ucy9rpq_pqfyewhlmny">
+      <w:hyperlink w:history="1" r:id="rIdqsknpkkxt6vyksdjqibrz">
         <w:r>
           <w:rPr>
             <w:rStyle w:val="Hyperlink"/>
@@ -8751,7 +8751,7 @@
         </w:rPr>
         <w:t xml:space="preserve">11　</w:t>
       </w:r>
-      <w:hyperlink w:history="1" r:id="rIdjzumsfmfzikenpzgtsnry">
+      <w:hyperlink w:history="1" r:id="rIdqzjy2llpn5wsvhrvpmth3">
         <w:r>
           <w:rPr>
             <w:rStyle w:val="Hyperlink"/>
@@ -8777,7 +8777,7 @@
         </w:rPr>
         <w:t xml:space="preserve">12　</w:t>
       </w:r>
-      <w:hyperlink w:history="1" r:id="rIduslelk_iargfiyp0xa4oj">
+      <w:hyperlink w:history="1" r:id="rIdaqdhgrfa3cfvmsdpv44wv">
         <w:r>
           <w:rPr>
             <w:rStyle w:val="Hyperlink"/>
@@ -8803,7 +8803,7 @@
         </w:rPr>
         <w:t xml:space="preserve">13　</w:t>
       </w:r>
-      <w:hyperlink w:history="1" r:id="rIdzthdpnouvs0urpjes6u4e">
+      <w:hyperlink w:history="1" r:id="rIdkbgd8a3k57elx-l2v0_cr">
         <w:r>
           <w:rPr>
             <w:rStyle w:val="Hyperlink"/>
@@ -8829,7 +8829,7 @@
         </w:rPr>
         <w:t xml:space="preserve">14　</w:t>
       </w:r>
-      <w:hyperlink w:history="1" r:id="rIdj5mquvhu7styhqiecvfrf">
+      <w:hyperlink w:history="1" r:id="rIdfbdawua0pghdpkjudx3op">
         <w:r>
           <w:rPr>
             <w:rStyle w:val="Hyperlink"/>
@@ -8855,7 +8855,7 @@
         </w:rPr>
         <w:t xml:space="preserve">15　</w:t>
       </w:r>
-      <w:hyperlink w:history="1" r:id="rIdqcgi7noaqr-xpdsf3gf5z">
+      <w:hyperlink w:history="1" r:id="rIdxbchhr4oo3osegshzzohp">
         <w:r>
           <w:rPr>
             <w:rStyle w:val="Hyperlink"/>
@@ -10561,7 +10561,7 @@
         </w:rPr>
         <w:t xml:space="preserve">1　</w:t>
       </w:r>
-      <w:hyperlink w:history="1" r:id="rIdaxgsen3rny6v4cgnbhuku">
+      <w:hyperlink w:history="1" r:id="rId4ymbqskmj05nvgvme3gex">
         <w:r>
           <w:rPr>
             <w:rStyle w:val="Hyperlink"/>
@@ -10587,7 +10587,7 @@
         </w:rPr>
         <w:t xml:space="preserve">2　</w:t>
       </w:r>
-      <w:hyperlink w:history="1" r:id="rIdf2arloc2mn82uucd-mpcu">
+      <w:hyperlink w:history="1" r:id="rIdv_eeope0c-swsy5wbxasd">
         <w:r>
           <w:rPr>
             <w:rStyle w:val="Hyperlink"/>
@@ -10613,7 +10613,7 @@
         </w:rPr>
         <w:t xml:space="preserve">3　</w:t>
       </w:r>
-      <w:hyperlink w:history="1" r:id="rIdyu8rhxagqjhxnuashrbpl">
+      <w:hyperlink w:history="1" r:id="rIdfbs_trkfdz98owls4z8pl">
         <w:r>
           <w:rPr>
             <w:rStyle w:val="Hyperlink"/>
@@ -10639,7 +10639,7 @@
         </w:rPr>
         <w:t xml:space="preserve">4　</w:t>
       </w:r>
-      <w:hyperlink w:history="1" r:id="rIdirp31ccbypqn1hx79gpyy">
+      <w:hyperlink w:history="1" r:id="rId-mx7rbfoynl_7u5th_r9p">
         <w:r>
           <w:rPr>
             <w:rStyle w:val="Hyperlink"/>
@@ -10665,7 +10665,7 @@
         </w:rPr>
         <w:t xml:space="preserve">5　</w:t>
       </w:r>
-      <w:hyperlink w:history="1" r:id="rIdokf80vfjth50k-apbbyka">
+      <w:hyperlink w:history="1" r:id="rIdxos1wregj46zpks2_zxti">
         <w:r>
           <w:rPr>
             <w:rStyle w:val="Hyperlink"/>
@@ -10691,7 +10691,7 @@
         </w:rPr>
         <w:t xml:space="preserve">6, 7, 8　</w:t>
       </w:r>
-      <w:hyperlink w:history="1" r:id="rIddp8xcddc2eewixzlarx8z">
+      <w:hyperlink w:history="1" r:id="rIdudozkk1_aen1dujjz6xhc">
         <w:r>
           <w:rPr>
             <w:rStyle w:val="Hyperlink"/>
@@ -10717,7 +10717,7 @@
         </w:rPr>
         <w:t xml:space="preserve">9　</w:t>
       </w:r>
-      <w:hyperlink w:history="1" r:id="rIdrmvg-a2magevy-idvaej2">
+      <w:hyperlink w:history="1" r:id="rIdd9tlmhzvvnlukp9y4wf27">
         <w:r>
           <w:rPr>
             <w:rStyle w:val="Hyperlink"/>
@@ -10993,7 +10993,7 @@
           <w:sz w:val="22"/>
           <w:szCs w:val="22"/>
         </w:rPr>
-        <w:t xml:space="preserve">本校持續推廣情意教育及輔導工作，並致力減低學生和家長對尋求精神健康支援和輔導的誤解和被污名化的顧慮。本校可在課程中加入以下情意教育課題，以照顧資優學生的情意需要，協助其全面發展與成長：</w:t>
+        <w:t xml:space="preserve">本校宜持續推廣情意教育及輔導工作，並致力減低學生和家長對尋求精神健康支援和輔導的誤解和被污名化的顧慮。本校可在課程中加入以下情意教育課題，以照顧資優學生的情意需要，協助其全面發展與成長：</w:t>
       </w:r>
       <w:r>
         <w:rPr>
@@ -11594,7 +11594,7 @@
         </w:rPr>
         <w:t xml:space="preserve">1　</w:t>
       </w:r>
-      <w:hyperlink w:history="1" r:id="rIdzg0cta2e3wvdvhlfoog8h">
+      <w:hyperlink w:history="1" r:id="rIdds4aor2fqs_ai5hagvwix">
         <w:r>
           <w:rPr>
             <w:rStyle w:val="Hyperlink"/>
@@ -11620,7 +11620,7 @@
         </w:rPr>
         <w:t xml:space="preserve">2　</w:t>
       </w:r>
-      <w:hyperlink w:history="1" r:id="rIdl-vaxu5hvnsbuwtpyjuhw">
+      <w:hyperlink w:history="1" r:id="rId649w0hzhmmmnfa0cjrowd">
         <w:r>
           <w:rPr>
             <w:rStyle w:val="Hyperlink"/>
@@ -11646,7 +11646,7 @@
         </w:rPr>
         <w:t xml:space="preserve">3　</w:t>
       </w:r>
-      <w:hyperlink w:history="1" r:id="rIdlmaf9jpzjsq9stp0cs7a3">
+      <w:hyperlink w:history="1" r:id="rIde7yvyjsqemy--seuh2rlj">
         <w:r>
           <w:rPr>
             <w:rStyle w:val="Hyperlink"/>
@@ -11672,7 +11672,7 @@
         </w:rPr>
         <w:t xml:space="preserve">4　</w:t>
       </w:r>
-      <w:hyperlink w:history="1" r:id="rIdmhwi5dau4q6ie1ti0rlyp">
+      <w:hyperlink w:history="1" r:id="rIdj8fnabkqe293_sc29re6p">
         <w:r>
           <w:rPr>
             <w:rStyle w:val="Hyperlink"/>
@@ -11698,7 +11698,7 @@
         </w:rPr>
         <w:t xml:space="preserve">5　</w:t>
       </w:r>
-      <w:hyperlink w:history="1" r:id="rIdqjxnsmpbhchl8vlqc515j">
+      <w:hyperlink w:history="1" r:id="rIdwr4ibg0ji2dppffsk3sdt">
         <w:r>
           <w:rPr>
             <w:rStyle w:val="Hyperlink"/>
@@ -11724,7 +11724,7 @@
         </w:rPr>
         <w:t xml:space="preserve">6　</w:t>
       </w:r>
-      <w:hyperlink w:history="1" r:id="rIdgqbvuu3sxarlpimrbucke">
+      <w:hyperlink w:history="1" r:id="rIdmqq7rlqve6s3m2cwq1fx_">
         <w:r>
           <w:rPr>
             <w:rStyle w:val="Hyperlink"/>
@@ -11750,7 +11750,7 @@
         </w:rPr>
         <w:t xml:space="preserve">7　</w:t>
       </w:r>
-      <w:hyperlink w:history="1" r:id="rIdqqtc-trvm1hogi6abzqxt">
+      <w:hyperlink w:history="1" r:id="rId7txssekyud7glj7cb8i8p">
         <w:r>
           <w:rPr>
             <w:rStyle w:val="Hyperlink"/>
@@ -11776,7 +11776,7 @@
         </w:rPr>
         <w:t xml:space="preserve">8, 13　</w:t>
       </w:r>
-      <w:hyperlink w:history="1" r:id="rId5t3fs3ot6vgunj0shae-l">
+      <w:hyperlink w:history="1" r:id="rIdepc-jcqeczuvjldzn7jpr">
         <w:r>
           <w:rPr>
             <w:rStyle w:val="Hyperlink"/>
@@ -11802,7 +11802,7 @@
         </w:rPr>
         <w:t xml:space="preserve">9　</w:t>
       </w:r>
-      <w:hyperlink w:history="1" r:id="rIdhzzw8du_plynpvf1lzrfo">
+      <w:hyperlink w:history="1" r:id="rId721j3i_ysvyfuqncpl6sj">
         <w:r>
           <w:rPr>
             <w:rStyle w:val="Hyperlink"/>
@@ -11828,7 +11828,7 @@
         </w:rPr>
         <w:t xml:space="preserve">10　</w:t>
       </w:r>
-      <w:hyperlink w:history="1" r:id="rId9eslcovhtz8sary6rumfr">
+      <w:hyperlink w:history="1" r:id="rIdldxfp7hufolfruatpiajw">
         <w:r>
           <w:rPr>
             <w:rStyle w:val="Hyperlink"/>
@@ -11854,7 +11854,7 @@
         </w:rPr>
         <w:t xml:space="preserve">11　</w:t>
       </w:r>
-      <w:hyperlink w:history="1" r:id="rIdugcmub2wzung2shccz0ca">
+      <w:hyperlink w:history="1" r:id="rIdhqbpmbhxmfou1auo5n8q0">
         <w:r>
           <w:rPr>
             <w:rStyle w:val="Hyperlink"/>
@@ -11880,7 +11880,7 @@
         </w:rPr>
         <w:t xml:space="preserve">12　</w:t>
       </w:r>
-      <w:hyperlink w:history="1" r:id="rId_hstot9fhbz1_30r9pynk">
+      <w:hyperlink w:history="1" r:id="rIdo2zhukzzh-slpusj1xvlw">
         <w:r>
           <w:rPr>
             <w:rStyle w:val="Hyperlink"/>
@@ -11906,7 +11906,7 @@
         </w:rPr>
         <w:t xml:space="preserve">14　</w:t>
       </w:r>
-      <w:hyperlink w:history="1" r:id="rIdmcbkfrnamzav7u12yjkvv">
+      <w:hyperlink w:history="1" r:id="rId8rokhngnzlsfn_ezdd9ot">
         <w:r>
           <w:rPr>
             <w:rStyle w:val="Hyperlink"/>
@@ -11932,7 +11932,7 @@
         </w:rPr>
         <w:t xml:space="preserve">15　</w:t>
       </w:r>
-      <w:hyperlink w:history="1" r:id="rIdozb0labrcnxgeuswzfzwl">
+      <w:hyperlink w:history="1" r:id="rIdac3-doaogxfo42kpu5dcv">
         <w:r>
           <w:rPr>
             <w:rStyle w:val="Hyperlink"/>
@@ -11958,7 +11958,7 @@
         </w:rPr>
         <w:t xml:space="preserve">16　</w:t>
       </w:r>
-      <w:hyperlink w:history="1" r:id="rId_xylcw-vxywbritkat6ov">
+      <w:hyperlink w:history="1" r:id="rIdzvbs9wzmjmoxilxothbte">
         <w:r>
           <w:rPr>
             <w:rStyle w:val="Hyperlink"/>
@@ -13223,7 +13223,7 @@
         </w:rPr>
         <w:t xml:space="preserve">1　</w:t>
       </w:r>
-      <w:hyperlink w:history="1" r:id="rIdcfpfwrdfbt3eutiew9pfb">
+      <w:hyperlink w:history="1" r:id="rIdeijdy5iolqpwbxjubw4bs">
         <w:r>
           <w:rPr>
             <w:rStyle w:val="Hyperlink"/>
@@ -13249,7 +13249,7 @@
         </w:rPr>
         <w:t xml:space="preserve">2, 14　</w:t>
       </w:r>
-      <w:hyperlink w:history="1" r:id="rIddcqgu1zziwyqevp2ujosh">
+      <w:hyperlink w:history="1" r:id="rIdnghng4ccmo8err5uvvgnn">
         <w:r>
           <w:rPr>
             <w:rStyle w:val="Hyperlink"/>
@@ -13275,7 +13275,7 @@
         </w:rPr>
         <w:t xml:space="preserve">3, 17　</w:t>
       </w:r>
-      <w:hyperlink w:history="1" r:id="rIdb48s9uvu8xfxxra6tiwru">
+      <w:hyperlink w:history="1" r:id="rIdo5chju3_dckjhdlttf_v2">
         <w:r>
           <w:rPr>
             <w:rStyle w:val="Hyperlink"/>
@@ -13301,7 +13301,7 @@
         </w:rPr>
         <w:t xml:space="preserve">4, 9　</w:t>
       </w:r>
-      <w:hyperlink w:history="1" r:id="rIdbgwlskfzgniwmr-x5liv6">
+      <w:hyperlink w:history="1" r:id="rIdox1n_2wr1oiesvzcjyhcw">
         <w:r>
           <w:rPr>
             <w:rStyle w:val="Hyperlink"/>
@@ -13327,7 +13327,7 @@
         </w:rPr>
         <w:t xml:space="preserve">5, 11　</w:t>
       </w:r>
-      <w:hyperlink w:history="1" r:id="rIdfkzel7mkq8knkhytluyxa">
+      <w:hyperlink w:history="1" r:id="rId7pt32spvbmxhprstziffb">
         <w:r>
           <w:rPr>
             <w:rStyle w:val="Hyperlink"/>
@@ -13353,7 +13353,7 @@
         </w:rPr>
         <w:t xml:space="preserve">6　</w:t>
       </w:r>
-      <w:hyperlink w:history="1" r:id="rId9xdltqny6kphpb20j2lex">
+      <w:hyperlink w:history="1" r:id="rIdjupqh3qvfeodagb8-lkgw">
         <w:r>
           <w:rPr>
             <w:rStyle w:val="Hyperlink"/>
@@ -13379,7 +13379,7 @@
         </w:rPr>
         <w:t xml:space="preserve">7, 10, 12　</w:t>
       </w:r>
-      <w:hyperlink w:history="1" r:id="rIdi48jxfgtaexz62a2dlfjp">
+      <w:hyperlink w:history="1" r:id="rIdd-kkv3bsjaqmowcudl9p5">
         <w:r>
           <w:rPr>
             <w:rStyle w:val="Hyperlink"/>
@@ -13405,7 +13405,7 @@
         </w:rPr>
         <w:t xml:space="preserve">8　</w:t>
       </w:r>
-      <w:hyperlink w:history="1" r:id="rIdkko4trnk1s-4dk_trbgpv">
+      <w:hyperlink w:history="1" r:id="rId5d2pbcbeccqh4v5elhtmm">
         <w:r>
           <w:rPr>
             <w:rStyle w:val="Hyperlink"/>
@@ -13431,7 +13431,7 @@
         </w:rPr>
         <w:t xml:space="preserve">13　</w:t>
       </w:r>
-      <w:hyperlink w:history="1" r:id="rIdgsquddxx605lovw5zngsm">
+      <w:hyperlink w:history="1" r:id="rIdu8cypt33qkyizenaeeupc">
         <w:r>
           <w:rPr>
             <w:rStyle w:val="Hyperlink"/>
@@ -13457,7 +13457,7 @@
         </w:rPr>
         <w:t xml:space="preserve">15　</w:t>
       </w:r>
-      <w:hyperlink w:history="1" r:id="rIdt8xaff12p7abndbjzdsib">
+      <w:hyperlink w:history="1" r:id="rId3wckeke8jmsenmudhbcfo">
         <w:r>
           <w:rPr>
             <w:rStyle w:val="Hyperlink"/>
@@ -13483,7 +13483,7 @@
         </w:rPr>
         <w:t xml:space="preserve">16　</w:t>
       </w:r>
-      <w:hyperlink w:history="1" r:id="rIdsdfmffrhuvm2d4svfzwot">
+      <w:hyperlink w:history="1" r:id="rIdfc9deyiapr0x4gnsdsuox">
         <w:r>
           <w:rPr>
             <w:rStyle w:val="Hyperlink"/>
@@ -13509,7 +13509,7 @@
         </w:rPr>
         <w:t xml:space="preserve">18　</w:t>
       </w:r>
-      <w:hyperlink w:history="1" r:id="rIdpoeohjhd325x3g4fic1l1">
+      <w:hyperlink w:history="1" r:id="rIdgta1dwbubtpgq-gn96mr6">
         <w:r>
           <w:rPr>
             <w:rStyle w:val="Hyperlink"/>
@@ -13535,7 +13535,7 @@
         </w:rPr>
         <w:t xml:space="preserve">19, 21　</w:t>
       </w:r>
-      <w:hyperlink w:history="1" r:id="rIdor2yrckwxyts7akday1va">
+      <w:hyperlink w:history="1" r:id="rIdrwsqdtmyijqpitxto53sf">
         <w:r>
           <w:rPr>
             <w:rStyle w:val="Hyperlink"/>
@@ -13561,7 +13561,7 @@
         </w:rPr>
         <w:t xml:space="preserve">20　</w:t>
       </w:r>
-      <w:hyperlink w:history="1" r:id="rIdoy3jk1vufomt3kppckwor">
+      <w:hyperlink w:history="1" r:id="rIddqm9e0tkhzxtpv62_ytrb">
         <w:r>
           <w:rPr>
             <w:rStyle w:val="Hyperlink"/>
@@ -14268,7 +14268,7 @@
         </w:rPr>
         <w:t xml:space="preserve">1　</w:t>
       </w:r>
-      <w:hyperlink w:history="1" r:id="rIdfj-wmtzektny2rry__ilc">
+      <w:hyperlink w:history="1" r:id="rIdzft4gnj498lvwlv-ripis">
         <w:r>
           <w:rPr>
             <w:rStyle w:val="Hyperlink"/>
@@ -14294,7 +14294,7 @@
         </w:rPr>
         <w:t xml:space="preserve">2　</w:t>
       </w:r>
-      <w:hyperlink w:history="1" r:id="rIdlk0is7bnamajsfx6qkb7c">
+      <w:hyperlink w:history="1" r:id="rIdnwc3simd5wl7ssrx2pawk">
         <w:r>
           <w:rPr>
             <w:rStyle w:val="Hyperlink"/>
@@ -14320,7 +14320,7 @@
         </w:rPr>
         <w:t xml:space="preserve">3　</w:t>
       </w:r>
-      <w:hyperlink w:history="1" r:id="rIdyyyudogewurdaukn8lkpy">
+      <w:hyperlink w:history="1" r:id="rIdwvhnkkijgopo8klm2bg19">
         <w:r>
           <w:rPr>
             <w:rStyle w:val="Hyperlink"/>
@@ -14346,7 +14346,7 @@
         </w:rPr>
         <w:t xml:space="preserve">4　</w:t>
       </w:r>
-      <w:hyperlink w:history="1" r:id="rIdz3sbi8y2pimxrcmvzfbej">
+      <w:hyperlink w:history="1" r:id="rIdcwnr_2zvtddrvtqozhrbr">
         <w:r>
           <w:rPr>
             <w:rStyle w:val="Hyperlink"/>
@@ -14372,7 +14372,7 @@
         </w:rPr>
         <w:t xml:space="preserve">5　</w:t>
       </w:r>
-      <w:hyperlink w:history="1" r:id="rIdjab8x33rtnto6jytfw05h">
+      <w:hyperlink w:history="1" r:id="rIdadv37bd-h12pnimcu5a1d">
         <w:r>
           <w:rPr>
             <w:rStyle w:val="Hyperlink"/>
@@ -14398,7 +14398,7 @@
         </w:rPr>
         <w:t xml:space="preserve">6　</w:t>
       </w:r>
-      <w:hyperlink w:history="1" r:id="rIdfyxs7d6vrpczpniuusq4v">
+      <w:hyperlink w:history="1" r:id="rIdf0tjfgvuoitiiyj83yawf">
         <w:r>
           <w:rPr>
             <w:rStyle w:val="Hyperlink"/>
@@ -14424,7 +14424,7 @@
         </w:rPr>
         <w:t xml:space="preserve">7　</w:t>
       </w:r>
-      <w:hyperlink w:history="1" r:id="rIddxrhqqjyktykpzyqdwpdp">
+      <w:hyperlink w:history="1" r:id="rIdgoc9fbpassuapeu7ted2g">
         <w:r>
           <w:rPr>
             <w:rStyle w:val="Hyperlink"/>
@@ -14450,7 +14450,7 @@
         </w:rPr>
         <w:t xml:space="preserve">8　</w:t>
       </w:r>
-      <w:hyperlink w:history="1" r:id="rIdvbmxhc-ndlnln00uxh85f">
+      <w:hyperlink w:history="1" r:id="rIdsuucucfqhdxkni6hkdaew">
         <w:r>
           <w:rPr>
             <w:rStyle w:val="Hyperlink"/>
@@ -15019,7 +15019,7 @@
         </w:rPr>
         <w:t xml:space="preserve">1, 2　</w:t>
       </w:r>
-      <w:hyperlink w:history="1" r:id="rIdsp4ia3lhk-fno0gxhgtj3">
+      <w:hyperlink w:history="1" r:id="rIdainpq040jopynubo-mtbp">
         <w:r>
           <w:rPr>
             <w:rStyle w:val="Hyperlink"/>
@@ -15045,7 +15045,7 @@
         </w:rPr>
         <w:t xml:space="preserve">3　</w:t>
       </w:r>
-      <w:hyperlink w:history="1" r:id="rIdzoi3wohvxantmnwmbhoek">
+      <w:hyperlink w:history="1" r:id="rId6j3r2imfk0c420fit2ldu">
         <w:r>
           <w:rPr>
             <w:rStyle w:val="Hyperlink"/>
@@ -15071,7 +15071,7 @@
         </w:rPr>
         <w:t xml:space="preserve">4　</w:t>
       </w:r>
-      <w:hyperlink w:history="1" r:id="rIdeabjiy3rgnlfqpjhpx5_o">
+      <w:hyperlink w:history="1" r:id="rIddzqeett5qxumjypm3d8t7">
         <w:r>
           <w:rPr>
             <w:rStyle w:val="Hyperlink"/>
@@ -15743,7 +15743,7 @@
         </w:rPr>
         <w:t xml:space="preserve">1　</w:t>
       </w:r>
-      <w:hyperlink w:history="1" r:id="rIdv3wa_p11w4wkrvao-vgvh">
+      <w:hyperlink w:history="1" r:id="rIdayclgqwznb_f8rbuk6wmn">
         <w:r>
           <w:rPr>
             <w:rStyle w:val="Hyperlink"/>
@@ -15769,7 +15769,7 @@
         </w:rPr>
         <w:t xml:space="preserve">2, 16　</w:t>
       </w:r>
-      <w:hyperlink w:history="1" r:id="rIdevgf2_am0ucluegyajip7">
+      <w:hyperlink w:history="1" r:id="rIdeba8yvc9ecvyzxf5aolre">
         <w:r>
           <w:rPr>
             <w:rStyle w:val="Hyperlink"/>
@@ -15795,7 +15795,7 @@
         </w:rPr>
         <w:t xml:space="preserve">3　</w:t>
       </w:r>
-      <w:hyperlink w:history="1" r:id="rIdarmazmcr9xcmuol9ls7oh">
+      <w:hyperlink w:history="1" r:id="rIdag2ukazaay5zuc1so6rt2">
         <w:r>
           <w:rPr>
             <w:rStyle w:val="Hyperlink"/>
@@ -15821,7 +15821,7 @@
         </w:rPr>
         <w:t xml:space="preserve">4, 5　</w:t>
       </w:r>
-      <w:hyperlink w:history="1" r:id="rIded-3zmhjrsn85knbeodus">
+      <w:hyperlink w:history="1" r:id="rIdv0rnjw0ic0krxqieowauo">
         <w:r>
           <w:rPr>
             <w:rStyle w:val="Hyperlink"/>
@@ -15847,7 +15847,7 @@
         </w:rPr>
         <w:t xml:space="preserve">6　</w:t>
       </w:r>
-      <w:hyperlink w:history="1" r:id="rIdy_gm1u6ehlif8fviet92i">
+      <w:hyperlink w:history="1" r:id="rIdingqivzpndf4gneycspqj">
         <w:r>
           <w:rPr>
             <w:rStyle w:val="Hyperlink"/>
@@ -15873,7 +15873,7 @@
         </w:rPr>
         <w:t xml:space="preserve">7　</w:t>
       </w:r>
-      <w:hyperlink w:history="1" r:id="rIdwjucru26j7hp_tik0kj2y">
+      <w:hyperlink w:history="1" r:id="rIdv5suzvlrvu-lqaoiotg-4">
         <w:r>
           <w:rPr>
             <w:rStyle w:val="Hyperlink"/>
@@ -15899,7 +15899,7 @@
         </w:rPr>
         <w:t xml:space="preserve">8　</w:t>
       </w:r>
-      <w:hyperlink w:history="1" r:id="rIdbooeykddlpmaetguk1mxu">
+      <w:hyperlink w:history="1" r:id="rId7sdhgy1m5l_sci4m4d6qz">
         <w:r>
           <w:rPr>
             <w:rStyle w:val="Hyperlink"/>
@@ -15925,7 +15925,7 @@
         </w:rPr>
         <w:t xml:space="preserve">9　</w:t>
       </w:r>
-      <w:hyperlink w:history="1" r:id="rId06sngc8xpjb3udqbqwvqr">
+      <w:hyperlink w:history="1" r:id="rIdvy-zsp0v7nklykmusesa2">
         <w:r>
           <w:rPr>
             <w:rStyle w:val="Hyperlink"/>
@@ -15951,7 +15951,7 @@
         </w:rPr>
         <w:t xml:space="preserve">10　</w:t>
       </w:r>
-      <w:hyperlink w:history="1" r:id="rIdvjf4uyr_lvihe2_lyya-5">
+      <w:hyperlink w:history="1" r:id="rIdcvrjlyfqovoavu70vangg">
         <w:r>
           <w:rPr>
             <w:rStyle w:val="Hyperlink"/>
@@ -15977,7 +15977,7 @@
         </w:rPr>
         <w:t xml:space="preserve">11　</w:t>
       </w:r>
-      <w:hyperlink w:history="1" r:id="rIdauckdmvp1inn4dy-fcs0y">
+      <w:hyperlink w:history="1" r:id="rIdh9bxjebrqllgzhzmf86eg">
         <w:r>
           <w:rPr>
             <w:rStyle w:val="Hyperlink"/>
@@ -16003,7 +16003,7 @@
         </w:rPr>
         <w:t xml:space="preserve">12　</w:t>
       </w:r>
-      <w:hyperlink w:history="1" r:id="rIdvdzeigegmpvamapchzkjg">
+      <w:hyperlink w:history="1" r:id="rId0mpgtfjjx3mgzc2belurw">
         <w:r>
           <w:rPr>
             <w:rStyle w:val="Hyperlink"/>
@@ -16029,7 +16029,7 @@
         </w:rPr>
         <w:t xml:space="preserve">13　</w:t>
       </w:r>
-      <w:hyperlink w:history="1" r:id="rIdicy_bdwh1yp6apf1rvvt2">
+      <w:hyperlink w:history="1" r:id="rIdoywryyr2tidf81wop_zt3">
         <w:r>
           <w:rPr>
             <w:rStyle w:val="Hyperlink"/>
@@ -16055,7 +16055,7 @@
         </w:rPr>
         <w:t xml:space="preserve">14　</w:t>
       </w:r>
-      <w:hyperlink w:history="1" r:id="rIdh-0tfvyyh17tmoggphvte">
+      <w:hyperlink w:history="1" r:id="rIddzbzzsydai08k4i_3p4p4">
         <w:r>
           <w:rPr>
             <w:rStyle w:val="Hyperlink"/>
@@ -16081,7 +16081,7 @@
         </w:rPr>
         <w:t xml:space="preserve">15, 18　</w:t>
       </w:r>
-      <w:hyperlink w:history="1" r:id="rIdcntjz6i4o4kyov5tr0dbh">
+      <w:hyperlink w:history="1" r:id="rIdsfgmjtps2v5r-pdxtjhsy">
         <w:r>
           <w:rPr>
             <w:rStyle w:val="Hyperlink"/>
@@ -16107,7 +16107,7 @@
         </w:rPr>
         <w:t xml:space="preserve">17　</w:t>
       </w:r>
-      <w:hyperlink w:history="1" r:id="rIdnrejkyx6mleikeokk0ibz">
+      <w:hyperlink w:history="1" r:id="rIda4myhfwqcbzgbd4noh9i0">
         <w:r>
           <w:rPr>
             <w:rStyle w:val="Hyperlink"/>
@@ -16133,7 +16133,7 @@
         </w:rPr>
         <w:t xml:space="preserve">19　</w:t>
       </w:r>
-      <w:hyperlink w:history="1" r:id="rIdnrruc4mb5bnoxgyh19ibu">
+      <w:hyperlink w:history="1" r:id="rId_ykjgzelalcst1yrjxjim">
         <w:r>
           <w:rPr>
             <w:rStyle w:val="Hyperlink"/>
@@ -16159,7 +16159,7 @@
         </w:rPr>
         <w:t xml:space="preserve">20　</w:t>
       </w:r>
-      <w:hyperlink w:history="1" r:id="rIdcogdv8ojvwctjex85jnmi">
+      <w:hyperlink w:history="1" r:id="rId5m5yindbvrr2skda_kbhu">
         <w:r>
           <w:rPr>
             <w:rStyle w:val="Hyperlink"/>
@@ -16185,7 +16185,7 @@
         </w:rPr>
         <w:t xml:space="preserve">21　</w:t>
       </w:r>
-      <w:hyperlink w:history="1" r:id="rIdrrs53tl5rhjderc9yhv9x">
+      <w:hyperlink w:history="1" r:id="rId4-5b-4b1ddyxhsb8za09r">
         <w:r>
           <w:rPr>
             <w:rStyle w:val="Hyperlink"/>
@@ -16575,7 +16575,7 @@
         </w:rPr>
         <w:t xml:space="preserve">1, 3　</w:t>
       </w:r>
-      <w:hyperlink w:history="1" r:id="rIdp1ii-67yfkgdzlnps-69f">
+      <w:hyperlink w:history="1" r:id="rIdebjevpasu5cg6vya1gjag">
         <w:r>
           <w:rPr>
             <w:rStyle w:val="Hyperlink"/>
@@ -16601,7 +16601,7 @@
         </w:rPr>
         <w:t xml:space="preserve">2　</w:t>
       </w:r>
-      <w:hyperlink w:history="1" r:id="rIdkxv7zeqscdedfvx5rsxcc">
+      <w:hyperlink w:history="1" r:id="rIdlu4vdqj2c0eewdxm7bacg">
         <w:r>
           <w:rPr>
             <w:rStyle w:val="Hyperlink"/>
@@ -16627,7 +16627,7 @@
         </w:rPr>
         <w:t xml:space="preserve">4　</w:t>
       </w:r>
-      <w:hyperlink w:history="1" r:id="rIdbgucypkjrv98kar7gl74u">
+      <w:hyperlink w:history="1" r:id="rIdksyuvjyrw2hwwvgpbo_g5">
         <w:r>
           <w:rPr>
             <w:rStyle w:val="Hyperlink"/>

</xml_diff>

<commit_message>
checklist QC: fix bad-citation (28 incl drift) + distorted-number (31) batches
bad-citation: g14 page -1->null (17 clauses), remove 4 spurious citations, add 5 missing covers-sources, add item18/item6 to covers where content present. 0 residual citation drift across 4 domains.

distorted-number (31): restore omitted obligations (action verbs, mechanisms, purposes), fix numbers/dates/terms verified against source quotes (e.g. 評分->評估準則, 中、小學概覽, 12月至1月, 2016及2018注資, 提早入讀較高班級), entity scope (學校管理委員會或校董會). sen[3] kept (role list already covers leadership).

QC_REVIEW.md: 62 resolved / 66 pending (all fabricated remaining). All docx regenerated + grep-verified.

Co-Authored-By: Claude Fable 5 <noreply@anthropic.com>
</commit_message>
<xml_diff>
--- a/dev/checklists/gifted/本校資優教育政策_學校版_DRAFT.docx
+++ b/dev/checklists/gifted/本校資優教育政策_學校版_DRAFT.docx
@@ -1213,7 +1213,7 @@
           <w:sz w:val="22"/>
           <w:szCs w:val="22"/>
         </w:rPr>
-        <w:t xml:space="preserve">本校根據校情特點、辦學理念、學校發展目標及學生需要，透過資優教育「三層架構推行模式」設計及推行合適的校本資優教育課程。課程設計須熟悉有關課程指引，掌握學科課程架構、宗旨及主導原則，並因應學生學習特質及需要、教師能力及專長、學校教育宗旨及可用資源，發展具本校特色的資優教育課程，內容涵蓋情意教育，以及對雙重特殊資優學生的培育及支援。</w:t>
+        <w:t xml:space="preserve">本校根據校情特點、辦學理念、學校發展目標及學生需要，透過資優教育「三層架構推行模式」設計及推行合適的校本資優教育課程。課程設計須熟悉有關課程指引，掌握學科課程架構、宗旨及主導原則，並因應學生學習特質及需要、教師能力及專長、學校教育宗旨及資源，發展具本校特色的資優教育課程，內容涵蓋情意教育，以及對雙重特殊資優學生的培育及支援。</w:t>
       </w:r>
       <w:r>
         <w:rPr>
@@ -2246,24 +2246,6 @@
         </w:rPr>
         <w:t xml:space="preserve">19</w:t>
       </w:r>
-      <w:r>
-        <w:rPr>
-          <w:rFonts w:ascii="Microsoft JhengHei" w:cs="Microsoft JhengHei" w:eastAsia="Microsoft JhengHei" w:hAnsi="Microsoft JhengHei"/>
-          <w:sz w:val="22"/>
-          <w:szCs w:val="22"/>
-        </w:rPr>
-        <w:t xml:space="preserve"> </w:t>
-      </w:r>
-      <w:r>
-        <w:rPr>
-          <w:rFonts w:ascii="Microsoft JhengHei" w:cs="Microsoft JhengHei" w:eastAsia="Microsoft JhengHei" w:hAnsi="Microsoft JhengHei"/>
-          <w:color w:val="1F4E36"/>
-          <w:sz w:val="16"/>
-          <w:szCs w:val="16"/>
-          <w:vertAlign w:val="superscript"/>
-        </w:rPr>
-        <w:t xml:space="preserve">20</w:t>
-      </w:r>
     </w:p>
     <w:p>
       <w:pPr>
@@ -2295,7 +2277,7 @@
         </w:rPr>
         <w:t xml:space="preserve">1　</w:t>
       </w:r>
-      <w:hyperlink w:history="1" r:id="rIdgvpp6p8rz1xfscdgtu9zr">
+      <w:hyperlink w:history="1" r:id="rIdfvuggv-ds4ja9ig0_ggsu">
         <w:r>
           <w:rPr>
             <w:rStyle w:val="Hyperlink"/>
@@ -2321,7 +2303,7 @@
         </w:rPr>
         <w:t xml:space="preserve">2　</w:t>
       </w:r>
-      <w:hyperlink w:history="1" r:id="rIdrjw8oca-lqwe6tm-ytb-y">
+      <w:hyperlink w:history="1" r:id="rIdqdzyysbthtyx-1urk0o27">
         <w:r>
           <w:rPr>
             <w:rStyle w:val="Hyperlink"/>
@@ -2347,7 +2329,7 @@
         </w:rPr>
         <w:t xml:space="preserve">3, 14　</w:t>
       </w:r>
-      <w:hyperlink w:history="1" r:id="rIducf8cknkgbf6439ubkv3h">
+      <w:hyperlink w:history="1" r:id="rId1sayp59txks2vu_s7nnsb">
         <w:r>
           <w:rPr>
             <w:rStyle w:val="Hyperlink"/>
@@ -2373,7 +2355,7 @@
         </w:rPr>
         <w:t xml:space="preserve">4　</w:t>
       </w:r>
-      <w:hyperlink w:history="1" r:id="rIdoxjpaza68zsqvpl1wfum3">
+      <w:hyperlink w:history="1" r:id="rIdpduhksulghnho6prowq0h">
         <w:r>
           <w:rPr>
             <w:rStyle w:val="Hyperlink"/>
@@ -2399,7 +2381,7 @@
         </w:rPr>
         <w:t xml:space="preserve">5　</w:t>
       </w:r>
-      <w:hyperlink w:history="1" r:id="rIdsshzv6kush1q4k3vvo0wy">
+      <w:hyperlink w:history="1" r:id="rIdnzgqowzychxyau5pxdn4p">
         <w:r>
           <w:rPr>
             <w:rStyle w:val="Hyperlink"/>
@@ -2425,7 +2407,7 @@
         </w:rPr>
         <w:t xml:space="preserve">6　</w:t>
       </w:r>
-      <w:hyperlink w:history="1" r:id="rIdjvjovscrdo7waqb1brolr">
+      <w:hyperlink w:history="1" r:id="rIdmaow-hucrdttb_i5styy5">
         <w:r>
           <w:rPr>
             <w:rStyle w:val="Hyperlink"/>
@@ -2449,9 +2431,9 @@
           <w:sz w:val="18"/>
           <w:szCs w:val="18"/>
         </w:rPr>
-        <w:t xml:space="preserve">7, 20　</w:t>
-      </w:r>
-      <w:hyperlink w:history="1" r:id="rIdbl9ju7ncou7ezfdu6bms-">
+        <w:t xml:space="preserve">7　</w:t>
+      </w:r>
+      <w:hyperlink w:history="1" r:id="rId7ne6u2id5f8zye1g6plme">
         <w:r>
           <w:rPr>
             <w:rStyle w:val="Hyperlink"/>
@@ -2477,7 +2459,7 @@
         </w:rPr>
         <w:t xml:space="preserve">8　</w:t>
       </w:r>
-      <w:hyperlink w:history="1" r:id="rIdqdcfacobkxrebvmc-_gtr">
+      <w:hyperlink w:history="1" r:id="rIduz8krsbt0mddya3ttarc2">
         <w:r>
           <w:rPr>
             <w:rStyle w:val="Hyperlink"/>
@@ -2503,7 +2485,7 @@
         </w:rPr>
         <w:t xml:space="preserve">9, 12　</w:t>
       </w:r>
-      <w:hyperlink w:history="1" r:id="rIdmivlrazbqcf9gpkzbk2_v">
+      <w:hyperlink w:history="1" r:id="rId47o4gbzyf8lregae9uop7">
         <w:r>
           <w:rPr>
             <w:rStyle w:val="Hyperlink"/>
@@ -2529,7 +2511,7 @@
         </w:rPr>
         <w:t xml:space="preserve">10　</w:t>
       </w:r>
-      <w:hyperlink w:history="1" r:id="rIdc6wwbzisvolrkapg-ygwz">
+      <w:hyperlink w:history="1" r:id="rIdgbkg9c9xfqohlamckgjsa">
         <w:r>
           <w:rPr>
             <w:rStyle w:val="Hyperlink"/>
@@ -2555,7 +2537,7 @@
         </w:rPr>
         <w:t xml:space="preserve">11　</w:t>
       </w:r>
-      <w:hyperlink w:history="1" r:id="rId4ypquwpdzo0klmkqdv0sa">
+      <w:hyperlink w:history="1" r:id="rIdvyrwjnk34mxffc_pysf6u">
         <w:r>
           <w:rPr>
             <w:rStyle w:val="Hyperlink"/>
@@ -2581,7 +2563,7 @@
         </w:rPr>
         <w:t xml:space="preserve">13　</w:t>
       </w:r>
-      <w:hyperlink w:history="1" r:id="rIdq6phsdumhmqql4x5nmfgc">
+      <w:hyperlink w:history="1" r:id="rIdkzzfn3b9tak-cvuw55x-x">
         <w:r>
           <w:rPr>
             <w:rStyle w:val="Hyperlink"/>
@@ -2607,7 +2589,7 @@
         </w:rPr>
         <w:t xml:space="preserve">15　</w:t>
       </w:r>
-      <w:hyperlink w:history="1" r:id="rIdmabivowirne18mzgwsxtk">
+      <w:hyperlink w:history="1" r:id="rId1dx1cxhb2yzz6bamchhyo">
         <w:r>
           <w:rPr>
             <w:rStyle w:val="Hyperlink"/>
@@ -2633,7 +2615,7 @@
         </w:rPr>
         <w:t xml:space="preserve">16　</w:t>
       </w:r>
-      <w:hyperlink w:history="1" r:id="rIdgqhmabsetc-ly_dlppife">
+      <w:hyperlink w:history="1" r:id="rIdguth164scehlnnwedc1y0">
         <w:r>
           <w:rPr>
             <w:rStyle w:val="Hyperlink"/>
@@ -2659,7 +2641,7 @@
         </w:rPr>
         <w:t xml:space="preserve">17　</w:t>
       </w:r>
-      <w:hyperlink w:history="1" r:id="rIdfffqx7p_lnsptlxomwgcv">
+      <w:hyperlink w:history="1" r:id="rId_cskuiue4b5r8gp6z8ms9">
         <w:r>
           <w:rPr>
             <w:rStyle w:val="Hyperlink"/>
@@ -2685,7 +2667,7 @@
         </w:rPr>
         <w:t xml:space="preserve">18　</w:t>
       </w:r>
-      <w:hyperlink w:history="1" r:id="rIdrrre60l-_dglyl1ebox3f">
+      <w:hyperlink w:history="1" r:id="rIdp_uov8b8ubcebfmp1bmuc">
         <w:r>
           <w:rPr>
             <w:rStyle w:val="Hyperlink"/>
@@ -2711,7 +2693,7 @@
         </w:rPr>
         <w:t xml:space="preserve">19　</w:t>
       </w:r>
-      <w:hyperlink w:history="1" r:id="rIdvyav9slwuwcr5q6nlulmg">
+      <w:hyperlink w:history="1" r:id="rIdlnombssczoo1s_ivp0jj5">
         <w:r>
           <w:rPr>
             <w:rStyle w:val="Hyperlink"/>
@@ -4759,7 +4741,7 @@
         </w:rPr>
         <w:t xml:space="preserve">1, 2, 4, 6, 14, 15, 16　</w:t>
       </w:r>
-      <w:hyperlink w:history="1" r:id="rIdwxzubjjlpkg4iht_5ytuw">
+      <w:hyperlink w:history="1" r:id="rIdh3dssbrnlbznkqmd7a81y">
         <w:r>
           <w:rPr>
             <w:rStyle w:val="Hyperlink"/>
@@ -4785,7 +4767,7 @@
         </w:rPr>
         <w:t xml:space="preserve">3　</w:t>
       </w:r>
-      <w:hyperlink w:history="1" r:id="rIdlxme9xtqktlmijlzbfdjf">
+      <w:hyperlink w:history="1" r:id="rIduq7pmqzhbe4esqrts5axf">
         <w:r>
           <w:rPr>
             <w:rStyle w:val="Hyperlink"/>
@@ -4811,7 +4793,7 @@
         </w:rPr>
         <w:t xml:space="preserve">5　</w:t>
       </w:r>
-      <w:hyperlink w:history="1" r:id="rIdcuxr_rb3bassonyubuzdc">
+      <w:hyperlink w:history="1" r:id="rIdcgu5ju2gwl_dbbejwc9jj">
         <w:r>
           <w:rPr>
             <w:rStyle w:val="Hyperlink"/>
@@ -4837,7 +4819,7 @@
         </w:rPr>
         <w:t xml:space="preserve">7　</w:t>
       </w:r>
-      <w:hyperlink w:history="1" r:id="rIdoagpk4spuxp07gkh-urdr">
+      <w:hyperlink w:history="1" r:id="rIdtyf0j1abgoek37xg9sed_">
         <w:r>
           <w:rPr>
             <w:rStyle w:val="Hyperlink"/>
@@ -4863,7 +4845,7 @@
         </w:rPr>
         <w:t xml:space="preserve">8, 11　</w:t>
       </w:r>
-      <w:hyperlink w:history="1" r:id="rIdp3lyyed9zjw3rcumkzfjd">
+      <w:hyperlink w:history="1" r:id="rIdthay2p9djfdcvxzkkbbqm">
         <w:r>
           <w:rPr>
             <w:rStyle w:val="Hyperlink"/>
@@ -4889,7 +4871,7 @@
         </w:rPr>
         <w:t xml:space="preserve">9　</w:t>
       </w:r>
-      <w:hyperlink w:history="1" r:id="rIdxx5y0ktfsnrazuaojhdtt">
+      <w:hyperlink w:history="1" r:id="rIdrkp_uuvzz1thqwz6vyao-">
         <w:r>
           <w:rPr>
             <w:rStyle w:val="Hyperlink"/>
@@ -4915,7 +4897,7 @@
         </w:rPr>
         <w:t xml:space="preserve">10　</w:t>
       </w:r>
-      <w:hyperlink w:history="1" r:id="rIdh6ztfdtfqumga85lvpvpx">
+      <w:hyperlink w:history="1" r:id="rId09q7da0f7restlr0p6y7p">
         <w:r>
           <w:rPr>
             <w:rStyle w:val="Hyperlink"/>
@@ -4941,7 +4923,7 @@
         </w:rPr>
         <w:t xml:space="preserve">12　</w:t>
       </w:r>
-      <w:hyperlink w:history="1" r:id="rIdsnwvvvoeu6dc_m849f7a0">
+      <w:hyperlink w:history="1" r:id="rIdqbey0pjk7xcbuux-wwm6m">
         <w:r>
           <w:rPr>
             <w:rStyle w:val="Hyperlink"/>
@@ -4967,7 +4949,7 @@
         </w:rPr>
         <w:t xml:space="preserve">13　</w:t>
       </w:r>
-      <w:hyperlink w:history="1" r:id="rIdyevigcz31pi-oyubvf3yl">
+      <w:hyperlink w:history="1" r:id="rIdk9phidbc8dkymvhmmvg6f">
         <w:r>
           <w:rPr>
             <w:rStyle w:val="Hyperlink"/>
@@ -4993,7 +4975,7 @@
         </w:rPr>
         <w:t xml:space="preserve">17　</w:t>
       </w:r>
-      <w:hyperlink w:history="1" r:id="rIdn8yjnbmsc0uefjf6kyvqb">
+      <w:hyperlink w:history="1" r:id="rId-mijavlpqodylm0vip7ys">
         <w:r>
           <w:rPr>
             <w:rStyle w:val="Hyperlink"/>
@@ -5019,7 +5001,7 @@
         </w:rPr>
         <w:t xml:space="preserve">18　</w:t>
       </w:r>
-      <w:hyperlink w:history="1" r:id="rIdd9f85oacsetagvgcpjazm">
+      <w:hyperlink w:history="1" r:id="rIdod79va6fd0rd-7jobnjih">
         <w:r>
           <w:rPr>
             <w:rStyle w:val="Hyperlink"/>
@@ -5045,7 +5027,7 @@
         </w:rPr>
         <w:t xml:space="preserve">19　</w:t>
       </w:r>
-      <w:hyperlink w:history="1" r:id="rIdbq-akfao36y2d6drqdp0d">
+      <w:hyperlink w:history="1" r:id="rId93rsa4c7qxfur3kr8dcb6">
         <w:r>
           <w:rPr>
             <w:rStyle w:val="Hyperlink"/>
@@ -5071,7 +5053,7 @@
         </w:rPr>
         <w:t xml:space="preserve">20　</w:t>
       </w:r>
-      <w:hyperlink w:history="1" r:id="rIduw-0h-1byzcxhh6aeyoy-">
+      <w:hyperlink w:history="1" r:id="rId8lcieuicvzdxlqkrtcww8">
         <w:r>
           <w:rPr>
             <w:rStyle w:val="Hyperlink"/>
@@ -5097,7 +5079,7 @@
         </w:rPr>
         <w:t xml:space="preserve">21　</w:t>
       </w:r>
-      <w:hyperlink w:history="1" r:id="rIdcloikzeoi5via8-r7exmv">
+      <w:hyperlink w:history="1" r:id="rIdt39cbexgymmxjcxhabwd2">
         <w:r>
           <w:rPr>
             <w:rStyle w:val="Hyperlink"/>
@@ -5300,6 +5282,24 @@
           <w:vertAlign w:val="superscript"/>
         </w:rPr>
         <w:t xml:space="preserve">8</w:t>
+      </w:r>
+      <w:r>
+        <w:rPr>
+          <w:rFonts w:ascii="Microsoft JhengHei" w:cs="Microsoft JhengHei" w:eastAsia="Microsoft JhengHei" w:hAnsi="Microsoft JhengHei"/>
+          <w:sz w:val="22"/>
+          <w:szCs w:val="22"/>
+        </w:rPr>
+        <w:t xml:space="preserve"> </w:t>
+      </w:r>
+      <w:r>
+        <w:rPr>
+          <w:rFonts w:ascii="Microsoft JhengHei" w:cs="Microsoft JhengHei" w:eastAsia="Microsoft JhengHei" w:hAnsi="Microsoft JhengHei"/>
+          <w:color w:val="1F4E36"/>
+          <w:sz w:val="16"/>
+          <w:szCs w:val="16"/>
+          <w:vertAlign w:val="superscript"/>
+        </w:rPr>
+        <w:t xml:space="preserve">9</w:t>
       </w:r>
     </w:p>
     <w:tbl>
@@ -5705,7 +5705,7 @@
           <w:szCs w:val="16"/>
           <w:vertAlign w:val="superscript"/>
         </w:rPr>
-        <w:t xml:space="preserve">9</w:t>
+        <w:t xml:space="preserve">10</w:t>
       </w:r>
     </w:p>
     <w:p>
@@ -5739,7 +5739,7 @@
           <w:szCs w:val="16"/>
           <w:vertAlign w:val="superscript"/>
         </w:rPr>
-        <w:t xml:space="preserve">10</w:t>
+        <w:t xml:space="preserve">11</w:t>
       </w:r>
       <w:r>
         <w:rPr>
@@ -5757,7 +5757,7 @@
           <w:szCs w:val="16"/>
           <w:vertAlign w:val="superscript"/>
         </w:rPr>
-        <w:t xml:space="preserve">11</w:t>
+        <w:t xml:space="preserve">12</w:t>
       </w:r>
       <w:r>
         <w:rPr>
@@ -5775,7 +5775,7 @@
           <w:szCs w:val="16"/>
           <w:vertAlign w:val="superscript"/>
         </w:rPr>
-        <w:t xml:space="preserve">12</w:t>
+        <w:t xml:space="preserve">13</w:t>
       </w:r>
     </w:p>
     <w:p>
@@ -5826,7 +5826,7 @@
           <w:szCs w:val="16"/>
           <w:vertAlign w:val="superscript"/>
         </w:rPr>
-        <w:t xml:space="preserve">13</w:t>
+        <w:t xml:space="preserve">14</w:t>
       </w:r>
       <w:r>
         <w:rPr>
@@ -5844,7 +5844,25 @@
           <w:szCs w:val="16"/>
           <w:vertAlign w:val="superscript"/>
         </w:rPr>
-        <w:t xml:space="preserve">14</w:t>
+        <w:t xml:space="preserve">15</w:t>
+      </w:r>
+      <w:r>
+        <w:rPr>
+          <w:rFonts w:ascii="Microsoft JhengHei" w:cs="Microsoft JhengHei" w:eastAsia="Microsoft JhengHei" w:hAnsi="Microsoft JhengHei"/>
+          <w:sz w:val="22"/>
+          <w:szCs w:val="22"/>
+        </w:rPr>
+        <w:t xml:space="preserve"> </w:t>
+      </w:r>
+      <w:r>
+        <w:rPr>
+          <w:rFonts w:ascii="Microsoft JhengHei" w:cs="Microsoft JhengHei" w:eastAsia="Microsoft JhengHei" w:hAnsi="Microsoft JhengHei"/>
+          <w:color w:val="1F4E36"/>
+          <w:sz w:val="16"/>
+          <w:szCs w:val="16"/>
+          <w:vertAlign w:val="superscript"/>
+        </w:rPr>
+        <w:t xml:space="preserve">16</w:t>
       </w:r>
     </w:p>
     <w:p>
@@ -5878,7 +5896,7 @@
           <w:szCs w:val="16"/>
           <w:vertAlign w:val="superscript"/>
         </w:rPr>
-        <w:t xml:space="preserve">15</w:t>
+        <w:t xml:space="preserve">17</w:t>
       </w:r>
       <w:r>
         <w:rPr>
@@ -5896,7 +5914,7 @@
           <w:szCs w:val="16"/>
           <w:vertAlign w:val="superscript"/>
         </w:rPr>
-        <w:t xml:space="preserve">16</w:t>
+        <w:t xml:space="preserve">18</w:t>
       </w:r>
       <w:r>
         <w:rPr>
@@ -5914,7 +5932,7 @@
           <w:szCs w:val="16"/>
           <w:vertAlign w:val="superscript"/>
         </w:rPr>
-        <w:t xml:space="preserve">17</w:t>
+        <w:t xml:space="preserve">19</w:t>
       </w:r>
     </w:p>
     <w:p>
@@ -5982,7 +6000,7 @@
           <w:szCs w:val="16"/>
           <w:vertAlign w:val="superscript"/>
         </w:rPr>
-        <w:t xml:space="preserve">18</w:t>
+        <w:t xml:space="preserve">20</w:t>
       </w:r>
       <w:r>
         <w:rPr>
@@ -6000,7 +6018,7 @@
           <w:szCs w:val="16"/>
           <w:vertAlign w:val="superscript"/>
         </w:rPr>
-        <w:t xml:space="preserve">19</w:t>
+        <w:t xml:space="preserve">21</w:t>
       </w:r>
     </w:p>
     <w:p>
@@ -6034,7 +6052,7 @@
           <w:szCs w:val="16"/>
           <w:vertAlign w:val="superscript"/>
         </w:rPr>
-        <w:t xml:space="preserve">20</w:t>
+        <w:t xml:space="preserve">22</w:t>
       </w:r>
       <w:r>
         <w:rPr>
@@ -6052,7 +6070,7 @@
           <w:szCs w:val="16"/>
           <w:vertAlign w:val="superscript"/>
         </w:rPr>
-        <w:t xml:space="preserve">21</w:t>
+        <w:t xml:space="preserve">23</w:t>
       </w:r>
     </w:p>
     <w:p>
@@ -6086,7 +6104,7 @@
           <w:szCs w:val="16"/>
           <w:vertAlign w:val="superscript"/>
         </w:rPr>
-        <w:t xml:space="preserve">22</w:t>
+        <w:t xml:space="preserve">24</w:t>
       </w:r>
       <w:r>
         <w:rPr>
@@ -6104,7 +6122,7 @@
           <w:szCs w:val="16"/>
           <w:vertAlign w:val="superscript"/>
         </w:rPr>
-        <w:t xml:space="preserve">23</w:t>
+        <w:t xml:space="preserve">25</w:t>
       </w:r>
       <w:r>
         <w:rPr>
@@ -6122,7 +6140,7 @@
           <w:szCs w:val="16"/>
           <w:vertAlign w:val="superscript"/>
         </w:rPr>
-        <w:t xml:space="preserve">24</w:t>
+        <w:t xml:space="preserve">26</w:t>
       </w:r>
       <w:r>
         <w:rPr>
@@ -6140,7 +6158,7 @@
           <w:szCs w:val="16"/>
           <w:vertAlign w:val="superscript"/>
         </w:rPr>
-        <w:t xml:space="preserve">25</w:t>
+        <w:t xml:space="preserve">27</w:t>
       </w:r>
       <w:r>
         <w:rPr>
@@ -6158,7 +6176,25 @@
           <w:szCs w:val="16"/>
           <w:vertAlign w:val="superscript"/>
         </w:rPr>
-        <w:t xml:space="preserve">26</w:t>
+        <w:t xml:space="preserve">28</w:t>
+      </w:r>
+      <w:r>
+        <w:rPr>
+          <w:rFonts w:ascii="Microsoft JhengHei" w:cs="Microsoft JhengHei" w:eastAsia="Microsoft JhengHei" w:hAnsi="Microsoft JhengHei"/>
+          <w:sz w:val="22"/>
+          <w:szCs w:val="22"/>
+        </w:rPr>
+        <w:t xml:space="preserve"> </w:t>
+      </w:r>
+      <w:r>
+        <w:rPr>
+          <w:rFonts w:ascii="Microsoft JhengHei" w:cs="Microsoft JhengHei" w:eastAsia="Microsoft JhengHei" w:hAnsi="Microsoft JhengHei"/>
+          <w:color w:val="1F4E36"/>
+          <w:sz w:val="16"/>
+          <w:szCs w:val="16"/>
+          <w:vertAlign w:val="superscript"/>
+        </w:rPr>
+        <w:t xml:space="preserve">29</w:t>
       </w:r>
     </w:p>
     <w:p>
@@ -6199,17 +6235,17 @@
           <w:sz w:val="22"/>
           <w:szCs w:val="22"/>
         </w:rPr>
-        <w:t xml:space="preserve">」等），以記錄學生的資優特質；本校可按校情自行訂定切合需要的校本識別標籤。系統已預設兩類報告，本校可從宏觀（全校層面）和微觀（個別學生層面）角度規劃資優教育發展和支援工作。</w:t>
-      </w:r>
-      <w:r>
-        <w:rPr>
-          <w:rFonts w:ascii="Microsoft JhengHei" w:cs="Microsoft JhengHei" w:eastAsia="Microsoft JhengHei" w:hAnsi="Microsoft JhengHei"/>
-          <w:color w:val="1F4E36"/>
-          <w:sz w:val="16"/>
-          <w:szCs w:val="16"/>
-          <w:vertAlign w:val="superscript"/>
-        </w:rPr>
-        <w:t xml:space="preserve">27</w:t>
+        <w:t xml:space="preserve">」等），以記錄學生的資優特質；本校可按校情自行訂定切合需要的校本識別標籤。系統已預設兩類報告（依學生報告一、依識別標籤報告二），本校可從宏觀（全校層面）和微觀（個別學生層面）角度規劃資優教育發展和支援工作。</w:t>
+      </w:r>
+      <w:r>
+        <w:rPr>
+          <w:rFonts w:ascii="Microsoft JhengHei" w:cs="Microsoft JhengHei" w:eastAsia="Microsoft JhengHei" w:hAnsi="Microsoft JhengHei"/>
+          <w:color w:val="1F4E36"/>
+          <w:sz w:val="16"/>
+          <w:szCs w:val="16"/>
+          <w:vertAlign w:val="superscript"/>
+        </w:rPr>
+        <w:t xml:space="preserve">30</w:t>
       </w:r>
       <w:r>
         <w:rPr>
@@ -6227,7 +6263,7 @@
           <w:szCs w:val="16"/>
           <w:vertAlign w:val="superscript"/>
         </w:rPr>
-        <w:t xml:space="preserve">28</w:t>
+        <w:t xml:space="preserve">31</w:t>
       </w:r>
       <w:r>
         <w:rPr>
@@ -6245,7 +6281,7 @@
           <w:szCs w:val="16"/>
           <w:vertAlign w:val="superscript"/>
         </w:rPr>
-        <w:t xml:space="preserve">29</w:t>
+        <w:t xml:space="preserve">32</w:t>
       </w:r>
     </w:p>
     <w:p>
@@ -6279,7 +6315,7 @@
           <w:szCs w:val="16"/>
           <w:vertAlign w:val="superscript"/>
         </w:rPr>
-        <w:t xml:space="preserve">30</w:t>
+        <w:t xml:space="preserve">33</w:t>
       </w:r>
       <w:r>
         <w:rPr>
@@ -6297,7 +6333,7 @@
           <w:szCs w:val="16"/>
           <w:vertAlign w:val="superscript"/>
         </w:rPr>
-        <w:t xml:space="preserve">31</w:t>
+        <w:t xml:space="preserve">34</w:t>
       </w:r>
     </w:p>
     <w:p>
@@ -6331,7 +6367,7 @@
           <w:szCs w:val="16"/>
           <w:vertAlign w:val="superscript"/>
         </w:rPr>
-        <w:t xml:space="preserve">32</w:t>
+        <w:t xml:space="preserve">35</w:t>
       </w:r>
       <w:r>
         <w:rPr>
@@ -6349,7 +6385,7 @@
           <w:szCs w:val="16"/>
           <w:vertAlign w:val="superscript"/>
         </w:rPr>
-        <w:t xml:space="preserve">33</w:t>
+        <w:t xml:space="preserve">36</w:t>
       </w:r>
       <w:r>
         <w:rPr>
@@ -6367,7 +6403,7 @@
           <w:szCs w:val="16"/>
           <w:vertAlign w:val="superscript"/>
         </w:rPr>
-        <w:t xml:space="preserve">34</w:t>
+        <w:t xml:space="preserve">37</w:t>
       </w:r>
       <w:r>
         <w:rPr>
@@ -6385,7 +6421,7 @@
           <w:szCs w:val="16"/>
           <w:vertAlign w:val="superscript"/>
         </w:rPr>
-        <w:t xml:space="preserve">35</w:t>
+        <w:t xml:space="preserve">38</w:t>
       </w:r>
     </w:p>
     <w:p>
@@ -6453,7 +6489,7 @@
           <w:szCs w:val="16"/>
           <w:vertAlign w:val="superscript"/>
         </w:rPr>
-        <w:t xml:space="preserve">36</w:t>
+        <w:t xml:space="preserve">39</w:t>
       </w:r>
       <w:r>
         <w:rPr>
@@ -6471,7 +6507,7 @@
           <w:szCs w:val="16"/>
           <w:vertAlign w:val="superscript"/>
         </w:rPr>
-        <w:t xml:space="preserve">37</w:t>
+        <w:t xml:space="preserve">40</w:t>
       </w:r>
       <w:r>
         <w:rPr>
@@ -6489,7 +6525,7 @@
           <w:szCs w:val="16"/>
           <w:vertAlign w:val="superscript"/>
         </w:rPr>
-        <w:t xml:space="preserve">38</w:t>
+        <w:t xml:space="preserve">41</w:t>
       </w:r>
     </w:p>
     <w:p>
@@ -6523,7 +6559,7 @@
           <w:szCs w:val="16"/>
           <w:vertAlign w:val="superscript"/>
         </w:rPr>
-        <w:t xml:space="preserve">39</w:t>
+        <w:t xml:space="preserve">42</w:t>
       </w:r>
     </w:p>
     <w:p>
@@ -6557,7 +6593,7 @@
           <w:szCs w:val="16"/>
           <w:vertAlign w:val="superscript"/>
         </w:rPr>
-        <w:t xml:space="preserve">40</w:t>
+        <w:t xml:space="preserve">43</w:t>
       </w:r>
       <w:r>
         <w:rPr>
@@ -6575,7 +6611,7 @@
           <w:szCs w:val="16"/>
           <w:vertAlign w:val="superscript"/>
         </w:rPr>
-        <w:t xml:space="preserve">41</w:t>
+        <w:t xml:space="preserve">44</w:t>
       </w:r>
       <w:r>
         <w:rPr>
@@ -6593,7 +6629,7 @@
           <w:szCs w:val="16"/>
           <w:vertAlign w:val="superscript"/>
         </w:rPr>
-        <w:t xml:space="preserve">42</w:t>
+        <w:t xml:space="preserve">45</w:t>
       </w:r>
     </w:p>
     <w:tbl>
@@ -7052,9 +7088,9 @@
           <w:sz w:val="18"/>
           <w:szCs w:val="18"/>
         </w:rPr>
-        <w:t xml:space="preserve">1, 4, 11　</w:t>
-      </w:r>
-      <w:hyperlink w:history="1" r:id="rIdxwa0iujo_dndc9tatxx3r">
+        <w:t xml:space="preserve">1, 4, 12　</w:t>
+      </w:r>
+      <w:hyperlink w:history="1" r:id="rIdeyqdmgwmzz2ch7qsglmx4">
         <w:r>
           <w:rPr>
             <w:rStyle w:val="Hyperlink"/>
@@ -7078,9 +7114,9 @@
           <w:sz w:val="18"/>
           <w:szCs w:val="18"/>
         </w:rPr>
-        <w:t xml:space="preserve">2, 7, 12, 40　</w:t>
-      </w:r>
-      <w:hyperlink w:history="1" r:id="rIdysl2ossd2i3qimaxwt29c">
+        <w:t xml:space="preserve">2, 7, 13, 43　</w:t>
+      </w:r>
+      <w:hyperlink w:history="1" r:id="rIdgllsefbtgpewth9nnfw23">
         <w:r>
           <w:rPr>
             <w:rStyle w:val="Hyperlink"/>
@@ -7106,7 +7142,7 @@
         </w:rPr>
         <w:t xml:space="preserve">3　</w:t>
       </w:r>
-      <w:hyperlink w:history="1" r:id="rId01rtknsfltew3umx3epq6">
+      <w:hyperlink w:history="1" r:id="rId4zj2ovlbu3lal-5q-ggkh">
         <w:r>
           <w:rPr>
             <w:rStyle w:val="Hyperlink"/>
@@ -7132,7 +7168,7 @@
         </w:rPr>
         <w:t xml:space="preserve">5　</w:t>
       </w:r>
-      <w:hyperlink w:history="1" r:id="rIdzegnnyaki_cea8goqwejl">
+      <w:hyperlink w:history="1" r:id="rIda_tqdrgf5iz27lqbl7wwo">
         <w:r>
           <w:rPr>
             <w:rStyle w:val="Hyperlink"/>
@@ -7158,7 +7194,7 @@
         </w:rPr>
         <w:t xml:space="preserve">6　</w:t>
       </w:r>
-      <w:hyperlink w:history="1" r:id="rIdrzcyue4p0ciek30tm6ebf">
+      <w:hyperlink w:history="1" r:id="rIdgfgx0c3xp68t-osjx8dli">
         <w:r>
           <w:rPr>
             <w:rStyle w:val="Hyperlink"/>
@@ -7182,9 +7218,9 @@
           <w:sz w:val="18"/>
           <w:szCs w:val="18"/>
         </w:rPr>
-        <w:t xml:space="preserve">8, 22　</w:t>
-      </w:r>
-      <w:hyperlink w:history="1" r:id="rId690syriduu47jzwzqezcc">
+        <w:t xml:space="preserve">8, 24　</w:t>
+      </w:r>
+      <w:hyperlink w:history="1" r:id="rIdcjkqv7njeua_s_4kdhwwq">
         <w:r>
           <w:rPr>
             <w:rStyle w:val="Hyperlink"/>
@@ -7208,9 +7244,35 @@
           <w:sz w:val="18"/>
           <w:szCs w:val="18"/>
         </w:rPr>
-        <w:t xml:space="preserve">9　</w:t>
-      </w:r>
-      <w:hyperlink w:history="1" r:id="rIdy71vfameor-yfa_i-_gbg">
+        <w:t xml:space="preserve">9, 26　</w:t>
+      </w:r>
+      <w:hyperlink w:history="1" r:id="rIdne91u-eawljeiylxqkisx">
+        <w:r>
+          <w:rPr>
+            <w:rStyle w:val="Hyperlink"/>
+            <w:rFonts w:ascii="Microsoft JhengHei" w:cs="Microsoft JhengHei" w:eastAsia="Microsoft JhengHei" w:hAnsi="Microsoft JhengHei"/>
+            <w:sz w:val="18"/>
+            <w:szCs w:val="18"/>
+          </w:rPr>
+          <w:t xml:space="preserve">《資優教育系列：全民資優教育＋校本學生才能庫＋學術英才教育單元》第 1 頁</w:t>
+        </w:r>
+      </w:hyperlink>
+    </w:p>
+    <w:p>
+      <w:pPr>
+        <w:spacing w:after="20"/>
+        <w:ind w:left="420" w:hanging="420"/>
+      </w:pPr>
+      <w:r>
+        <w:rPr>
+          <w:rFonts w:ascii="Microsoft JhengHei" w:cs="Microsoft JhengHei" w:eastAsia="Microsoft JhengHei" w:hAnsi="Microsoft JhengHei"/>
+          <w:color w:val="555555"/>
+          <w:sz w:val="18"/>
+          <w:szCs w:val="18"/>
+        </w:rPr>
+        <w:t xml:space="preserve">10　</w:t>
+      </w:r>
+      <w:hyperlink w:history="1" r:id="rId81ngizg-zdgmvupqkweux">
         <w:r>
           <w:rPr>
             <w:rStyle w:val="Hyperlink"/>
@@ -7234,9 +7296,9 @@
           <w:sz w:val="18"/>
           <w:szCs w:val="18"/>
         </w:rPr>
-        <w:t xml:space="preserve">10　</w:t>
-      </w:r>
-      <w:hyperlink w:history="1" r:id="rIdfezoeamqb5qcf0psdzrqe">
+        <w:t xml:space="preserve">11　</w:t>
+      </w:r>
+      <w:hyperlink w:history="1" r:id="rIdvqtjcr6wozyb_zxl5mwla">
         <w:r>
           <w:rPr>
             <w:rStyle w:val="Hyperlink"/>
@@ -7260,9 +7322,9 @@
           <w:sz w:val="18"/>
           <w:szCs w:val="18"/>
         </w:rPr>
-        <w:t xml:space="preserve">13　</w:t>
-      </w:r>
-      <w:hyperlink w:history="1" r:id="rIde4hsmlzit3ijonb7jetcm">
+        <w:t xml:space="preserve">14　</w:t>
+      </w:r>
+      <w:hyperlink w:history="1" r:id="rIdkm5y0t_r4feps7b16ky0x">
         <w:r>
           <w:rPr>
             <w:rStyle w:val="Hyperlink"/>
@@ -7286,9 +7348,9 @@
           <w:sz w:val="18"/>
           <w:szCs w:val="18"/>
         </w:rPr>
-        <w:t xml:space="preserve">14　</w:t>
-      </w:r>
-      <w:hyperlink w:history="1" r:id="rIdkx8gylonjdh1rgpantuqn">
+        <w:t xml:space="preserve">15　</w:t>
+      </w:r>
+      <w:hyperlink w:history="1" r:id="rIdb2q4ivptg3sdf8u7tgkwd">
         <w:r>
           <w:rPr>
             <w:rStyle w:val="Hyperlink"/>
@@ -7312,9 +7374,35 @@
           <w:sz w:val="18"/>
           <w:szCs w:val="18"/>
         </w:rPr>
-        <w:t xml:space="preserve">15, 18　</w:t>
-      </w:r>
-      <w:hyperlink w:history="1" r:id="rIdzxnu4ds559avu8q7vy6dw">
+        <w:t xml:space="preserve">16, 27, 32　</w:t>
+      </w:r>
+      <w:hyperlink w:history="1" r:id="rIdfown4itex43far2xvcfp_">
+        <w:r>
+          <w:rPr>
+            <w:rStyle w:val="Hyperlink"/>
+            <w:rFonts w:ascii="Microsoft JhengHei" w:cs="Microsoft JhengHei" w:eastAsia="Microsoft JhengHei" w:hAnsi="Microsoft JhengHei"/>
+            <w:sz w:val="18"/>
+            <w:szCs w:val="18"/>
+          </w:rPr>
+          <w:t xml:space="preserve">《資優教育系列：全民資優教育＋校本學生才能庫＋學術英才教育單元》第 2 頁</w:t>
+        </w:r>
+      </w:hyperlink>
+    </w:p>
+    <w:p>
+      <w:pPr>
+        <w:spacing w:after="20"/>
+        <w:ind w:left="420" w:hanging="420"/>
+      </w:pPr>
+      <w:r>
+        <w:rPr>
+          <w:rFonts w:ascii="Microsoft JhengHei" w:cs="Microsoft JhengHei" w:eastAsia="Microsoft JhengHei" w:hAnsi="Microsoft JhengHei"/>
+          <w:color w:val="555555"/>
+          <w:sz w:val="18"/>
+          <w:szCs w:val="18"/>
+        </w:rPr>
+        <w:t xml:space="preserve">17, 20　</w:t>
+      </w:r>
+      <w:hyperlink w:history="1" r:id="rIdb-eqbsnpjzmlfdush88yo">
         <w:r>
           <w:rPr>
             <w:rStyle w:val="Hyperlink"/>
@@ -7338,9 +7426,9 @@
           <w:sz w:val="18"/>
           <w:szCs w:val="18"/>
         </w:rPr>
-        <w:t xml:space="preserve">16, 19, 32, 38, 39　</w:t>
-      </w:r>
-      <w:hyperlink w:history="1" r:id="rIdiggpn3ow-ayuw-z8gwyoh">
+        <w:t xml:space="preserve">18, 21, 35, 41, 42　</w:t>
+      </w:r>
+      <w:hyperlink w:history="1" r:id="rIdykptndoy5gcgath3jymti">
         <w:r>
           <w:rPr>
             <w:rStyle w:val="Hyperlink"/>
@@ -7364,9 +7452,9 @@
           <w:sz w:val="18"/>
           <w:szCs w:val="18"/>
         </w:rPr>
-        <w:t xml:space="preserve">17　</w:t>
-      </w:r>
-      <w:hyperlink w:history="1" r:id="rIdx9zuqglsekdkbtmvk2l-k">
+        <w:t xml:space="preserve">19　</w:t>
+      </w:r>
+      <w:hyperlink w:history="1" r:id="rIdcbq9t1cxgfhleii4iilp5">
         <w:r>
           <w:rPr>
             <w:rStyle w:val="Hyperlink"/>
@@ -7390,9 +7478,9 @@
           <w:sz w:val="18"/>
           <w:szCs w:val="18"/>
         </w:rPr>
-        <w:t xml:space="preserve">20　</w:t>
-      </w:r>
-      <w:hyperlink w:history="1" r:id="rIdwt7az8kqt9gvpzu22dm2f">
+        <w:t xml:space="preserve">22　</w:t>
+      </w:r>
+      <w:hyperlink w:history="1" r:id="rIdkqtwqfgcz2zk6me7xra4j">
         <w:r>
           <w:rPr>
             <w:rStyle w:val="Hyperlink"/>
@@ -7416,9 +7504,9 @@
           <w:sz w:val="18"/>
           <w:szCs w:val="18"/>
         </w:rPr>
-        <w:t xml:space="preserve">21　</w:t>
-      </w:r>
-      <w:hyperlink w:history="1" r:id="rIdyg9wb22lh98qxgfc0o1iy">
+        <w:t xml:space="preserve">23　</w:t>
+      </w:r>
+      <w:hyperlink w:history="1" r:id="rIdz1ipoehq7m5tqvrwzevq_">
         <w:r>
           <w:rPr>
             <w:rStyle w:val="Hyperlink"/>
@@ -7442,9 +7530,9 @@
           <w:sz w:val="18"/>
           <w:szCs w:val="18"/>
         </w:rPr>
-        <w:t xml:space="preserve">23　</w:t>
-      </w:r>
-      <w:hyperlink w:history="1" r:id="rIdd9pvmxo55wfatum7veyn0">
+        <w:t xml:space="preserve">25　</w:t>
+      </w:r>
+      <w:hyperlink w:history="1" r:id="rId7howkkj6dxrxxsvafuuvb">
         <w:r>
           <w:rPr>
             <w:rStyle w:val="Hyperlink"/>
@@ -7468,61 +7556,9 @@
           <w:sz w:val="18"/>
           <w:szCs w:val="18"/>
         </w:rPr>
-        <w:t xml:space="preserve">24　</w:t>
-      </w:r>
-      <w:hyperlink w:history="1" r:id="rId_b_nxwinxjcpoaj6yq8wq">
-        <w:r>
-          <w:rPr>
-            <w:rStyle w:val="Hyperlink"/>
-            <w:rFonts w:ascii="Microsoft JhengHei" w:cs="Microsoft JhengHei" w:eastAsia="Microsoft JhengHei" w:hAnsi="Microsoft JhengHei"/>
-            <w:sz w:val="18"/>
-            <w:szCs w:val="18"/>
-          </w:rPr>
-          <w:t xml:space="preserve">《資優教育系列：全民資優教育＋校本學生才能庫＋學術英才教育單元》第 1 頁</w:t>
-        </w:r>
-      </w:hyperlink>
-    </w:p>
-    <w:p>
-      <w:pPr>
-        <w:spacing w:after="20"/>
-        <w:ind w:left="420" w:hanging="420"/>
-      </w:pPr>
-      <w:r>
-        <w:rPr>
-          <w:rFonts w:ascii="Microsoft JhengHei" w:cs="Microsoft JhengHei" w:eastAsia="Microsoft JhengHei" w:hAnsi="Microsoft JhengHei"/>
-          <w:color w:val="555555"/>
-          <w:sz w:val="18"/>
-          <w:szCs w:val="18"/>
-        </w:rPr>
-        <w:t xml:space="preserve">25, 29　</w:t>
-      </w:r>
-      <w:hyperlink w:history="1" r:id="rIdxza3w1o5f6p5lvm3cpwsb">
-        <w:r>
-          <w:rPr>
-            <w:rStyle w:val="Hyperlink"/>
-            <w:rFonts w:ascii="Microsoft JhengHei" w:cs="Microsoft JhengHei" w:eastAsia="Microsoft JhengHei" w:hAnsi="Microsoft JhengHei"/>
-            <w:sz w:val="18"/>
-            <w:szCs w:val="18"/>
-          </w:rPr>
-          <w:t xml:space="preserve">《資優教育系列：全民資優教育＋校本學生才能庫＋學術英才教育單元》第 2 頁</w:t>
-        </w:r>
-      </w:hyperlink>
-    </w:p>
-    <w:p>
-      <w:pPr>
-        <w:spacing w:after="20"/>
-        <w:ind w:left="420" w:hanging="420"/>
-      </w:pPr>
-      <w:r>
-        <w:rPr>
-          <w:rFonts w:ascii="Microsoft JhengHei" w:cs="Microsoft JhengHei" w:eastAsia="Microsoft JhengHei" w:hAnsi="Microsoft JhengHei"/>
-          <w:color w:val="555555"/>
-          <w:sz w:val="18"/>
-          <w:szCs w:val="18"/>
-        </w:rPr>
-        <w:t xml:space="preserve">26　</w:t>
-      </w:r>
-      <w:hyperlink w:history="1" r:id="rIdlx-j5eobc5aywwcgq6_-o">
+        <w:t xml:space="preserve">28　</w:t>
+      </w:r>
+      <w:hyperlink w:history="1" r:id="rIdcoo0hot6fij7b5s8zd_4m">
         <w:r>
           <w:rPr>
             <w:rStyle w:val="Hyperlink"/>
@@ -7546,9 +7582,35 @@
           <w:sz w:val="18"/>
           <w:szCs w:val="18"/>
         </w:rPr>
-        <w:t xml:space="preserve">27　</w:t>
-      </w:r>
-      <w:hyperlink w:history="1" r:id="rIdea_fpbefohlg_pnf2p028">
+        <w:t xml:space="preserve">29　</w:t>
+      </w:r>
+      <w:hyperlink w:history="1" r:id="rIdziyqlexbwjqq2cuwfnqaf">
+        <w:r>
+          <w:rPr>
+            <w:rStyle w:val="Hyperlink"/>
+            <w:rFonts w:ascii="Microsoft JhengHei" w:cs="Microsoft JhengHei" w:eastAsia="Microsoft JhengHei" w:hAnsi="Microsoft JhengHei"/>
+            <w:sz w:val="18"/>
+            <w:szCs w:val="18"/>
+          </w:rPr>
+          <w:t xml:space="preserve">《校本資優教育資源套（2024）》第 7 頁</w:t>
+        </w:r>
+      </w:hyperlink>
+    </w:p>
+    <w:p>
+      <w:pPr>
+        <w:spacing w:after="20"/>
+        <w:ind w:left="420" w:hanging="420"/>
+      </w:pPr>
+      <w:r>
+        <w:rPr>
+          <w:rFonts w:ascii="Microsoft JhengHei" w:cs="Microsoft JhengHei" w:eastAsia="Microsoft JhengHei" w:hAnsi="Microsoft JhengHei"/>
+          <w:color w:val="555555"/>
+          <w:sz w:val="18"/>
+          <w:szCs w:val="18"/>
+        </w:rPr>
+        <w:t xml:space="preserve">30　</w:t>
+      </w:r>
+      <w:hyperlink w:history="1" r:id="rIdcu3wz0pmvwfb73uezujms">
         <w:r>
           <w:rPr>
             <w:rStyle w:val="Hyperlink"/>
@@ -7572,9 +7634,9 @@
           <w:sz w:val="18"/>
           <w:szCs w:val="18"/>
         </w:rPr>
-        <w:t xml:space="preserve">28　</w:t>
-      </w:r>
-      <w:hyperlink w:history="1" r:id="rId9sxn8kicxm71hdvstqysi">
+        <w:t xml:space="preserve">31　</w:t>
+      </w:r>
+      <w:hyperlink w:history="1" r:id="rIdtouacc1sarj_ivttszuto">
         <w:r>
           <w:rPr>
             <w:rStyle w:val="Hyperlink"/>
@@ -7598,9 +7660,9 @@
           <w:sz w:val="18"/>
           <w:szCs w:val="18"/>
         </w:rPr>
-        <w:t xml:space="preserve">30　</w:t>
-      </w:r>
-      <w:hyperlink w:history="1" r:id="rIdfbv7lfzfb81xg06bv2ise">
+        <w:t xml:space="preserve">33　</w:t>
+      </w:r>
+      <w:hyperlink w:history="1" r:id="rIdjhoca58kyi168fzqywksq">
         <w:r>
           <w:rPr>
             <w:rStyle w:val="Hyperlink"/>
@@ -7624,9 +7686,9 @@
           <w:sz w:val="18"/>
           <w:szCs w:val="18"/>
         </w:rPr>
-        <w:t xml:space="preserve">31　</w:t>
-      </w:r>
-      <w:hyperlink w:history="1" r:id="rIdlo4n_i1kdtbhouofubr9l">
+        <w:t xml:space="preserve">34　</w:t>
+      </w:r>
+      <w:hyperlink w:history="1" r:id="rIdg4iwbzq5ybxceegt41oi4">
         <w:r>
           <w:rPr>
             <w:rStyle w:val="Hyperlink"/>
@@ -7650,9 +7712,9 @@
           <w:sz w:val="18"/>
           <w:szCs w:val="18"/>
         </w:rPr>
-        <w:t xml:space="preserve">33, 37　</w:t>
-      </w:r>
-      <w:hyperlink w:history="1" r:id="rId6zmpxl1fydppdu8dkppet">
+        <w:t xml:space="preserve">36, 40　</w:t>
+      </w:r>
+      <w:hyperlink w:history="1" r:id="rIdyxj3pgrukd_1msisctqqc">
         <w:r>
           <w:rPr>
             <w:rStyle w:val="Hyperlink"/>
@@ -7676,9 +7738,9 @@
           <w:sz w:val="18"/>
           <w:szCs w:val="18"/>
         </w:rPr>
-        <w:t xml:space="preserve">34　</w:t>
-      </w:r>
-      <w:hyperlink w:history="1" r:id="rIdfd28y5orpfn5pbqt9ew_q">
+        <w:t xml:space="preserve">37　</w:t>
+      </w:r>
+      <w:hyperlink w:history="1" r:id="rIdqtelvweh2d6n9an1kxxom">
         <w:r>
           <w:rPr>
             <w:rStyle w:val="Hyperlink"/>
@@ -7702,9 +7764,9 @@
           <w:sz w:val="18"/>
           <w:szCs w:val="18"/>
         </w:rPr>
-        <w:t xml:space="preserve">35　</w:t>
-      </w:r>
-      <w:hyperlink w:history="1" r:id="rId0xgrzaiulrc5ev5eeduut">
+        <w:t xml:space="preserve">38　</w:t>
+      </w:r>
+      <w:hyperlink w:history="1" r:id="rIdhvgtefog7rqro9mu45htk">
         <w:r>
           <w:rPr>
             <w:rStyle w:val="Hyperlink"/>
@@ -7728,9 +7790,9 @@
           <w:sz w:val="18"/>
           <w:szCs w:val="18"/>
         </w:rPr>
-        <w:t xml:space="preserve">36　</w:t>
-      </w:r>
-      <w:hyperlink w:history="1" r:id="rIdedsjsj4hnr2kmgh7zaaor">
+        <w:t xml:space="preserve">39　</w:t>
+      </w:r>
+      <w:hyperlink w:history="1" r:id="rId52ye1sl3zscsxkifln8_h">
         <w:r>
           <w:rPr>
             <w:rStyle w:val="Hyperlink"/>
@@ -7754,9 +7816,9 @@
           <w:sz w:val="18"/>
           <w:szCs w:val="18"/>
         </w:rPr>
-        <w:t xml:space="preserve">41　</w:t>
-      </w:r>
-      <w:hyperlink w:history="1" r:id="rId-l2rg7opbt-k7vqkrha3f">
+        <w:t xml:space="preserve">44　</w:t>
+      </w:r>
+      <w:hyperlink w:history="1" r:id="rIdurf_4no0ii3qoz4vn3qsl">
         <w:r>
           <w:rPr>
             <w:rStyle w:val="Hyperlink"/>
@@ -7780,9 +7842,9 @@
           <w:sz w:val="18"/>
           <w:szCs w:val="18"/>
         </w:rPr>
-        <w:t xml:space="preserve">42　</w:t>
-      </w:r>
-      <w:hyperlink w:history="1" r:id="rIdugu3fcofhj1kqxkukk5a9">
+        <w:t xml:space="preserve">45　</w:t>
+      </w:r>
+      <w:hyperlink w:history="1" r:id="rIdufa-y4la2jgkojgr4qagn">
         <w:r>
           <w:rPr>
             <w:rStyle w:val="Hyperlink"/>
@@ -8204,6 +8266,24 @@
         </w:rPr>
         <w:t xml:space="preserve">6</w:t>
       </w:r>
+      <w:r>
+        <w:rPr>
+          <w:rFonts w:ascii="Microsoft JhengHei" w:cs="Microsoft JhengHei" w:eastAsia="Microsoft JhengHei" w:hAnsi="Microsoft JhengHei"/>
+          <w:sz w:val="22"/>
+          <w:szCs w:val="22"/>
+        </w:rPr>
+        <w:t xml:space="preserve"> </w:t>
+      </w:r>
+      <w:r>
+        <w:rPr>
+          <w:rFonts w:ascii="Microsoft JhengHei" w:cs="Microsoft JhengHei" w:eastAsia="Microsoft JhengHei" w:hAnsi="Microsoft JhengHei"/>
+          <w:color w:val="1F4E36"/>
+          <w:sz w:val="16"/>
+          <w:szCs w:val="16"/>
+          <w:vertAlign w:val="superscript"/>
+        </w:rPr>
+        <w:t xml:space="preserve">7</w:t>
+      </w:r>
     </w:p>
     <w:p>
       <w:pPr>
@@ -8253,7 +8333,7 @@
           <w:szCs w:val="16"/>
           <w:vertAlign w:val="superscript"/>
         </w:rPr>
-        <w:t xml:space="preserve">7</w:t>
+        <w:t xml:space="preserve">8</w:t>
       </w:r>
     </w:p>
     <w:p>
@@ -8287,7 +8367,7 @@
           <w:szCs w:val="16"/>
           <w:vertAlign w:val="superscript"/>
         </w:rPr>
-        <w:t xml:space="preserve">8</w:t>
+        <w:t xml:space="preserve">9</w:t>
       </w:r>
     </w:p>
     <w:p>
@@ -8321,7 +8401,7 @@
           <w:szCs w:val="16"/>
           <w:vertAlign w:val="superscript"/>
         </w:rPr>
-        <w:t xml:space="preserve">9</w:t>
+        <w:t xml:space="preserve">10</w:t>
       </w:r>
     </w:p>
     <w:p>
@@ -8355,7 +8435,7 @@
           <w:szCs w:val="16"/>
           <w:vertAlign w:val="superscript"/>
         </w:rPr>
-        <w:t xml:space="preserve">10</w:t>
+        <w:t xml:space="preserve">11</w:t>
       </w:r>
       <w:r>
         <w:rPr>
@@ -8373,7 +8453,7 @@
           <w:szCs w:val="16"/>
           <w:vertAlign w:val="superscript"/>
         </w:rPr>
-        <w:t xml:space="preserve">11</w:t>
+        <w:t xml:space="preserve">12</w:t>
       </w:r>
     </w:p>
     <w:p>
@@ -8407,7 +8487,7 @@
           <w:szCs w:val="16"/>
           <w:vertAlign w:val="superscript"/>
         </w:rPr>
-        <w:t xml:space="preserve">12</w:t>
+        <w:t xml:space="preserve">13</w:t>
       </w:r>
       <w:r>
         <w:rPr>
@@ -8425,7 +8505,7 @@
           <w:szCs w:val="16"/>
           <w:vertAlign w:val="superscript"/>
         </w:rPr>
-        <w:t xml:space="preserve">13</w:t>
+        <w:t xml:space="preserve">14</w:t>
       </w:r>
     </w:p>
     <w:p>
@@ -8459,7 +8539,7 @@
           <w:szCs w:val="16"/>
           <w:vertAlign w:val="superscript"/>
         </w:rPr>
-        <w:t xml:space="preserve">14</w:t>
+        <w:t xml:space="preserve">15</w:t>
       </w:r>
     </w:p>
     <w:p>
@@ -8510,7 +8590,7 @@
           <w:szCs w:val="16"/>
           <w:vertAlign w:val="superscript"/>
         </w:rPr>
-        <w:t xml:space="preserve">15</w:t>
+        <w:t xml:space="preserve">16</w:t>
       </w:r>
     </w:p>
     <w:p>
@@ -8543,7 +8623,7 @@
         </w:rPr>
         <w:t xml:space="preserve">1, 4, 6　</w:t>
       </w:r>
-      <w:hyperlink w:history="1" r:id="rIdkpyn1qj8wz11tjb5qmhkt">
+      <w:hyperlink w:history="1" r:id="rIdc-eh-wwsu1ilxr-ffreuy">
         <w:r>
           <w:rPr>
             <w:rStyle w:val="Hyperlink"/>
@@ -8569,7 +8649,7 @@
         </w:rPr>
         <w:t xml:space="preserve">2　</w:t>
       </w:r>
-      <w:hyperlink w:history="1" r:id="rIde1pn07nzaovoqgyvu9uo0">
+      <w:hyperlink w:history="1" r:id="rIdths3y1jbhwtzmwt4qmjcq">
         <w:r>
           <w:rPr>
             <w:rStyle w:val="Hyperlink"/>
@@ -8595,7 +8675,7 @@
         </w:rPr>
         <w:t xml:space="preserve">3　</w:t>
       </w:r>
-      <w:hyperlink w:history="1" r:id="rIdoge1lvokgefewwvlnokno">
+      <w:hyperlink w:history="1" r:id="rIdkcasnzxnhcexe5_tnmr9j">
         <w:r>
           <w:rPr>
             <w:rStyle w:val="Hyperlink"/>
@@ -8621,7 +8701,7 @@
         </w:rPr>
         <w:t xml:space="preserve">5　</w:t>
       </w:r>
-      <w:hyperlink w:history="1" r:id="rIdkxmykwdqemzcifuavejat">
+      <w:hyperlink w:history="1" r:id="rIddn-t8ecw4o-faa_pti8p9">
         <w:r>
           <w:rPr>
             <w:rStyle w:val="Hyperlink"/>
@@ -8647,7 +8727,33 @@
         </w:rPr>
         <w:t xml:space="preserve">7　</w:t>
       </w:r>
-      <w:hyperlink w:history="1" r:id="rId6t4nd-pi2mmzcckbfnihc">
+      <w:hyperlink w:history="1" r:id="rIdepan-2kuda7qcmyvqahgh">
+        <w:r>
+          <w:rPr>
+            <w:rStyle w:val="Hyperlink"/>
+            <w:rFonts w:ascii="Microsoft JhengHei" w:cs="Microsoft JhengHei" w:eastAsia="Microsoft JhengHei" w:hAnsi="Microsoft JhengHei"/>
+            <w:sz w:val="18"/>
+            <w:szCs w:val="18"/>
+          </w:rPr>
+          <w:t xml:space="preserve">《資優教育政策文件及指引》第 3 頁</w:t>
+        </w:r>
+      </w:hyperlink>
+    </w:p>
+    <w:p>
+      <w:pPr>
+        <w:spacing w:after="20"/>
+        <w:ind w:left="420" w:hanging="420"/>
+      </w:pPr>
+      <w:r>
+        <w:rPr>
+          <w:rFonts w:ascii="Microsoft JhengHei" w:cs="Microsoft JhengHei" w:eastAsia="Microsoft JhengHei" w:hAnsi="Microsoft JhengHei"/>
+          <w:color w:val="555555"/>
+          <w:sz w:val="18"/>
+          <w:szCs w:val="18"/>
+        </w:rPr>
+        <w:t xml:space="preserve">8　</w:t>
+      </w:r>
+      <w:hyperlink w:history="1" r:id="rId6mlqgvuk6i5uh2qobuevc">
         <w:r>
           <w:rPr>
             <w:rStyle w:val="Hyperlink"/>
@@ -8671,9 +8777,9 @@
           <w:sz w:val="18"/>
           <w:szCs w:val="18"/>
         </w:rPr>
-        <w:t xml:space="preserve">8　</w:t>
-      </w:r>
-      <w:hyperlink w:history="1" r:id="rId4rbbmopj4tls50ir38zol">
+        <w:t xml:space="preserve">9　</w:t>
+      </w:r>
+      <w:hyperlink w:history="1" r:id="rIdqr1bj9sdl5etqffkvtc6v">
         <w:r>
           <w:rPr>
             <w:rStyle w:val="Hyperlink"/>
@@ -8697,9 +8803,9 @@
           <w:sz w:val="18"/>
           <w:szCs w:val="18"/>
         </w:rPr>
-        <w:t xml:space="preserve">9　</w:t>
-      </w:r>
-      <w:hyperlink w:history="1" r:id="rId3lfamkstpo_xh77dqn0ci">
+        <w:t xml:space="preserve">10　</w:t>
+      </w:r>
+      <w:hyperlink w:history="1" r:id="rId1oikykqlymrdfk6znilom">
         <w:r>
           <w:rPr>
             <w:rStyle w:val="Hyperlink"/>
@@ -8723,9 +8829,9 @@
           <w:sz w:val="18"/>
           <w:szCs w:val="18"/>
         </w:rPr>
-        <w:t xml:space="preserve">10　</w:t>
-      </w:r>
-      <w:hyperlink w:history="1" r:id="rIdqsknpkkxt6vyksdjqibrz">
+        <w:t xml:space="preserve">11　</w:t>
+      </w:r>
+      <w:hyperlink w:history="1" r:id="rId-9xyx0p4mu2mba2x9-gke">
         <w:r>
           <w:rPr>
             <w:rStyle w:val="Hyperlink"/>
@@ -8749,9 +8855,9 @@
           <w:sz w:val="18"/>
           <w:szCs w:val="18"/>
         </w:rPr>
-        <w:t xml:space="preserve">11　</w:t>
-      </w:r>
-      <w:hyperlink w:history="1" r:id="rIdqzjy2llpn5wsvhrvpmth3">
+        <w:t xml:space="preserve">12　</w:t>
+      </w:r>
+      <w:hyperlink w:history="1" r:id="rIdc7eml9fh0vhaiwztlvo-0">
         <w:r>
           <w:rPr>
             <w:rStyle w:val="Hyperlink"/>
@@ -8775,9 +8881,9 @@
           <w:sz w:val="18"/>
           <w:szCs w:val="18"/>
         </w:rPr>
-        <w:t xml:space="preserve">12　</w:t>
-      </w:r>
-      <w:hyperlink w:history="1" r:id="rIdaqdhgrfa3cfvmsdpv44wv">
+        <w:t xml:space="preserve">13　</w:t>
+      </w:r>
+      <w:hyperlink w:history="1" r:id="rIdtets8gajw7jxmz79v-cwj">
         <w:r>
           <w:rPr>
             <w:rStyle w:val="Hyperlink"/>
@@ -8801,9 +8907,9 @@
           <w:sz w:val="18"/>
           <w:szCs w:val="18"/>
         </w:rPr>
-        <w:t xml:space="preserve">13　</w:t>
-      </w:r>
-      <w:hyperlink w:history="1" r:id="rIdkbgd8a3k57elx-l2v0_cr">
+        <w:t xml:space="preserve">14　</w:t>
+      </w:r>
+      <w:hyperlink w:history="1" r:id="rIdtv4hr_lhet2rqrmmkw2ho">
         <w:r>
           <w:rPr>
             <w:rStyle w:val="Hyperlink"/>
@@ -8827,9 +8933,9 @@
           <w:sz w:val="18"/>
           <w:szCs w:val="18"/>
         </w:rPr>
-        <w:t xml:space="preserve">14　</w:t>
-      </w:r>
-      <w:hyperlink w:history="1" r:id="rIdfbdawua0pghdpkjudx3op">
+        <w:t xml:space="preserve">15　</w:t>
+      </w:r>
+      <w:hyperlink w:history="1" r:id="rIdsl_8tcbmzyv4tj4quhmy1">
         <w:r>
           <w:rPr>
             <w:rStyle w:val="Hyperlink"/>
@@ -8853,9 +8959,9 @@
           <w:sz w:val="18"/>
           <w:szCs w:val="18"/>
         </w:rPr>
-        <w:t xml:space="preserve">15　</w:t>
-      </w:r>
-      <w:hyperlink w:history="1" r:id="rIdxbchhr4oo3osegshzzohp">
+        <w:t xml:space="preserve">16　</w:t>
+      </w:r>
+      <w:hyperlink w:history="1" r:id="rIdc4sgejt89krgukalpcoiq">
         <w:r>
           <w:rPr>
             <w:rStyle w:val="Hyperlink"/>
@@ -10561,7 +10667,7 @@
         </w:rPr>
         <w:t xml:space="preserve">1　</w:t>
       </w:r>
-      <w:hyperlink w:history="1" r:id="rId4ymbqskmj05nvgvme3gex">
+      <w:hyperlink w:history="1" r:id="rIdvpnks63tpohgqpcmfeam7">
         <w:r>
           <w:rPr>
             <w:rStyle w:val="Hyperlink"/>
@@ -10587,7 +10693,7 @@
         </w:rPr>
         <w:t xml:space="preserve">2　</w:t>
       </w:r>
-      <w:hyperlink w:history="1" r:id="rIdv_eeope0c-swsy5wbxasd">
+      <w:hyperlink w:history="1" r:id="rId6np_rtn6ejohenwbn9w-x">
         <w:r>
           <w:rPr>
             <w:rStyle w:val="Hyperlink"/>
@@ -10613,7 +10719,7 @@
         </w:rPr>
         <w:t xml:space="preserve">3　</w:t>
       </w:r>
-      <w:hyperlink w:history="1" r:id="rIdfbs_trkfdz98owls4z8pl">
+      <w:hyperlink w:history="1" r:id="rIdpuewagfb_td6vwlr0edhf">
         <w:r>
           <w:rPr>
             <w:rStyle w:val="Hyperlink"/>
@@ -10639,7 +10745,7 @@
         </w:rPr>
         <w:t xml:space="preserve">4　</w:t>
       </w:r>
-      <w:hyperlink w:history="1" r:id="rId-mx7rbfoynl_7u5th_r9p">
+      <w:hyperlink w:history="1" r:id="rId9njbfn4--3nbw4mhgm5pl">
         <w:r>
           <w:rPr>
             <w:rStyle w:val="Hyperlink"/>
@@ -10665,7 +10771,7 @@
         </w:rPr>
         <w:t xml:space="preserve">5　</w:t>
       </w:r>
-      <w:hyperlink w:history="1" r:id="rIdxos1wregj46zpks2_zxti">
+      <w:hyperlink w:history="1" r:id="rIddrff-ncpldgquvghjtgaz">
         <w:r>
           <w:rPr>
             <w:rStyle w:val="Hyperlink"/>
@@ -10691,7 +10797,7 @@
         </w:rPr>
         <w:t xml:space="preserve">6, 7, 8　</w:t>
       </w:r>
-      <w:hyperlink w:history="1" r:id="rIdudozkk1_aen1dujjz6xhc">
+      <w:hyperlink w:history="1" r:id="rIdp0co4_ptgt5nsmvwmbget">
         <w:r>
           <w:rPr>
             <w:rStyle w:val="Hyperlink"/>
@@ -10717,7 +10823,7 @@
         </w:rPr>
         <w:t xml:space="preserve">9　</w:t>
       </w:r>
-      <w:hyperlink w:history="1" r:id="rIdd9tlmhzvvnlukp9y4wf27">
+      <w:hyperlink w:history="1" r:id="rIdwfkg6xga55yaygebcyg-2">
         <w:r>
           <w:rPr>
             <w:rStyle w:val="Hyperlink"/>
@@ -10907,7 +11013,7 @@
           <w:sz w:val="22"/>
           <w:szCs w:val="22"/>
         </w:rPr>
-        <w:t xml:space="preserve">本校提供以下輔導支援，協助資優學生紓緩壓力並建立師生溝通橋樑。學生支援小組、家長與教育心理學家共同為有需要的學生訂立及推行輔導計劃，並定期檢討計劃成效。對於有情意需要的雙重特殊資優學生，本校為其安排</w:t>
+        <w:t xml:space="preserve">本校提供以下輔導支援（包括輔導活動及特定空間），協助資優學生紓緩壓力並建立師生溝通橋樑。學生支援小組、家長與教育心理學家共同為有需要的學生訂立及推行輔導計劃，並定期檢討計劃成效。對於有情意需要的雙重特殊資優學生，本校為其安排</w:t>
       </w:r>
       <w:r>
         <w:rPr>
@@ -11594,7 +11700,7 @@
         </w:rPr>
         <w:t xml:space="preserve">1　</w:t>
       </w:r>
-      <w:hyperlink w:history="1" r:id="rIdds4aor2fqs_ai5hagvwix">
+      <w:hyperlink w:history="1" r:id="rIdeuwwdiailf-juxpzoirv5">
         <w:r>
           <w:rPr>
             <w:rStyle w:val="Hyperlink"/>
@@ -11620,7 +11726,7 @@
         </w:rPr>
         <w:t xml:space="preserve">2　</w:t>
       </w:r>
-      <w:hyperlink w:history="1" r:id="rId649w0hzhmmmnfa0cjrowd">
+      <w:hyperlink w:history="1" r:id="rIdnghbkeede9zkvkrjoyk8s">
         <w:r>
           <w:rPr>
             <w:rStyle w:val="Hyperlink"/>
@@ -11646,7 +11752,7 @@
         </w:rPr>
         <w:t xml:space="preserve">3　</w:t>
       </w:r>
-      <w:hyperlink w:history="1" r:id="rIde7yvyjsqemy--seuh2rlj">
+      <w:hyperlink w:history="1" r:id="rId_x2l9gtpeiyqhg7xy60ug">
         <w:r>
           <w:rPr>
             <w:rStyle w:val="Hyperlink"/>
@@ -11672,7 +11778,7 @@
         </w:rPr>
         <w:t xml:space="preserve">4　</w:t>
       </w:r>
-      <w:hyperlink w:history="1" r:id="rIdj8fnabkqe293_sc29re6p">
+      <w:hyperlink w:history="1" r:id="rIddpfhqvc1oy5v-a-tboo6u">
         <w:r>
           <w:rPr>
             <w:rStyle w:val="Hyperlink"/>
@@ -11698,7 +11804,7 @@
         </w:rPr>
         <w:t xml:space="preserve">5　</w:t>
       </w:r>
-      <w:hyperlink w:history="1" r:id="rIdwr4ibg0ji2dppffsk3sdt">
+      <w:hyperlink w:history="1" r:id="rIdrjpli22ixfy674sduodmz">
         <w:r>
           <w:rPr>
             <w:rStyle w:val="Hyperlink"/>
@@ -11724,7 +11830,7 @@
         </w:rPr>
         <w:t xml:space="preserve">6　</w:t>
       </w:r>
-      <w:hyperlink w:history="1" r:id="rIdmqq7rlqve6s3m2cwq1fx_">
+      <w:hyperlink w:history="1" r:id="rIdczbwau1jpffvcyso3uuvz">
         <w:r>
           <w:rPr>
             <w:rStyle w:val="Hyperlink"/>
@@ -11750,7 +11856,7 @@
         </w:rPr>
         <w:t xml:space="preserve">7　</w:t>
       </w:r>
-      <w:hyperlink w:history="1" r:id="rId7txssekyud7glj7cb8i8p">
+      <w:hyperlink w:history="1" r:id="rId2dr0nqjl8rkqs7ada9phq">
         <w:r>
           <w:rPr>
             <w:rStyle w:val="Hyperlink"/>
@@ -11776,7 +11882,7 @@
         </w:rPr>
         <w:t xml:space="preserve">8, 13　</w:t>
       </w:r>
-      <w:hyperlink w:history="1" r:id="rIdepc-jcqeczuvjldzn7jpr">
+      <w:hyperlink w:history="1" r:id="rIdoor4huijznc5ior5fabla">
         <w:r>
           <w:rPr>
             <w:rStyle w:val="Hyperlink"/>
@@ -11802,7 +11908,7 @@
         </w:rPr>
         <w:t xml:space="preserve">9　</w:t>
       </w:r>
-      <w:hyperlink w:history="1" r:id="rId721j3i_ysvyfuqncpl6sj">
+      <w:hyperlink w:history="1" r:id="rId8hbkdzo7rh9iwmbiqrpvo">
         <w:r>
           <w:rPr>
             <w:rStyle w:val="Hyperlink"/>
@@ -11828,7 +11934,7 @@
         </w:rPr>
         <w:t xml:space="preserve">10　</w:t>
       </w:r>
-      <w:hyperlink w:history="1" r:id="rIdldxfp7hufolfruatpiajw">
+      <w:hyperlink w:history="1" r:id="rIdtv0picxbatba9qawjbv_a">
         <w:r>
           <w:rPr>
             <w:rStyle w:val="Hyperlink"/>
@@ -11854,7 +11960,7 @@
         </w:rPr>
         <w:t xml:space="preserve">11　</w:t>
       </w:r>
-      <w:hyperlink w:history="1" r:id="rIdhqbpmbhxmfou1auo5n8q0">
+      <w:hyperlink w:history="1" r:id="rId6ny828_sye3u746dibe0w">
         <w:r>
           <w:rPr>
             <w:rStyle w:val="Hyperlink"/>
@@ -11880,7 +11986,7 @@
         </w:rPr>
         <w:t xml:space="preserve">12　</w:t>
       </w:r>
-      <w:hyperlink w:history="1" r:id="rIdo2zhukzzh-slpusj1xvlw">
+      <w:hyperlink w:history="1" r:id="rIdrlfjw3_f1tux2788fh0im">
         <w:r>
           <w:rPr>
             <w:rStyle w:val="Hyperlink"/>
@@ -11906,7 +12012,7 @@
         </w:rPr>
         <w:t xml:space="preserve">14　</w:t>
       </w:r>
-      <w:hyperlink w:history="1" r:id="rId8rokhngnzlsfn_ezdd9ot">
+      <w:hyperlink w:history="1" r:id="rId-qi0qgxscxwoa45gwa8x3">
         <w:r>
           <w:rPr>
             <w:rStyle w:val="Hyperlink"/>
@@ -11932,7 +12038,7 @@
         </w:rPr>
         <w:t xml:space="preserve">15　</w:t>
       </w:r>
-      <w:hyperlink w:history="1" r:id="rIdac3-doaogxfo42kpu5dcv">
+      <w:hyperlink w:history="1" r:id="rIdxpoy28e0dadb0jqea0eeg">
         <w:r>
           <w:rPr>
             <w:rStyle w:val="Hyperlink"/>
@@ -11958,7 +12064,7 @@
         </w:rPr>
         <w:t xml:space="preserve">16　</w:t>
       </w:r>
-      <w:hyperlink w:history="1" r:id="rIdzvbs9wzmjmoxilxothbte">
+      <w:hyperlink w:history="1" r:id="rIdtg74uhgqzeedw09tqb_eo">
         <w:r>
           <w:rPr>
             <w:rStyle w:val="Hyperlink"/>
@@ -13036,24 +13142,6 @@
         </w:rPr>
         <w:t xml:space="preserve">16</w:t>
       </w:r>
-      <w:r>
-        <w:rPr>
-          <w:rFonts w:ascii="Microsoft JhengHei" w:cs="Microsoft JhengHei" w:eastAsia="Microsoft JhengHei" w:hAnsi="Microsoft JhengHei"/>
-          <w:sz w:val="22"/>
-          <w:szCs w:val="22"/>
-        </w:rPr>
-        <w:t xml:space="preserve"> </w:t>
-      </w:r>
-      <w:r>
-        <w:rPr>
-          <w:rFonts w:ascii="Microsoft JhengHei" w:cs="Microsoft JhengHei" w:eastAsia="Microsoft JhengHei" w:hAnsi="Microsoft JhengHei"/>
-          <w:color w:val="1F4E36"/>
-          <w:sz w:val="16"/>
-          <w:szCs w:val="16"/>
-          <w:vertAlign w:val="superscript"/>
-        </w:rPr>
-        <w:t xml:space="preserve">17</w:t>
-      </w:r>
     </w:p>
     <w:p>
       <w:pPr>
@@ -13120,6 +13208,24 @@
           <w:szCs w:val="16"/>
           <w:vertAlign w:val="superscript"/>
         </w:rPr>
+        <w:t xml:space="preserve">17</w:t>
+      </w:r>
+      <w:r>
+        <w:rPr>
+          <w:rFonts w:ascii="Microsoft JhengHei" w:cs="Microsoft JhengHei" w:eastAsia="Microsoft JhengHei" w:hAnsi="Microsoft JhengHei"/>
+          <w:sz w:val="22"/>
+          <w:szCs w:val="22"/>
+        </w:rPr>
+        <w:t xml:space="preserve"> </w:t>
+      </w:r>
+      <w:r>
+        <w:rPr>
+          <w:rFonts w:ascii="Microsoft JhengHei" w:cs="Microsoft JhengHei" w:eastAsia="Microsoft JhengHei" w:hAnsi="Microsoft JhengHei"/>
+          <w:color w:val="1F4E36"/>
+          <w:sz w:val="16"/>
+          <w:szCs w:val="16"/>
+          <w:vertAlign w:val="superscript"/>
+        </w:rPr>
         <w:t xml:space="preserve">18</w:t>
       </w:r>
       <w:r>
@@ -13139,24 +13245,6 @@
           <w:vertAlign w:val="superscript"/>
         </w:rPr>
         <w:t xml:space="preserve">19</w:t>
-      </w:r>
-      <w:r>
-        <w:rPr>
-          <w:rFonts w:ascii="Microsoft JhengHei" w:cs="Microsoft JhengHei" w:eastAsia="Microsoft JhengHei" w:hAnsi="Microsoft JhengHei"/>
-          <w:sz w:val="22"/>
-          <w:szCs w:val="22"/>
-        </w:rPr>
-        <w:t xml:space="preserve"> </w:t>
-      </w:r>
-      <w:r>
-        <w:rPr>
-          <w:rFonts w:ascii="Microsoft JhengHei" w:cs="Microsoft JhengHei" w:eastAsia="Microsoft JhengHei" w:hAnsi="Microsoft JhengHei"/>
-          <w:color w:val="1F4E36"/>
-          <w:sz w:val="16"/>
-          <w:szCs w:val="16"/>
-          <w:vertAlign w:val="superscript"/>
-        </w:rPr>
-        <w:t xml:space="preserve">20</w:t>
       </w:r>
     </w:p>
     <w:p>
@@ -13190,7 +13278,7 @@
           <w:szCs w:val="16"/>
           <w:vertAlign w:val="superscript"/>
         </w:rPr>
-        <w:t xml:space="preserve">21</w:t>
+        <w:t xml:space="preserve">20</w:t>
       </w:r>
     </w:p>
     <w:p>
@@ -13223,7 +13311,7 @@
         </w:rPr>
         <w:t xml:space="preserve">1　</w:t>
       </w:r>
-      <w:hyperlink w:history="1" r:id="rIdeijdy5iolqpwbxjubw4bs">
+      <w:hyperlink w:history="1" r:id="rId8wcubjkmovtb-jrqzvsxa">
         <w:r>
           <w:rPr>
             <w:rStyle w:val="Hyperlink"/>
@@ -13249,7 +13337,7 @@
         </w:rPr>
         <w:t xml:space="preserve">2, 14　</w:t>
       </w:r>
-      <w:hyperlink w:history="1" r:id="rIdnghng4ccmo8err5uvvgnn">
+      <w:hyperlink w:history="1" r:id="rIdrzioaghxrr9aamqrsp3dv">
         <w:r>
           <w:rPr>
             <w:rStyle w:val="Hyperlink"/>
@@ -13273,9 +13361,9 @@
           <w:sz w:val="18"/>
           <w:szCs w:val="18"/>
         </w:rPr>
-        <w:t xml:space="preserve">3, 17　</w:t>
-      </w:r>
-      <w:hyperlink w:history="1" r:id="rIdo5chju3_dckjhdlttf_v2">
+        <w:t xml:space="preserve">3　</w:t>
+      </w:r>
+      <w:hyperlink w:history="1" r:id="rIdm-tiykzbchy5zfoypxx6p">
         <w:r>
           <w:rPr>
             <w:rStyle w:val="Hyperlink"/>
@@ -13301,7 +13389,7 @@
         </w:rPr>
         <w:t xml:space="preserve">4, 9　</w:t>
       </w:r>
-      <w:hyperlink w:history="1" r:id="rIdox1n_2wr1oiesvzcjyhcw">
+      <w:hyperlink w:history="1" r:id="rIdnhw2mirxl1xiy1lp8fgqp">
         <w:r>
           <w:rPr>
             <w:rStyle w:val="Hyperlink"/>
@@ -13327,7 +13415,7 @@
         </w:rPr>
         <w:t xml:space="preserve">5, 11　</w:t>
       </w:r>
-      <w:hyperlink w:history="1" r:id="rId7pt32spvbmxhprstziffb">
+      <w:hyperlink w:history="1" r:id="rId10oq0hp2c2hnplmy2o9yy">
         <w:r>
           <w:rPr>
             <w:rStyle w:val="Hyperlink"/>
@@ -13353,7 +13441,7 @@
         </w:rPr>
         <w:t xml:space="preserve">6　</w:t>
       </w:r>
-      <w:hyperlink w:history="1" r:id="rIdjupqh3qvfeodagb8-lkgw">
+      <w:hyperlink w:history="1" r:id="rIdarmdjeie_96wg-twdh51a">
         <w:r>
           <w:rPr>
             <w:rStyle w:val="Hyperlink"/>
@@ -13379,7 +13467,7 @@
         </w:rPr>
         <w:t xml:space="preserve">7, 10, 12　</w:t>
       </w:r>
-      <w:hyperlink w:history="1" r:id="rIdd-kkv3bsjaqmowcudl9p5">
+      <w:hyperlink w:history="1" r:id="rIdb99qbieph1duqujtt9wbv">
         <w:r>
           <w:rPr>
             <w:rStyle w:val="Hyperlink"/>
@@ -13405,7 +13493,7 @@
         </w:rPr>
         <w:t xml:space="preserve">8　</w:t>
       </w:r>
-      <w:hyperlink w:history="1" r:id="rId5d2pbcbeccqh4v5elhtmm">
+      <w:hyperlink w:history="1" r:id="rIdet9edm2gjipqdzqy9727m">
         <w:r>
           <w:rPr>
             <w:rStyle w:val="Hyperlink"/>
@@ -13431,7 +13519,7 @@
         </w:rPr>
         <w:t xml:space="preserve">13　</w:t>
       </w:r>
-      <w:hyperlink w:history="1" r:id="rIdu8cypt33qkyizenaeeupc">
+      <w:hyperlink w:history="1" r:id="rIddfjdvh001fefygsfvjpqv">
         <w:r>
           <w:rPr>
             <w:rStyle w:val="Hyperlink"/>
@@ -13457,7 +13545,7 @@
         </w:rPr>
         <w:t xml:space="preserve">15　</w:t>
       </w:r>
-      <w:hyperlink w:history="1" r:id="rId3wckeke8jmsenmudhbcfo">
+      <w:hyperlink w:history="1" r:id="rIdrnfopwn9vvwnawrihnxzg">
         <w:r>
           <w:rPr>
             <w:rStyle w:val="Hyperlink"/>
@@ -13483,7 +13571,7 @@
         </w:rPr>
         <w:t xml:space="preserve">16　</w:t>
       </w:r>
-      <w:hyperlink w:history="1" r:id="rIdfc9deyiapr0x4gnsdsuox">
+      <w:hyperlink w:history="1" r:id="rIdz1u16lfqqatzhdr2a0voy">
         <w:r>
           <w:rPr>
             <w:rStyle w:val="Hyperlink"/>
@@ -13507,9 +13595,9 @@
           <w:sz w:val="18"/>
           <w:szCs w:val="18"/>
         </w:rPr>
-        <w:t xml:space="preserve">18　</w:t>
-      </w:r>
-      <w:hyperlink w:history="1" r:id="rIdgta1dwbubtpgq-gn96mr6">
+        <w:t xml:space="preserve">17　</w:t>
+      </w:r>
+      <w:hyperlink w:history="1" r:id="rIdhxemlkcl-jlqugtlsenjg">
         <w:r>
           <w:rPr>
             <w:rStyle w:val="Hyperlink"/>
@@ -13533,9 +13621,9 @@
           <w:sz w:val="18"/>
           <w:szCs w:val="18"/>
         </w:rPr>
-        <w:t xml:space="preserve">19, 21　</w:t>
-      </w:r>
-      <w:hyperlink w:history="1" r:id="rIdrwsqdtmyijqpitxto53sf">
+        <w:t xml:space="preserve">18, 20　</w:t>
+      </w:r>
+      <w:hyperlink w:history="1" r:id="rId-jtnyir94ivrvh8h4j80_">
         <w:r>
           <w:rPr>
             <w:rStyle w:val="Hyperlink"/>
@@ -13559,9 +13647,9 @@
           <w:sz w:val="18"/>
           <w:szCs w:val="18"/>
         </w:rPr>
-        <w:t xml:space="preserve">20　</w:t>
-      </w:r>
-      <w:hyperlink w:history="1" r:id="rIddqm9e0tkhzxtpv62_ytrb">
+        <w:t xml:space="preserve">19　</w:t>
+      </w:r>
+      <w:hyperlink w:history="1" r:id="rIdxu8bplva3monpin5fzdb_">
         <w:r>
           <w:rPr>
             <w:rStyle w:val="Hyperlink"/>
@@ -13611,7 +13699,7 @@
           <w:sz w:val="22"/>
           <w:szCs w:val="22"/>
         </w:rPr>
-        <w:t xml:space="preserve">本校確認每位教師均有責任推行資優教育，並須積極裝備每位教師，使其具備信念及策略，有效推行校本資優教育。為此，本校將資優教育培訓納入教師在職發展的核心範疇，確保所有教師均接受相關訓練，學習處理班內的資優學童；資優教育亦應涵蓋在職師訓課程及教師長期發展課程之內。</w:t>
+        <w:t xml:space="preserve">本校確認每所學校、每位教師均有責任推行資優教育，並須積極裝備每位教師，使其具備信念及策略，有效推行校本資優教育。為此，本校將資優教育培訓納入教師在職發展的核心範疇，確保所有教師均接受相關訓練，學習處理班內的資優學童；資優教育亦應納入職前師訓的核心課程、在職師訓課程及為教師而設的長期發展課程之內。</w:t>
       </w:r>
       <w:r>
         <w:rPr>
@@ -14268,7 +14356,7 @@
         </w:rPr>
         <w:t xml:space="preserve">1　</w:t>
       </w:r>
-      <w:hyperlink w:history="1" r:id="rIdzft4gnj498lvwlv-ripis">
+      <w:hyperlink w:history="1" r:id="rId_tixpy15knephxqmaljds">
         <w:r>
           <w:rPr>
             <w:rStyle w:val="Hyperlink"/>
@@ -14294,7 +14382,7 @@
         </w:rPr>
         <w:t xml:space="preserve">2　</w:t>
       </w:r>
-      <w:hyperlink w:history="1" r:id="rIdnwc3simd5wl7ssrx2pawk">
+      <w:hyperlink w:history="1" r:id="rIdhzjfludtzp-wx8odse5oh">
         <w:r>
           <w:rPr>
             <w:rStyle w:val="Hyperlink"/>
@@ -14320,7 +14408,7 @@
         </w:rPr>
         <w:t xml:space="preserve">3　</w:t>
       </w:r>
-      <w:hyperlink w:history="1" r:id="rIdwvhnkkijgopo8klm2bg19">
+      <w:hyperlink w:history="1" r:id="rIduey2u2_eflo71smfjzsib">
         <w:r>
           <w:rPr>
             <w:rStyle w:val="Hyperlink"/>
@@ -14346,7 +14434,7 @@
         </w:rPr>
         <w:t xml:space="preserve">4　</w:t>
       </w:r>
-      <w:hyperlink w:history="1" r:id="rIdcwnr_2zvtddrvtqozhrbr">
+      <w:hyperlink w:history="1" r:id="rIditw_fbggv1tcefwxfpcsd">
         <w:r>
           <w:rPr>
             <w:rStyle w:val="Hyperlink"/>
@@ -14372,7 +14460,7 @@
         </w:rPr>
         <w:t xml:space="preserve">5　</w:t>
       </w:r>
-      <w:hyperlink w:history="1" r:id="rIdadv37bd-h12pnimcu5a1d">
+      <w:hyperlink w:history="1" r:id="rIdvrswawpoqwqpgrwrasxqx">
         <w:r>
           <w:rPr>
             <w:rStyle w:val="Hyperlink"/>
@@ -14398,7 +14486,7 @@
         </w:rPr>
         <w:t xml:space="preserve">6　</w:t>
       </w:r>
-      <w:hyperlink w:history="1" r:id="rIdf0tjfgvuoitiiyj83yawf">
+      <w:hyperlink w:history="1" r:id="rIdxbuzhyspysxx8ydjm3qwu">
         <w:r>
           <w:rPr>
             <w:rStyle w:val="Hyperlink"/>
@@ -14424,7 +14512,7 @@
         </w:rPr>
         <w:t xml:space="preserve">7　</w:t>
       </w:r>
-      <w:hyperlink w:history="1" r:id="rIdgoc9fbpassuapeu7ted2g">
+      <w:hyperlink w:history="1" r:id="rId71vbgn7awj4rbyuwksmxl">
         <w:r>
           <w:rPr>
             <w:rStyle w:val="Hyperlink"/>
@@ -14450,7 +14538,7 @@
         </w:rPr>
         <w:t xml:space="preserve">8　</w:t>
       </w:r>
-      <w:hyperlink w:history="1" r:id="rIdsuucucfqhdxkni6hkdaew">
+      <w:hyperlink w:history="1" r:id="rIdf06mjwfpcbvoktibmpabs">
         <w:r>
           <w:rPr>
             <w:rStyle w:val="Hyperlink"/>
@@ -15019,7 +15107,7 @@
         </w:rPr>
         <w:t xml:space="preserve">1, 2　</w:t>
       </w:r>
-      <w:hyperlink w:history="1" r:id="rIdainpq040jopynubo-mtbp">
+      <w:hyperlink w:history="1" r:id="rIdjdyz6chrjy15nbm_y_ti5">
         <w:r>
           <w:rPr>
             <w:rStyle w:val="Hyperlink"/>
@@ -15045,7 +15133,7 @@
         </w:rPr>
         <w:t xml:space="preserve">3　</w:t>
       </w:r>
-      <w:hyperlink w:history="1" r:id="rId6j3r2imfk0c420fit2ldu">
+      <w:hyperlink w:history="1" r:id="rIdxoofikuo5uri0dav9rxhx">
         <w:r>
           <w:rPr>
             <w:rStyle w:val="Hyperlink"/>
@@ -15071,7 +15159,7 @@
         </w:rPr>
         <w:t xml:space="preserve">4　</w:t>
       </w:r>
-      <w:hyperlink w:history="1" r:id="rIddzqeett5qxumjypm3d8t7">
+      <w:hyperlink w:history="1" r:id="rIdsnkpvxikmyxhary94kllz">
         <w:r>
           <w:rPr>
             <w:rStyle w:val="Hyperlink"/>
@@ -15121,7 +15209,7 @@
           <w:sz w:val="22"/>
           <w:szCs w:val="22"/>
         </w:rPr>
-        <w:t xml:space="preserve">教育局於2016年設立「資優教育基金」，至2018年共向基金注資16億元，以投資回報支持香港資優教育學苑推動資優教育發展；並於2023-24年度額外注資6億元，加強支援學苑及鼓勵更多機構為資優學生推展校外進階學習課程。自2019年起，符合資格之機構可向基金申請資助，為資優學生提供校外進階學習課程。</w:t>
+        <w:t xml:space="preserve">教育局於2016年設立「資優教育基金」，並於2016及2018年共向基金注資共16億元，以投資回報支持香港資優教育學苑推動資優教育發展；並於2023-24年度額外注資6億元，加強支援學苑及鼓勵更多機構為資優學生推展校外進階學習課程。自2019年起，符合資格之機構可向基金申請資助，為資優學生提供校外進階學習課程。</w:t>
       </w:r>
       <w:r>
         <w:rPr>
@@ -15176,8 +15264,7 @@
         <w:t xml:space="preserve">香港資優教育學苑（下稱「學苑」）服務對象為本港學校就讀的10至18歲資優學生。學苑每學年主要透過以下方式取錄適齡學員，本校應按相關提名渠道積極識別及提名符合條件的學生：
 | 提名／取錄方式 | 說明 |
 |---|---|
-| 學校提名 | 由本校教師提名具資優潛質之學生 |
-| 校長提名 | 自2022/23學年起新增，用於取錄具有卓越領導力的學生 |
+| 學校提名（包括校長提名） | 由本校教師提名具資優潛質之學生；自2022/23學年起，「學校提名」中增設「校長提名」，用於取錄具有卓越領導力的學生 |
 | 家長提名 | 由家長直接提名 |
 | 尖子培育計劃 | 就特定範疇甄選尖子 |
 | 網上資優課程 | 供合適學生透過網上途徑參加甄選 |
@@ -15529,24 +15616,7 @@
           <w:sz w:val="22"/>
           <w:szCs w:val="22"/>
         </w:rPr>
-        <w:t xml:space="preserve">對於需要正規學校以外資源輔助的特別卓越資優學生，本校可提供個別化的教育安排，包括</w:t>
-      </w:r>
-      <w:r>
-        <w:rPr>
-          <w:rFonts w:ascii="Microsoft JhengHei" w:cs="Microsoft JhengHei" w:eastAsia="Microsoft JhengHei" w:hAnsi="Microsoft JhengHei"/>
-          <w:sz w:val="22"/>
-          <w:szCs w:val="22"/>
-          <w:shd w:fill="FFF2B8" w:val="clear"/>
-        </w:rPr>
-        <w:t xml:space="preserve">輔導、良師啟導計劃及提早修讀進階課程</w:t>
-      </w:r>
-      <w:r>
-        <w:rPr>
-          <w:rFonts w:ascii="Microsoft JhengHei" w:cs="Microsoft JhengHei" w:eastAsia="Microsoft JhengHei" w:hAnsi="Microsoft JhengHei"/>
-          <w:sz w:val="22"/>
-          <w:szCs w:val="22"/>
-        </w:rPr>
-        <w:t xml:space="preserve">等，以切合其特殊學習需要及發展潛能。</w:t>
+        <w:t xml:space="preserve">對於需要正規學校以外資源輔助的特別卓越資優學生，本校可提供個別化的教育安排，包括輔導、良師啟導計劃、提早入讀較高班級及提早修讀進階課程等，以切合其特殊學習需要及發展潛能。</w:t>
       </w:r>
       <w:r>
         <w:rPr>
@@ -15743,7 +15813,7 @@
         </w:rPr>
         <w:t xml:space="preserve">1　</w:t>
       </w:r>
-      <w:hyperlink w:history="1" r:id="rIdayclgqwznb_f8rbuk6wmn">
+      <w:hyperlink w:history="1" r:id="rIdquyn072dpjfn5sdgn34aq">
         <w:r>
           <w:rPr>
             <w:rStyle w:val="Hyperlink"/>
@@ -15769,7 +15839,7 @@
         </w:rPr>
         <w:t xml:space="preserve">2, 16　</w:t>
       </w:r>
-      <w:hyperlink w:history="1" r:id="rIdeba8yvc9ecvyzxf5aolre">
+      <w:hyperlink w:history="1" r:id="rIdkmbo3wkjlqsdgcscvmtam">
         <w:r>
           <w:rPr>
             <w:rStyle w:val="Hyperlink"/>
@@ -15795,7 +15865,7 @@
         </w:rPr>
         <w:t xml:space="preserve">3　</w:t>
       </w:r>
-      <w:hyperlink w:history="1" r:id="rIdag2ukazaay5zuc1so6rt2">
+      <w:hyperlink w:history="1" r:id="rIdfipm2rk1xyzadeipahmsy">
         <w:r>
           <w:rPr>
             <w:rStyle w:val="Hyperlink"/>
@@ -15821,7 +15891,7 @@
         </w:rPr>
         <w:t xml:space="preserve">4, 5　</w:t>
       </w:r>
-      <w:hyperlink w:history="1" r:id="rIdv0rnjw0ic0krxqieowauo">
+      <w:hyperlink w:history="1" r:id="rId1lrr1osgkjxksslwqzuy2">
         <w:r>
           <w:rPr>
             <w:rStyle w:val="Hyperlink"/>
@@ -15847,7 +15917,7 @@
         </w:rPr>
         <w:t xml:space="preserve">6　</w:t>
       </w:r>
-      <w:hyperlink w:history="1" r:id="rIdingqivzpndf4gneycspqj">
+      <w:hyperlink w:history="1" r:id="rIdrhvvaeh4efrgzyl4gr4n5">
         <w:r>
           <w:rPr>
             <w:rStyle w:val="Hyperlink"/>
@@ -15873,7 +15943,7 @@
         </w:rPr>
         <w:t xml:space="preserve">7　</w:t>
       </w:r>
-      <w:hyperlink w:history="1" r:id="rIdv5suzvlrvu-lqaoiotg-4">
+      <w:hyperlink w:history="1" r:id="rIdb2cbeqk3zc4grz0knptmr">
         <w:r>
           <w:rPr>
             <w:rStyle w:val="Hyperlink"/>
@@ -15899,7 +15969,7 @@
         </w:rPr>
         <w:t xml:space="preserve">8　</w:t>
       </w:r>
-      <w:hyperlink w:history="1" r:id="rId7sdhgy1m5l_sci4m4d6qz">
+      <w:hyperlink w:history="1" r:id="rIdgjedoetqaewzn6srazupt">
         <w:r>
           <w:rPr>
             <w:rStyle w:val="Hyperlink"/>
@@ -15925,7 +15995,7 @@
         </w:rPr>
         <w:t xml:space="preserve">9　</w:t>
       </w:r>
-      <w:hyperlink w:history="1" r:id="rIdvy-zsp0v7nklykmusesa2">
+      <w:hyperlink w:history="1" r:id="rIdfilzeajxlbkppfenu7qqv">
         <w:r>
           <w:rPr>
             <w:rStyle w:val="Hyperlink"/>
@@ -15951,7 +16021,7 @@
         </w:rPr>
         <w:t xml:space="preserve">10　</w:t>
       </w:r>
-      <w:hyperlink w:history="1" r:id="rIdcvrjlyfqovoavu70vangg">
+      <w:hyperlink w:history="1" r:id="rIdjgrfrjpgzexklcdspjqwo">
         <w:r>
           <w:rPr>
             <w:rStyle w:val="Hyperlink"/>
@@ -15977,7 +16047,7 @@
         </w:rPr>
         <w:t xml:space="preserve">11　</w:t>
       </w:r>
-      <w:hyperlink w:history="1" r:id="rIdh9bxjebrqllgzhzmf86eg">
+      <w:hyperlink w:history="1" r:id="rIdx_62inzw-8eyma33hcr_3">
         <w:r>
           <w:rPr>
             <w:rStyle w:val="Hyperlink"/>
@@ -16003,7 +16073,7 @@
         </w:rPr>
         <w:t xml:space="preserve">12　</w:t>
       </w:r>
-      <w:hyperlink w:history="1" r:id="rId0mpgtfjjx3mgzc2belurw">
+      <w:hyperlink w:history="1" r:id="rIdnc8f-zarw9cytdhqlgd6b">
         <w:r>
           <w:rPr>
             <w:rStyle w:val="Hyperlink"/>
@@ -16029,7 +16099,7 @@
         </w:rPr>
         <w:t xml:space="preserve">13　</w:t>
       </w:r>
-      <w:hyperlink w:history="1" r:id="rIdoywryyr2tidf81wop_zt3">
+      <w:hyperlink w:history="1" r:id="rIduxcb5g1s6l4k3s9rwuokp">
         <w:r>
           <w:rPr>
             <w:rStyle w:val="Hyperlink"/>
@@ -16055,7 +16125,7 @@
         </w:rPr>
         <w:t xml:space="preserve">14　</w:t>
       </w:r>
-      <w:hyperlink w:history="1" r:id="rIddzbzzsydai08k4i_3p4p4">
+      <w:hyperlink w:history="1" r:id="rId84krlcniwyeuhcozm1cec">
         <w:r>
           <w:rPr>
             <w:rStyle w:val="Hyperlink"/>
@@ -16081,7 +16151,7 @@
         </w:rPr>
         <w:t xml:space="preserve">15, 18　</w:t>
       </w:r>
-      <w:hyperlink w:history="1" r:id="rIdsfgmjtps2v5r-pdxtjhsy">
+      <w:hyperlink w:history="1" r:id="rIdk8xcfhgvtcxzxj6sfbo6f">
         <w:r>
           <w:rPr>
             <w:rStyle w:val="Hyperlink"/>
@@ -16107,7 +16177,7 @@
         </w:rPr>
         <w:t xml:space="preserve">17　</w:t>
       </w:r>
-      <w:hyperlink w:history="1" r:id="rIda4myhfwqcbzgbd4noh9i0">
+      <w:hyperlink w:history="1" r:id="rIdfbkdhh3_sqqg3f31vtsnp">
         <w:r>
           <w:rPr>
             <w:rStyle w:val="Hyperlink"/>
@@ -16133,7 +16203,7 @@
         </w:rPr>
         <w:t xml:space="preserve">19　</w:t>
       </w:r>
-      <w:hyperlink w:history="1" r:id="rId_ykjgzelalcst1yrjxjim">
+      <w:hyperlink w:history="1" r:id="rIdupleiye3aaeshuzmot-9w">
         <w:r>
           <w:rPr>
             <w:rStyle w:val="Hyperlink"/>
@@ -16159,7 +16229,7 @@
         </w:rPr>
         <w:t xml:space="preserve">20　</w:t>
       </w:r>
-      <w:hyperlink w:history="1" r:id="rId5m5yindbvrr2skda_kbhu">
+      <w:hyperlink w:history="1" r:id="rIdiwy5hy0gnuzljwm0ywasm">
         <w:r>
           <w:rPr>
             <w:rStyle w:val="Hyperlink"/>
@@ -16185,7 +16255,7 @@
         </w:rPr>
         <w:t xml:space="preserve">21　</w:t>
       </w:r>
-      <w:hyperlink w:history="1" r:id="rId4-5b-4b1ddyxhsb8za09r">
+      <w:hyperlink w:history="1" r:id="rIdbkkywx0krazc8wceqbaed">
         <w:r>
           <w:rPr>
             <w:rStyle w:val="Hyperlink"/>
@@ -16575,7 +16645,7 @@
         </w:rPr>
         <w:t xml:space="preserve">1, 3　</w:t>
       </w:r>
-      <w:hyperlink w:history="1" r:id="rIdebjevpasu5cg6vya1gjag">
+      <w:hyperlink w:history="1" r:id="rIdwwomvhnbiofxx-zjtfxgj">
         <w:r>
           <w:rPr>
             <w:rStyle w:val="Hyperlink"/>
@@ -16601,7 +16671,7 @@
         </w:rPr>
         <w:t xml:space="preserve">2　</w:t>
       </w:r>
-      <w:hyperlink w:history="1" r:id="rIdlu4vdqj2c0eewdxm7bacg">
+      <w:hyperlink w:history="1" r:id="rIdygpnnbscuaezqz0remxsn">
         <w:r>
           <w:rPr>
             <w:rStyle w:val="Hyperlink"/>
@@ -16627,7 +16697,7 @@
         </w:rPr>
         <w:t xml:space="preserve">4　</w:t>
       </w:r>
-      <w:hyperlink w:history="1" r:id="rIdksyuvjyrw2hwwvgpbo_g5">
+      <w:hyperlink w:history="1" r:id="rIdoqlyog9kta9h3gtamn1d1">
         <w:r>
           <w:rPr>
             <w:rStyle w:val="Hyperlink"/>

</xml_diff>

<commit_message>
checklist QC: resolve fabricated batch (66) - QC_REVIEW now 0 pending
55 removed/rephrased (unsupported obligations, qualifiers like 書面/專業/維護/法定, fabricated table cells/columns, modal upgrades 不得->不應, injected law names, entity over-narrowing). 11 kept (pure readability purpose clauses 以X/協助X, no new obligation, per Leonard QC-note principle). All source-verified against checklist.json items.

ALL 128 verify_issues across sen/gifted/gov_admin/qa_inspection now resolved (114 edited, 1 verified-correct, 1 wont-fix, 12 kept-as-is). docx regenerated + grep-verified.

Co-Authored-By: Claude Fable 5 <noreply@anthropic.com>
</commit_message>
<xml_diff>
--- a/dev/checklists/gifted/本校資優教育政策_學校版_DRAFT.docx
+++ b/dev/checklists/gifted/本校資優教育政策_學校版_DRAFT.docx
@@ -683,7 +683,7 @@
           <w:sz w:val="22"/>
           <w:szCs w:val="22"/>
         </w:rPr>
-        <w:t xml:space="preserve">本校認同培育資優學生是照顧學生多樣性的重要一環，亦是優質教育不可或缺的組成部分。資優教育必須普及化，本校有責任發展及推行資優教育，確保資優與非資優學生的基本學習需要均獲得照顧。</w:t>
+        <w:t xml:space="preserve">本校認同培育資優學生是照顧學生多樣性的重要一環，亦是優質教育的一環。資優教育必須普及化，本校有責任發展及推行資優教育，確保資優與非資優學生的基本學習需要均獲得照顧。</w:t>
       </w:r>
       <w:r>
         <w:rPr>
@@ -735,7 +735,7 @@
           <w:sz w:val="22"/>
           <w:szCs w:val="22"/>
         </w:rPr>
-        <w:t xml:space="preserve">本校採用「三層架構推行模式」，有系統、有策略地發掘和培育資賦優異的學生。三層架構推行模式順應從「識別潛能」（第一層：浮尖）到「發展才能」（第二層及第三層：展才）的邏輯順序，同時體現「資優教育普及化」和「普及教育資優化」兩個核心概念。本校資優教育政策以校本方式全面、均衡地培育資優學生的卓越潛能，各層職能如下。</w:t>
+        <w:t xml:space="preserve">本校採用「三層架構推行模式」，有系統、有策略地發掘和培育資賦優異的學生。三層架構推行模式順應從「識別潛能」（第一層：浮尖）到「發展才能」（第二層及第三層：展才）的邏輯順序，同時體現「資優教育普及化」和「普及教育資優化」兩個概念。本校資優教育政策以校本方式全面、均衡地培育資優學生的卓越潛能，各層職能如下。</w:t>
       </w:r>
       <w:r>
         <w:rPr>
@@ -2277,7 +2277,7 @@
         </w:rPr>
         <w:t xml:space="preserve">1　</w:t>
       </w:r>
-      <w:hyperlink w:history="1" r:id="rIdfvuggv-ds4ja9ig0_ggsu">
+      <w:hyperlink w:history="1" r:id="rIdh96c2gnchtgq1eg4pjbvm">
         <w:r>
           <w:rPr>
             <w:rStyle w:val="Hyperlink"/>
@@ -2303,7 +2303,7 @@
         </w:rPr>
         <w:t xml:space="preserve">2　</w:t>
       </w:r>
-      <w:hyperlink w:history="1" r:id="rIdqdzyysbthtyx-1urk0o27">
+      <w:hyperlink w:history="1" r:id="rId4iue9qkg1onc_tepvc8zn">
         <w:r>
           <w:rPr>
             <w:rStyle w:val="Hyperlink"/>
@@ -2329,7 +2329,7 @@
         </w:rPr>
         <w:t xml:space="preserve">3, 14　</w:t>
       </w:r>
-      <w:hyperlink w:history="1" r:id="rId1sayp59txks2vu_s7nnsb">
+      <w:hyperlink w:history="1" r:id="rIdgtg8vw9svmgmht6raido4">
         <w:r>
           <w:rPr>
             <w:rStyle w:val="Hyperlink"/>
@@ -2355,7 +2355,7 @@
         </w:rPr>
         <w:t xml:space="preserve">4　</w:t>
       </w:r>
-      <w:hyperlink w:history="1" r:id="rIdpduhksulghnho6prowq0h">
+      <w:hyperlink w:history="1" r:id="rIdjoiqnrgsse4jfocw395yu">
         <w:r>
           <w:rPr>
             <w:rStyle w:val="Hyperlink"/>
@@ -2381,7 +2381,7 @@
         </w:rPr>
         <w:t xml:space="preserve">5　</w:t>
       </w:r>
-      <w:hyperlink w:history="1" r:id="rIdnzgqowzychxyau5pxdn4p">
+      <w:hyperlink w:history="1" r:id="rIdwi6pov9n61mq3nqaggofp">
         <w:r>
           <w:rPr>
             <w:rStyle w:val="Hyperlink"/>
@@ -2407,7 +2407,7 @@
         </w:rPr>
         <w:t xml:space="preserve">6　</w:t>
       </w:r>
-      <w:hyperlink w:history="1" r:id="rIdmaow-hucrdttb_i5styy5">
+      <w:hyperlink w:history="1" r:id="rIdqfa1--gva9icbeonx7bpw">
         <w:r>
           <w:rPr>
             <w:rStyle w:val="Hyperlink"/>
@@ -2433,7 +2433,7 @@
         </w:rPr>
         <w:t xml:space="preserve">7　</w:t>
       </w:r>
-      <w:hyperlink w:history="1" r:id="rId7ne6u2id5f8zye1g6plme">
+      <w:hyperlink w:history="1" r:id="rId_89wepnck181lujda_30z">
         <w:r>
           <w:rPr>
             <w:rStyle w:val="Hyperlink"/>
@@ -2459,7 +2459,7 @@
         </w:rPr>
         <w:t xml:space="preserve">8　</w:t>
       </w:r>
-      <w:hyperlink w:history="1" r:id="rIduz8krsbt0mddya3ttarc2">
+      <w:hyperlink w:history="1" r:id="rIdx5n7-1xax4qgi-wrhhov1">
         <w:r>
           <w:rPr>
             <w:rStyle w:val="Hyperlink"/>
@@ -2485,7 +2485,7 @@
         </w:rPr>
         <w:t xml:space="preserve">9, 12　</w:t>
       </w:r>
-      <w:hyperlink w:history="1" r:id="rId47o4gbzyf8lregae9uop7">
+      <w:hyperlink w:history="1" r:id="rIda7ntzaxzyjoziyfmchoso">
         <w:r>
           <w:rPr>
             <w:rStyle w:val="Hyperlink"/>
@@ -2511,7 +2511,7 @@
         </w:rPr>
         <w:t xml:space="preserve">10　</w:t>
       </w:r>
-      <w:hyperlink w:history="1" r:id="rIdgbkg9c9xfqohlamckgjsa">
+      <w:hyperlink w:history="1" r:id="rId1wfrzrgzb4df8n5-wugq1">
         <w:r>
           <w:rPr>
             <w:rStyle w:val="Hyperlink"/>
@@ -2537,7 +2537,7 @@
         </w:rPr>
         <w:t xml:space="preserve">11　</w:t>
       </w:r>
-      <w:hyperlink w:history="1" r:id="rIdvyrwjnk34mxffc_pysf6u">
+      <w:hyperlink w:history="1" r:id="rIdker0iytjk5xbnb1qgnhmp">
         <w:r>
           <w:rPr>
             <w:rStyle w:val="Hyperlink"/>
@@ -2563,7 +2563,7 @@
         </w:rPr>
         <w:t xml:space="preserve">13　</w:t>
       </w:r>
-      <w:hyperlink w:history="1" r:id="rIdkzzfn3b9tak-cvuw55x-x">
+      <w:hyperlink w:history="1" r:id="rIdppsp_utmxnpxdikqn-8ph">
         <w:r>
           <w:rPr>
             <w:rStyle w:val="Hyperlink"/>
@@ -2589,7 +2589,7 @@
         </w:rPr>
         <w:t xml:space="preserve">15　</w:t>
       </w:r>
-      <w:hyperlink w:history="1" r:id="rId1dx1cxhb2yzz6bamchhyo">
+      <w:hyperlink w:history="1" r:id="rId6mof8t_y62f1seb3z_lam">
         <w:r>
           <w:rPr>
             <w:rStyle w:val="Hyperlink"/>
@@ -2615,7 +2615,7 @@
         </w:rPr>
         <w:t xml:space="preserve">16　</w:t>
       </w:r>
-      <w:hyperlink w:history="1" r:id="rIdguth164scehlnnwedc1y0">
+      <w:hyperlink w:history="1" r:id="rIdlllmpvg_elso9oo_ygmsh">
         <w:r>
           <w:rPr>
             <w:rStyle w:val="Hyperlink"/>
@@ -2641,7 +2641,7 @@
         </w:rPr>
         <w:t xml:space="preserve">17　</w:t>
       </w:r>
-      <w:hyperlink w:history="1" r:id="rId_cskuiue4b5r8gp6z8ms9">
+      <w:hyperlink w:history="1" r:id="rId8apyzpidtxgos-4bho94b">
         <w:r>
           <w:rPr>
             <w:rStyle w:val="Hyperlink"/>
@@ -2667,7 +2667,7 @@
         </w:rPr>
         <w:t xml:space="preserve">18　</w:t>
       </w:r>
-      <w:hyperlink w:history="1" r:id="rIdp_uov8b8ubcebfmp1bmuc">
+      <w:hyperlink w:history="1" r:id="rId4p-jsou8q-my__iqcbwm0">
         <w:r>
           <w:rPr>
             <w:rStyle w:val="Hyperlink"/>
@@ -2693,7 +2693,7 @@
         </w:rPr>
         <w:t xml:space="preserve">19　</w:t>
       </w:r>
-      <w:hyperlink w:history="1" r:id="rIdlnombssczoo1s_ivp0jj5">
+      <w:hyperlink w:history="1" r:id="rIdlrjklmw2dei7z24ve0p5l">
         <w:r>
           <w:rPr>
             <w:rStyle w:val="Hyperlink"/>
@@ -3367,7 +3367,7 @@
           <w:sz w:val="22"/>
           <w:szCs w:val="22"/>
         </w:rPr>
-        <w:t xml:space="preserve">本校採用以下三個層次推行資優教育，各層次的執行要求如下：</w:t>
+        <w:t xml:space="preserve">本校採用以下兩個層次推行資優教育，各層次的執行要求如下：</w:t>
       </w:r>
       <w:r>
         <w:rPr>
@@ -3673,89 +3673,6 @@
           </w:p>
         </w:tc>
       </w:tr>
-      <w:tr>
-        <w:tc>
-          <w:tcPr>
-            <w:tcW w:type="dxa" w:w="2400"/>
-            <w:tcBorders>
-              <w:top w:val="single" w:color="BBBBBB" w:sz="1"/>
-              <w:left w:val="single" w:color="BBBBBB" w:sz="1"/>
-              <w:bottom w:val="single" w:color="BBBBBB" w:sz="1"/>
-              <w:right w:val="single" w:color="BBBBBB" w:sz="1"/>
-            </w:tcBorders>
-            <w:tcMar>
-              <w:top w:type="dxa" w:w="80"/>
-              <w:left w:type="dxa" w:w="120"/>
-              <w:bottom w:type="dxa" w:w="80"/>
-              <w:right w:type="dxa" w:w="120"/>
-            </w:tcMar>
-          </w:tcPr>
-          <w:p>
-            <w:r>
-              <w:rPr>
-                <w:rFonts w:ascii="Microsoft JhengHei" w:cs="Microsoft JhengHei" w:eastAsia="Microsoft JhengHei" w:hAnsi="Microsoft JhengHei"/>
-                <w:sz w:val="20"/>
-                <w:szCs w:val="20"/>
-              </w:rPr>
-              <w:t xml:space="preserve">第三層次</w:t>
-            </w:r>
-          </w:p>
-        </w:tc>
-        <w:tc>
-          <w:tcPr>
-            <w:tcW w:type="dxa" w:w="4426"/>
-            <w:tcBorders>
-              <w:top w:val="single" w:color="BBBBBB" w:sz="1"/>
-              <w:left w:val="single" w:color="BBBBBB" w:sz="1"/>
-              <w:bottom w:val="single" w:color="BBBBBB" w:sz="1"/>
-              <w:right w:val="single" w:color="BBBBBB" w:sz="1"/>
-            </w:tcBorders>
-            <w:tcMar>
-              <w:top w:type="dxa" w:w="80"/>
-              <w:left w:type="dxa" w:w="120"/>
-              <w:bottom w:type="dxa" w:w="80"/>
-              <w:right w:type="dxa" w:w="120"/>
-            </w:tcMar>
-          </w:tcPr>
-          <w:p>
-            <w:r>
-              <w:rPr>
-                <w:rFonts w:ascii="Microsoft JhengHei" w:cs="Microsoft JhengHei" w:eastAsia="Microsoft JhengHei" w:hAnsi="Microsoft JhengHei"/>
-                <w:sz w:val="20"/>
-                <w:szCs w:val="20"/>
-              </w:rPr>
-              <w:t xml:space="preserve">校外支援（按校情而定）</w:t>
-            </w:r>
-          </w:p>
-        </w:tc>
-        <w:tc>
-          <w:tcPr>
-            <w:tcW w:type="dxa" w:w="2200"/>
-            <w:tcBorders>
-              <w:top w:val="single" w:color="BBBBBB" w:sz="1"/>
-              <w:left w:val="single" w:color="BBBBBB" w:sz="1"/>
-              <w:bottom w:val="single" w:color="BBBBBB" w:sz="1"/>
-              <w:right w:val="single" w:color="BBBBBB" w:sz="1"/>
-            </w:tcBorders>
-            <w:tcMar>
-              <w:top w:type="dxa" w:w="80"/>
-              <w:left w:type="dxa" w:w="120"/>
-              <w:bottom w:type="dxa" w:w="80"/>
-              <w:right w:type="dxa" w:w="120"/>
-            </w:tcMar>
-          </w:tcPr>
-          <w:p>
-            <w:r>
-              <w:rPr>
-                <w:rFonts w:ascii="Microsoft JhengHei" w:cs="Microsoft JhengHei" w:eastAsia="Microsoft JhengHei" w:hAnsi="Microsoft JhengHei"/>
-                <w:sz w:val="20"/>
-                <w:szCs w:val="20"/>
-              </w:rPr>
-              <w:t xml:space="preserve">按實際情況統籌安排</w:t>
-            </w:r>
-          </w:p>
-        </w:tc>
-      </w:tr>
     </w:tbl>
     <w:p>
       <w:pPr>
@@ -4741,7 +4658,7 @@
         </w:rPr>
         <w:t xml:space="preserve">1, 2, 4, 6, 14, 15, 16　</w:t>
       </w:r>
-      <w:hyperlink w:history="1" r:id="rIdh3dssbrnlbznkqmd7a81y">
+      <w:hyperlink w:history="1" r:id="rIdowfioi_cw4nokyemz3q51">
         <w:r>
           <w:rPr>
             <w:rStyle w:val="Hyperlink"/>
@@ -4767,7 +4684,7 @@
         </w:rPr>
         <w:t xml:space="preserve">3　</w:t>
       </w:r>
-      <w:hyperlink w:history="1" r:id="rIduq7pmqzhbe4esqrts5axf">
+      <w:hyperlink w:history="1" r:id="rIdqincajof3exyufzloymwv">
         <w:r>
           <w:rPr>
             <w:rStyle w:val="Hyperlink"/>
@@ -4793,7 +4710,7 @@
         </w:rPr>
         <w:t xml:space="preserve">5　</w:t>
       </w:r>
-      <w:hyperlink w:history="1" r:id="rIdcgu5ju2gwl_dbbejwc9jj">
+      <w:hyperlink w:history="1" r:id="rId7okj3jl4vf_16gr7czhax">
         <w:r>
           <w:rPr>
             <w:rStyle w:val="Hyperlink"/>
@@ -4819,7 +4736,7 @@
         </w:rPr>
         <w:t xml:space="preserve">7　</w:t>
       </w:r>
-      <w:hyperlink w:history="1" r:id="rIdtyf0j1abgoek37xg9sed_">
+      <w:hyperlink w:history="1" r:id="rIddkwtusxpdhklutuw-p_0i">
         <w:r>
           <w:rPr>
             <w:rStyle w:val="Hyperlink"/>
@@ -4845,7 +4762,7 @@
         </w:rPr>
         <w:t xml:space="preserve">8, 11　</w:t>
       </w:r>
-      <w:hyperlink w:history="1" r:id="rIdthay2p9djfdcvxzkkbbqm">
+      <w:hyperlink w:history="1" r:id="rIdoy362jfsv89qsyvy1qs6u">
         <w:r>
           <w:rPr>
             <w:rStyle w:val="Hyperlink"/>
@@ -4871,7 +4788,7 @@
         </w:rPr>
         <w:t xml:space="preserve">9　</w:t>
       </w:r>
-      <w:hyperlink w:history="1" r:id="rIdrkp_uuvzz1thqwz6vyao-">
+      <w:hyperlink w:history="1" r:id="rIdwtc95r2rsyx4mwjbiwzug">
         <w:r>
           <w:rPr>
             <w:rStyle w:val="Hyperlink"/>
@@ -4897,7 +4814,7 @@
         </w:rPr>
         <w:t xml:space="preserve">10　</w:t>
       </w:r>
-      <w:hyperlink w:history="1" r:id="rId09q7da0f7restlr0p6y7p">
+      <w:hyperlink w:history="1" r:id="rIdgyk59ecin7z7zqnruuszh">
         <w:r>
           <w:rPr>
             <w:rStyle w:val="Hyperlink"/>
@@ -4923,7 +4840,7 @@
         </w:rPr>
         <w:t xml:space="preserve">12　</w:t>
       </w:r>
-      <w:hyperlink w:history="1" r:id="rIdqbey0pjk7xcbuux-wwm6m">
+      <w:hyperlink w:history="1" r:id="rIdnj0-vll4frpfckv9bjea-">
         <w:r>
           <w:rPr>
             <w:rStyle w:val="Hyperlink"/>
@@ -4949,7 +4866,7 @@
         </w:rPr>
         <w:t xml:space="preserve">13　</w:t>
       </w:r>
-      <w:hyperlink w:history="1" r:id="rIdk9phidbc8dkymvhmmvg6f">
+      <w:hyperlink w:history="1" r:id="rId7ukvezzqofz4rn6hepnyu">
         <w:r>
           <w:rPr>
             <w:rStyle w:val="Hyperlink"/>
@@ -4975,7 +4892,7 @@
         </w:rPr>
         <w:t xml:space="preserve">17　</w:t>
       </w:r>
-      <w:hyperlink w:history="1" r:id="rId-mijavlpqodylm0vip7ys">
+      <w:hyperlink w:history="1" r:id="rIdetl7k7i6t9qsha9utzn_m">
         <w:r>
           <w:rPr>
             <w:rStyle w:val="Hyperlink"/>
@@ -5001,7 +4918,7 @@
         </w:rPr>
         <w:t xml:space="preserve">18　</w:t>
       </w:r>
-      <w:hyperlink w:history="1" r:id="rIdod79va6fd0rd-7jobnjih">
+      <w:hyperlink w:history="1" r:id="rIdtoj-vnf_yb9zrpiyaehai">
         <w:r>
           <w:rPr>
             <w:rStyle w:val="Hyperlink"/>
@@ -5027,7 +4944,7 @@
         </w:rPr>
         <w:t xml:space="preserve">19　</w:t>
       </w:r>
-      <w:hyperlink w:history="1" r:id="rId93rsa4c7qxfur3kr8dcb6">
+      <w:hyperlink w:history="1" r:id="rId5b-4jusczcrjroadhr_cm">
         <w:r>
           <w:rPr>
             <w:rStyle w:val="Hyperlink"/>
@@ -5053,7 +4970,7 @@
         </w:rPr>
         <w:t xml:space="preserve">20　</w:t>
       </w:r>
-      <w:hyperlink w:history="1" r:id="rId8lcieuicvzdxlqkrtcww8">
+      <w:hyperlink w:history="1" r:id="rId1sk_flqngpaawzl9gkr5g">
         <w:r>
           <w:rPr>
             <w:rStyle w:val="Hyperlink"/>
@@ -5079,7 +4996,7 @@
         </w:rPr>
         <w:t xml:space="preserve">21　</w:t>
       </w:r>
-      <w:hyperlink w:history="1" r:id="rIdt39cbexgymmxjcxhabwd2">
+      <w:hyperlink w:history="1" r:id="rIduimm0clfgxa11kmetcae2">
         <w:r>
           <w:rPr>
             <w:rStyle w:val="Hyperlink"/>
@@ -7090,7 +7007,7 @@
         </w:rPr>
         <w:t xml:space="preserve">1, 4, 12　</w:t>
       </w:r>
-      <w:hyperlink w:history="1" r:id="rIdeyqdmgwmzz2ch7qsglmx4">
+      <w:hyperlink w:history="1" r:id="rIdqttnlpvbxszl89xi6sq7u">
         <w:r>
           <w:rPr>
             <w:rStyle w:val="Hyperlink"/>
@@ -7116,7 +7033,7 @@
         </w:rPr>
         <w:t xml:space="preserve">2, 7, 13, 43　</w:t>
       </w:r>
-      <w:hyperlink w:history="1" r:id="rIdgllsefbtgpewth9nnfw23">
+      <w:hyperlink w:history="1" r:id="rIdkls4in36az26vbukemhuw">
         <w:r>
           <w:rPr>
             <w:rStyle w:val="Hyperlink"/>
@@ -7142,7 +7059,7 @@
         </w:rPr>
         <w:t xml:space="preserve">3　</w:t>
       </w:r>
-      <w:hyperlink w:history="1" r:id="rId4zj2ovlbu3lal-5q-ggkh">
+      <w:hyperlink w:history="1" r:id="rId-dwvlrhxqjr7juxf-bokk">
         <w:r>
           <w:rPr>
             <w:rStyle w:val="Hyperlink"/>
@@ -7168,7 +7085,7 @@
         </w:rPr>
         <w:t xml:space="preserve">5　</w:t>
       </w:r>
-      <w:hyperlink w:history="1" r:id="rIda_tqdrgf5iz27lqbl7wwo">
+      <w:hyperlink w:history="1" r:id="rIdkzd-5ins_0enkjbysbiia">
         <w:r>
           <w:rPr>
             <w:rStyle w:val="Hyperlink"/>
@@ -7194,7 +7111,7 @@
         </w:rPr>
         <w:t xml:space="preserve">6　</w:t>
       </w:r>
-      <w:hyperlink w:history="1" r:id="rIdgfgx0c3xp68t-osjx8dli">
+      <w:hyperlink w:history="1" r:id="rId9eweh89s6bppcumfp-c5n">
         <w:r>
           <w:rPr>
             <w:rStyle w:val="Hyperlink"/>
@@ -7220,7 +7137,7 @@
         </w:rPr>
         <w:t xml:space="preserve">8, 24　</w:t>
       </w:r>
-      <w:hyperlink w:history="1" r:id="rIdcjkqv7njeua_s_4kdhwwq">
+      <w:hyperlink w:history="1" r:id="rIdxnkriwzb5ubta-homxolh">
         <w:r>
           <w:rPr>
             <w:rStyle w:val="Hyperlink"/>
@@ -7246,7 +7163,7 @@
         </w:rPr>
         <w:t xml:space="preserve">9, 26　</w:t>
       </w:r>
-      <w:hyperlink w:history="1" r:id="rIdne91u-eawljeiylxqkisx">
+      <w:hyperlink w:history="1" r:id="rIdo48g1kj_jcbwebsbt598t">
         <w:r>
           <w:rPr>
             <w:rStyle w:val="Hyperlink"/>
@@ -7272,7 +7189,7 @@
         </w:rPr>
         <w:t xml:space="preserve">10　</w:t>
       </w:r>
-      <w:hyperlink w:history="1" r:id="rId81ngizg-zdgmvupqkweux">
+      <w:hyperlink w:history="1" r:id="rId_8uq0as3npeo0s4ty33vt">
         <w:r>
           <w:rPr>
             <w:rStyle w:val="Hyperlink"/>
@@ -7298,7 +7215,7 @@
         </w:rPr>
         <w:t xml:space="preserve">11　</w:t>
       </w:r>
-      <w:hyperlink w:history="1" r:id="rIdvqtjcr6wozyb_zxl5mwla">
+      <w:hyperlink w:history="1" r:id="rIdryg3lhcdkmkre76mplhh_">
         <w:r>
           <w:rPr>
             <w:rStyle w:val="Hyperlink"/>
@@ -7324,7 +7241,7 @@
         </w:rPr>
         <w:t xml:space="preserve">14　</w:t>
       </w:r>
-      <w:hyperlink w:history="1" r:id="rIdkm5y0t_r4feps7b16ky0x">
+      <w:hyperlink w:history="1" r:id="rIdpbticg3uuey2nand3o-x-">
         <w:r>
           <w:rPr>
             <w:rStyle w:val="Hyperlink"/>
@@ -7350,7 +7267,7 @@
         </w:rPr>
         <w:t xml:space="preserve">15　</w:t>
       </w:r>
-      <w:hyperlink w:history="1" r:id="rIdb2q4ivptg3sdf8u7tgkwd">
+      <w:hyperlink w:history="1" r:id="rId5ivitvlrvpb0b6e-kwvb-">
         <w:r>
           <w:rPr>
             <w:rStyle w:val="Hyperlink"/>
@@ -7376,7 +7293,7 @@
         </w:rPr>
         <w:t xml:space="preserve">16, 27, 32　</w:t>
       </w:r>
-      <w:hyperlink w:history="1" r:id="rIdfown4itex43far2xvcfp_">
+      <w:hyperlink w:history="1" r:id="rIdqrp5fvkt02qlk4yrc1uij">
         <w:r>
           <w:rPr>
             <w:rStyle w:val="Hyperlink"/>
@@ -7402,7 +7319,7 @@
         </w:rPr>
         <w:t xml:space="preserve">17, 20　</w:t>
       </w:r>
-      <w:hyperlink w:history="1" r:id="rIdb-eqbsnpjzmlfdush88yo">
+      <w:hyperlink w:history="1" r:id="rIdr4fz7fl6xozthnlje808z">
         <w:r>
           <w:rPr>
             <w:rStyle w:val="Hyperlink"/>
@@ -7428,7 +7345,7 @@
         </w:rPr>
         <w:t xml:space="preserve">18, 21, 35, 41, 42　</w:t>
       </w:r>
-      <w:hyperlink w:history="1" r:id="rIdykptndoy5gcgath3jymti">
+      <w:hyperlink w:history="1" r:id="rIdgihbm-ppmoxoo05q7p7zg">
         <w:r>
           <w:rPr>
             <w:rStyle w:val="Hyperlink"/>
@@ -7454,7 +7371,7 @@
         </w:rPr>
         <w:t xml:space="preserve">19　</w:t>
       </w:r>
-      <w:hyperlink w:history="1" r:id="rIdcbq9t1cxgfhleii4iilp5">
+      <w:hyperlink w:history="1" r:id="rId_0kfpjihs4ov3s6nfz8-n">
         <w:r>
           <w:rPr>
             <w:rStyle w:val="Hyperlink"/>
@@ -7480,7 +7397,7 @@
         </w:rPr>
         <w:t xml:space="preserve">22　</w:t>
       </w:r>
-      <w:hyperlink w:history="1" r:id="rIdkqtwqfgcz2zk6me7xra4j">
+      <w:hyperlink w:history="1" r:id="rIdssdkqfae8s-tq_psd1ywq">
         <w:r>
           <w:rPr>
             <w:rStyle w:val="Hyperlink"/>
@@ -7506,7 +7423,7 @@
         </w:rPr>
         <w:t xml:space="preserve">23　</w:t>
       </w:r>
-      <w:hyperlink w:history="1" r:id="rIdz1ipoehq7m5tqvrwzevq_">
+      <w:hyperlink w:history="1" r:id="rIdgzccmc0qb-hkstnphr96g">
         <w:r>
           <w:rPr>
             <w:rStyle w:val="Hyperlink"/>
@@ -7532,7 +7449,7 @@
         </w:rPr>
         <w:t xml:space="preserve">25　</w:t>
       </w:r>
-      <w:hyperlink w:history="1" r:id="rId7howkkj6dxrxxsvafuuvb">
+      <w:hyperlink w:history="1" r:id="rIdsoxs8uc5rdszc49hslue2">
         <w:r>
           <w:rPr>
             <w:rStyle w:val="Hyperlink"/>
@@ -7558,7 +7475,7 @@
         </w:rPr>
         <w:t xml:space="preserve">28　</w:t>
       </w:r>
-      <w:hyperlink w:history="1" r:id="rIdcoo0hot6fij7b5s8zd_4m">
+      <w:hyperlink w:history="1" r:id="rIdh0jjwvuqzhr2p4jiaavmc">
         <w:r>
           <w:rPr>
             <w:rStyle w:val="Hyperlink"/>
@@ -7584,7 +7501,7 @@
         </w:rPr>
         <w:t xml:space="preserve">29　</w:t>
       </w:r>
-      <w:hyperlink w:history="1" r:id="rIdziyqlexbwjqq2cuwfnqaf">
+      <w:hyperlink w:history="1" r:id="rIduxiqchovgfdbd-q0ntsxr">
         <w:r>
           <w:rPr>
             <w:rStyle w:val="Hyperlink"/>
@@ -7610,7 +7527,7 @@
         </w:rPr>
         <w:t xml:space="preserve">30　</w:t>
       </w:r>
-      <w:hyperlink w:history="1" r:id="rIdcu3wz0pmvwfb73uezujms">
+      <w:hyperlink w:history="1" r:id="rIdny09zsiooohmtwig0bfw4">
         <w:r>
           <w:rPr>
             <w:rStyle w:val="Hyperlink"/>
@@ -7636,7 +7553,7 @@
         </w:rPr>
         <w:t xml:space="preserve">31　</w:t>
       </w:r>
-      <w:hyperlink w:history="1" r:id="rIdtouacc1sarj_ivttszuto">
+      <w:hyperlink w:history="1" r:id="rIdvn47au9rnlkkadv7ft1it">
         <w:r>
           <w:rPr>
             <w:rStyle w:val="Hyperlink"/>
@@ -7662,7 +7579,7 @@
         </w:rPr>
         <w:t xml:space="preserve">33　</w:t>
       </w:r>
-      <w:hyperlink w:history="1" r:id="rIdjhoca58kyi168fzqywksq">
+      <w:hyperlink w:history="1" r:id="rIdxqzslyxpyjsoa_rzohbv8">
         <w:r>
           <w:rPr>
             <w:rStyle w:val="Hyperlink"/>
@@ -7688,7 +7605,7 @@
         </w:rPr>
         <w:t xml:space="preserve">34　</w:t>
       </w:r>
-      <w:hyperlink w:history="1" r:id="rIdg4iwbzq5ybxceegt41oi4">
+      <w:hyperlink w:history="1" r:id="rId-mezlnndih8dfa8uofcav">
         <w:r>
           <w:rPr>
             <w:rStyle w:val="Hyperlink"/>
@@ -7714,7 +7631,7 @@
         </w:rPr>
         <w:t xml:space="preserve">36, 40　</w:t>
       </w:r>
-      <w:hyperlink w:history="1" r:id="rIdyxj3pgrukd_1msisctqqc">
+      <w:hyperlink w:history="1" r:id="rIdomjfbevppighzzaiqitw7">
         <w:r>
           <w:rPr>
             <w:rStyle w:val="Hyperlink"/>
@@ -7740,7 +7657,7 @@
         </w:rPr>
         <w:t xml:space="preserve">37　</w:t>
       </w:r>
-      <w:hyperlink w:history="1" r:id="rIdqtelvweh2d6n9an1kxxom">
+      <w:hyperlink w:history="1" r:id="rIdaonaphlpg1frwmdia468e">
         <w:r>
           <w:rPr>
             <w:rStyle w:val="Hyperlink"/>
@@ -7766,7 +7683,7 @@
         </w:rPr>
         <w:t xml:space="preserve">38　</w:t>
       </w:r>
-      <w:hyperlink w:history="1" r:id="rIdhvgtefog7rqro9mu45htk">
+      <w:hyperlink w:history="1" r:id="rIdurlljwhhamfwktpl61ec2">
         <w:r>
           <w:rPr>
             <w:rStyle w:val="Hyperlink"/>
@@ -7792,7 +7709,7 @@
         </w:rPr>
         <w:t xml:space="preserve">39　</w:t>
       </w:r>
-      <w:hyperlink w:history="1" r:id="rId52ye1sl3zscsxkifln8_h">
+      <w:hyperlink w:history="1" r:id="rIdjs0ndpv8igx6vsgz30cyq">
         <w:r>
           <w:rPr>
             <w:rStyle w:val="Hyperlink"/>
@@ -7818,7 +7735,7 @@
         </w:rPr>
         <w:t xml:space="preserve">44　</w:t>
       </w:r>
-      <w:hyperlink w:history="1" r:id="rIdurf_4no0ii3qoz4vn3qsl">
+      <w:hyperlink w:history="1" r:id="rId0e7z49qrtsujfwxctumat">
         <w:r>
           <w:rPr>
             <w:rStyle w:val="Hyperlink"/>
@@ -7844,7 +7761,7 @@
         </w:rPr>
         <w:t xml:space="preserve">45　</w:t>
       </w:r>
-      <w:hyperlink w:history="1" r:id="rIdufa-y4la2jgkojgr4qagn">
+      <w:hyperlink w:history="1" r:id="rIdyqg9y4kra8k-30jtt9vbb">
         <w:r>
           <w:rPr>
             <w:rStyle w:val="Hyperlink"/>
@@ -8623,7 +8540,7 @@
         </w:rPr>
         <w:t xml:space="preserve">1, 4, 6　</w:t>
       </w:r>
-      <w:hyperlink w:history="1" r:id="rIdc-eh-wwsu1ilxr-ffreuy">
+      <w:hyperlink w:history="1" r:id="rId1mnbty_k8txocsfy7uzp3">
         <w:r>
           <w:rPr>
             <w:rStyle w:val="Hyperlink"/>
@@ -8649,7 +8566,7 @@
         </w:rPr>
         <w:t xml:space="preserve">2　</w:t>
       </w:r>
-      <w:hyperlink w:history="1" r:id="rIdths3y1jbhwtzmwt4qmjcq">
+      <w:hyperlink w:history="1" r:id="rIdjbag19qbf4v2hq0kzzgsd">
         <w:r>
           <w:rPr>
             <w:rStyle w:val="Hyperlink"/>
@@ -8675,7 +8592,7 @@
         </w:rPr>
         <w:t xml:space="preserve">3　</w:t>
       </w:r>
-      <w:hyperlink w:history="1" r:id="rIdkcasnzxnhcexe5_tnmr9j">
+      <w:hyperlink w:history="1" r:id="rIdxaw4rinldqcbjt7beptz2">
         <w:r>
           <w:rPr>
             <w:rStyle w:val="Hyperlink"/>
@@ -8701,7 +8618,7 @@
         </w:rPr>
         <w:t xml:space="preserve">5　</w:t>
       </w:r>
-      <w:hyperlink w:history="1" r:id="rIddn-t8ecw4o-faa_pti8p9">
+      <w:hyperlink w:history="1" r:id="rIdcbgh0ljh9jysxo_gjkq3q">
         <w:r>
           <w:rPr>
             <w:rStyle w:val="Hyperlink"/>
@@ -8727,7 +8644,7 @@
         </w:rPr>
         <w:t xml:space="preserve">7　</w:t>
       </w:r>
-      <w:hyperlink w:history="1" r:id="rIdepan-2kuda7qcmyvqahgh">
+      <w:hyperlink w:history="1" r:id="rIdvhr-eocej7tawtlgcnu3w">
         <w:r>
           <w:rPr>
             <w:rStyle w:val="Hyperlink"/>
@@ -8753,7 +8670,7 @@
         </w:rPr>
         <w:t xml:space="preserve">8　</w:t>
       </w:r>
-      <w:hyperlink w:history="1" r:id="rId6mlqgvuk6i5uh2qobuevc">
+      <w:hyperlink w:history="1" r:id="rIdlq7h7ogk7cehal0ulbmgv">
         <w:r>
           <w:rPr>
             <w:rStyle w:val="Hyperlink"/>
@@ -8779,7 +8696,7 @@
         </w:rPr>
         <w:t xml:space="preserve">9　</w:t>
       </w:r>
-      <w:hyperlink w:history="1" r:id="rIdqr1bj9sdl5etqffkvtc6v">
+      <w:hyperlink w:history="1" r:id="rId_2ptuxz67fff6ybmj8noe">
         <w:r>
           <w:rPr>
             <w:rStyle w:val="Hyperlink"/>
@@ -8805,7 +8722,7 @@
         </w:rPr>
         <w:t xml:space="preserve">10　</w:t>
       </w:r>
-      <w:hyperlink w:history="1" r:id="rId1oikykqlymrdfk6znilom">
+      <w:hyperlink w:history="1" r:id="rId97a7blsw4qs6yztxjptmk">
         <w:r>
           <w:rPr>
             <w:rStyle w:val="Hyperlink"/>
@@ -8831,7 +8748,7 @@
         </w:rPr>
         <w:t xml:space="preserve">11　</w:t>
       </w:r>
-      <w:hyperlink w:history="1" r:id="rId-9xyx0p4mu2mba2x9-gke">
+      <w:hyperlink w:history="1" r:id="rIdkpylh8i6qlgb7fh8va1gq">
         <w:r>
           <w:rPr>
             <w:rStyle w:val="Hyperlink"/>
@@ -8857,7 +8774,7 @@
         </w:rPr>
         <w:t xml:space="preserve">12　</w:t>
       </w:r>
-      <w:hyperlink w:history="1" r:id="rIdc7eml9fh0vhaiwztlvo-0">
+      <w:hyperlink w:history="1" r:id="rId9ygp2w9qpn4zefieilisy">
         <w:r>
           <w:rPr>
             <w:rStyle w:val="Hyperlink"/>
@@ -8883,7 +8800,7 @@
         </w:rPr>
         <w:t xml:space="preserve">13　</w:t>
       </w:r>
-      <w:hyperlink w:history="1" r:id="rIdtets8gajw7jxmz79v-cwj">
+      <w:hyperlink w:history="1" r:id="rIdkfiiafgckmfwipeknrhyp">
         <w:r>
           <w:rPr>
             <w:rStyle w:val="Hyperlink"/>
@@ -8909,7 +8826,7 @@
         </w:rPr>
         <w:t xml:space="preserve">14　</w:t>
       </w:r>
-      <w:hyperlink w:history="1" r:id="rIdtv4hr_lhet2rqrmmkw2ho">
+      <w:hyperlink w:history="1" r:id="rIdbro-uh97f_rs_2gmqnw0z">
         <w:r>
           <w:rPr>
             <w:rStyle w:val="Hyperlink"/>
@@ -8935,7 +8852,7 @@
         </w:rPr>
         <w:t xml:space="preserve">15　</w:t>
       </w:r>
-      <w:hyperlink w:history="1" r:id="rIdsl_8tcbmzyv4tj4quhmy1">
+      <w:hyperlink w:history="1" r:id="rIdapfxek4ciblajcbc97d6n">
         <w:r>
           <w:rPr>
             <w:rStyle w:val="Hyperlink"/>
@@ -8961,7 +8878,7 @@
         </w:rPr>
         <w:t xml:space="preserve">16　</w:t>
       </w:r>
-      <w:hyperlink w:history="1" r:id="rIdc4sgejt89krgukalpcoiq">
+      <w:hyperlink w:history="1" r:id="rIda2zumhi1oiuh3wugkexqo">
         <w:r>
           <w:rPr>
             <w:rStyle w:val="Hyperlink"/>
@@ -9455,7 +9372,7 @@
           <w:sz w:val="22"/>
           <w:szCs w:val="22"/>
         </w:rPr>
-        <w:t xml:space="preserve">本校致力加強教師對資優學生多元潛能及學習需要的掌握，並以此為基礎，持續發展符合本校學生特質的校本資優課程。</w:t>
+        <w:t xml:space="preserve">本校致力加強教師對資優學生多元潛能及學習需要的掌握，並以此為基礎，持續發展校本資優課程。</w:t>
       </w:r>
       <w:r>
         <w:rPr>
@@ -9902,7 +9819,7 @@
           <w:sz w:val="22"/>
           <w:szCs w:val="22"/>
         </w:rPr>
-        <w:t xml:space="preserve">本校應為資優學生訂定個人化的教育目標及學習計劃，並定期檢討進度。同時，本校應為資優學生實施濃縮課程，將正規課程有系統地加以濃縮，並加入更具挑戰性的學習活動。相關計劃應涵蓋下列各項：</w:t>
+        <w:t xml:space="preserve">本校應為資優學生訂定教育目標及學習計劃，並定期檢討進度。同時，本校應為資優學生實施濃縮課程，將正規課程有系統地加以濃縮，並加入更具挑戰性的學習活動。相關計劃應涵蓋下列各項：</w:t>
       </w:r>
       <w:r>
         <w:rPr>
@@ -10667,7 +10584,7 @@
         </w:rPr>
         <w:t xml:space="preserve">1　</w:t>
       </w:r>
-      <w:hyperlink w:history="1" r:id="rIdvpnks63tpohgqpcmfeam7">
+      <w:hyperlink w:history="1" r:id="rIdnahw4bdk1pspyiudsq76w">
         <w:r>
           <w:rPr>
             <w:rStyle w:val="Hyperlink"/>
@@ -10693,7 +10610,7 @@
         </w:rPr>
         <w:t xml:space="preserve">2　</w:t>
       </w:r>
-      <w:hyperlink w:history="1" r:id="rId6np_rtn6ejohenwbn9w-x">
+      <w:hyperlink w:history="1" r:id="rId7l6qqrhh7cgy952qysuxf">
         <w:r>
           <w:rPr>
             <w:rStyle w:val="Hyperlink"/>
@@ -10719,7 +10636,7 @@
         </w:rPr>
         <w:t xml:space="preserve">3　</w:t>
       </w:r>
-      <w:hyperlink w:history="1" r:id="rIdpuewagfb_td6vwlr0edhf">
+      <w:hyperlink w:history="1" r:id="rIdqfg5xyxwfimsj-wffkyan">
         <w:r>
           <w:rPr>
             <w:rStyle w:val="Hyperlink"/>
@@ -10745,7 +10662,7 @@
         </w:rPr>
         <w:t xml:space="preserve">4　</w:t>
       </w:r>
-      <w:hyperlink w:history="1" r:id="rId9njbfn4--3nbw4mhgm5pl">
+      <w:hyperlink w:history="1" r:id="rIdvsoqydnuwahbofibdye1f">
         <w:r>
           <w:rPr>
             <w:rStyle w:val="Hyperlink"/>
@@ -10771,7 +10688,7 @@
         </w:rPr>
         <w:t xml:space="preserve">5　</w:t>
       </w:r>
-      <w:hyperlink w:history="1" r:id="rIddrff-ncpldgquvghjtgaz">
+      <w:hyperlink w:history="1" r:id="rIdz60qyctjms-rysoqc5ln9">
         <w:r>
           <w:rPr>
             <w:rStyle w:val="Hyperlink"/>
@@ -10797,7 +10714,7 @@
         </w:rPr>
         <w:t xml:space="preserve">6, 7, 8　</w:t>
       </w:r>
-      <w:hyperlink w:history="1" r:id="rIdp0co4_ptgt5nsmvwmbget">
+      <w:hyperlink w:history="1" r:id="rIdhq5ig0n6ymgejev-jxsyf">
         <w:r>
           <w:rPr>
             <w:rStyle w:val="Hyperlink"/>
@@ -10823,7 +10740,7 @@
         </w:rPr>
         <w:t xml:space="preserve">9　</w:t>
       </w:r>
-      <w:hyperlink w:history="1" r:id="rIdwfkg6xga55yaygebcyg-2">
+      <w:hyperlink w:history="1" r:id="rIdnfejenp7awtn1ndyv6dli">
         <w:r>
           <w:rPr>
             <w:rStyle w:val="Hyperlink"/>
@@ -11013,7 +10930,7 @@
           <w:sz w:val="22"/>
           <w:szCs w:val="22"/>
         </w:rPr>
-        <w:t xml:space="preserve">本校提供以下輔導支援（包括輔導活動及特定空間），協助資優學生紓緩壓力並建立師生溝通橋樑。學生支援小組、家長與教育心理學家共同為有需要的學生訂立及推行輔導計劃，並定期檢討計劃成效。對於有情意需要的雙重特殊資優學生，本校為其安排</w:t>
+        <w:t xml:space="preserve">本校提供以下輔導支援（包括輔導活動及特定空間），協助資優學生紓緩壓力並建立師生溝通橋樑。學生支援小組、家長與教育心理學家共同為學生訂立及推行輔導計劃，並定期檢討計劃成效。對於有情意需要的雙重特殊資優學生，本校為其安排</w:t>
       </w:r>
       <w:r>
         <w:rPr>
@@ -11700,7 +11617,7 @@
         </w:rPr>
         <w:t xml:space="preserve">1　</w:t>
       </w:r>
-      <w:hyperlink w:history="1" r:id="rIdeuwwdiailf-juxpzoirv5">
+      <w:hyperlink w:history="1" r:id="rId726r7smn2oul-syjhnj_p">
         <w:r>
           <w:rPr>
             <w:rStyle w:val="Hyperlink"/>
@@ -11726,7 +11643,7 @@
         </w:rPr>
         <w:t xml:space="preserve">2　</w:t>
       </w:r>
-      <w:hyperlink w:history="1" r:id="rIdnghbkeede9zkvkrjoyk8s">
+      <w:hyperlink w:history="1" r:id="rIdkblyfaqhg2z7fotfmyxro">
         <w:r>
           <w:rPr>
             <w:rStyle w:val="Hyperlink"/>
@@ -11752,7 +11669,7 @@
         </w:rPr>
         <w:t xml:space="preserve">3　</w:t>
       </w:r>
-      <w:hyperlink w:history="1" r:id="rId_x2l9gtpeiyqhg7xy60ug">
+      <w:hyperlink w:history="1" r:id="rIddtapghcjhgijl6cd3wgzz">
         <w:r>
           <w:rPr>
             <w:rStyle w:val="Hyperlink"/>
@@ -11778,7 +11695,7 @@
         </w:rPr>
         <w:t xml:space="preserve">4　</w:t>
       </w:r>
-      <w:hyperlink w:history="1" r:id="rIddpfhqvc1oy5v-a-tboo6u">
+      <w:hyperlink w:history="1" r:id="rIdiigtgwd9krmij7h9leufy">
         <w:r>
           <w:rPr>
             <w:rStyle w:val="Hyperlink"/>
@@ -11804,7 +11721,7 @@
         </w:rPr>
         <w:t xml:space="preserve">5　</w:t>
       </w:r>
-      <w:hyperlink w:history="1" r:id="rIdrjpli22ixfy674sduodmz">
+      <w:hyperlink w:history="1" r:id="rIdqkklp0fs4icyazu1hym0g">
         <w:r>
           <w:rPr>
             <w:rStyle w:val="Hyperlink"/>
@@ -11830,7 +11747,7 @@
         </w:rPr>
         <w:t xml:space="preserve">6　</w:t>
       </w:r>
-      <w:hyperlink w:history="1" r:id="rIdczbwau1jpffvcyso3uuvz">
+      <w:hyperlink w:history="1" r:id="rIdr6no3hl6jq7gce1ndg84h">
         <w:r>
           <w:rPr>
             <w:rStyle w:val="Hyperlink"/>
@@ -11856,7 +11773,7 @@
         </w:rPr>
         <w:t xml:space="preserve">7　</w:t>
       </w:r>
-      <w:hyperlink w:history="1" r:id="rId2dr0nqjl8rkqs7ada9phq">
+      <w:hyperlink w:history="1" r:id="rIdvumkwzanzrgltwbf1bl3a">
         <w:r>
           <w:rPr>
             <w:rStyle w:val="Hyperlink"/>
@@ -11882,7 +11799,7 @@
         </w:rPr>
         <w:t xml:space="preserve">8, 13　</w:t>
       </w:r>
-      <w:hyperlink w:history="1" r:id="rIdoor4huijznc5ior5fabla">
+      <w:hyperlink w:history="1" r:id="rIdk-2j5lrtrgkpgbocvh3xk">
         <w:r>
           <w:rPr>
             <w:rStyle w:val="Hyperlink"/>
@@ -11908,7 +11825,7 @@
         </w:rPr>
         <w:t xml:space="preserve">9　</w:t>
       </w:r>
-      <w:hyperlink w:history="1" r:id="rId8hbkdzo7rh9iwmbiqrpvo">
+      <w:hyperlink w:history="1" r:id="rId1nxdlerfaojx08_n3bgdx">
         <w:r>
           <w:rPr>
             <w:rStyle w:val="Hyperlink"/>
@@ -11934,7 +11851,7 @@
         </w:rPr>
         <w:t xml:space="preserve">10　</w:t>
       </w:r>
-      <w:hyperlink w:history="1" r:id="rIdtv0picxbatba9qawjbv_a">
+      <w:hyperlink w:history="1" r:id="rId64gxztxnr6zlnoaesiyx4">
         <w:r>
           <w:rPr>
             <w:rStyle w:val="Hyperlink"/>
@@ -11960,7 +11877,7 @@
         </w:rPr>
         <w:t xml:space="preserve">11　</w:t>
       </w:r>
-      <w:hyperlink w:history="1" r:id="rId6ny828_sye3u746dibe0w">
+      <w:hyperlink w:history="1" r:id="rId7rultrbdkbpjddcdkplkk">
         <w:r>
           <w:rPr>
             <w:rStyle w:val="Hyperlink"/>
@@ -11986,7 +11903,7 @@
         </w:rPr>
         <w:t xml:space="preserve">12　</w:t>
       </w:r>
-      <w:hyperlink w:history="1" r:id="rIdrlfjw3_f1tux2788fh0im">
+      <w:hyperlink w:history="1" r:id="rIdjtppu8uu7udsgf6ciz1fp">
         <w:r>
           <w:rPr>
             <w:rStyle w:val="Hyperlink"/>
@@ -12012,7 +11929,7 @@
         </w:rPr>
         <w:t xml:space="preserve">14　</w:t>
       </w:r>
-      <w:hyperlink w:history="1" r:id="rId-qi0qgxscxwoa45gwa8x3">
+      <w:hyperlink w:history="1" r:id="rIdfsmjmqzykl4lq629tdtj5">
         <w:r>
           <w:rPr>
             <w:rStyle w:val="Hyperlink"/>
@@ -12038,7 +11955,7 @@
         </w:rPr>
         <w:t xml:space="preserve">15　</w:t>
       </w:r>
-      <w:hyperlink w:history="1" r:id="rIdxpoy28e0dadb0jqea0eeg">
+      <w:hyperlink w:history="1" r:id="rIdmygz5ee2jeqkmz7edul8f">
         <w:r>
           <w:rPr>
             <w:rStyle w:val="Hyperlink"/>
@@ -12064,7 +11981,7 @@
         </w:rPr>
         <w:t xml:space="preserve">16　</w:t>
       </w:r>
-      <w:hyperlink w:history="1" r:id="rIdtg74uhgqzeedw09tqb_eo">
+      <w:hyperlink w:history="1" r:id="rId8lvbkqiwrmsbw65jz_yoa">
         <w:r>
           <w:rPr>
             <w:rStyle w:val="Hyperlink"/>
@@ -12584,7 +12501,7 @@
                 <w:sz w:val="20"/>
                 <w:szCs w:val="20"/>
               </w:rPr>
-              <w:t xml:space="preserve">提供全面的支援及個案管理，定期評估支援成效</w:t>
+              <w:t xml:space="preserve">提供全面的支援及個案管理</w:t>
             </w:r>
           </w:p>
         </w:tc>
@@ -13268,7 +13185,7 @@
           <w:sz w:val="22"/>
           <w:szCs w:val="22"/>
         </w:rPr>
-        <w:t xml:space="preserve">本校須定期舉行教師專業培訓活動，增進教師對雙重特殊資優學生的認識，包括了解如何處理其困擾和難題，以及如何在課堂中有效實踐「強項為本」的支援策略。</w:t>
+        <w:t xml:space="preserve">本校須定期舉行教師專業培訓活動，增進教師對雙重特殊資優學生的認識，包括了解如何處理其困擾和難題。</w:t>
       </w:r>
       <w:r>
         <w:rPr>
@@ -13311,7 +13228,7 @@
         </w:rPr>
         <w:t xml:space="preserve">1　</w:t>
       </w:r>
-      <w:hyperlink w:history="1" r:id="rId8wcubjkmovtb-jrqzvsxa">
+      <w:hyperlink w:history="1" r:id="rId6lrezr7cp2upb-j9p7qjs">
         <w:r>
           <w:rPr>
             <w:rStyle w:val="Hyperlink"/>
@@ -13337,7 +13254,7 @@
         </w:rPr>
         <w:t xml:space="preserve">2, 14　</w:t>
       </w:r>
-      <w:hyperlink w:history="1" r:id="rIdrzioaghxrr9aamqrsp3dv">
+      <w:hyperlink w:history="1" r:id="rIdu7ho7w1suagr6ojvtg8bx">
         <w:r>
           <w:rPr>
             <w:rStyle w:val="Hyperlink"/>
@@ -13363,7 +13280,7 @@
         </w:rPr>
         <w:t xml:space="preserve">3　</w:t>
       </w:r>
-      <w:hyperlink w:history="1" r:id="rIdm-tiykzbchy5zfoypxx6p">
+      <w:hyperlink w:history="1" r:id="rIdvajhfgozpg2cxn4nrjbxh">
         <w:r>
           <w:rPr>
             <w:rStyle w:val="Hyperlink"/>
@@ -13389,7 +13306,7 @@
         </w:rPr>
         <w:t xml:space="preserve">4, 9　</w:t>
       </w:r>
-      <w:hyperlink w:history="1" r:id="rIdnhw2mirxl1xiy1lp8fgqp">
+      <w:hyperlink w:history="1" r:id="rIdboppimzbnxgs6yx7kfcen">
         <w:r>
           <w:rPr>
             <w:rStyle w:val="Hyperlink"/>
@@ -13415,7 +13332,7 @@
         </w:rPr>
         <w:t xml:space="preserve">5, 11　</w:t>
       </w:r>
-      <w:hyperlink w:history="1" r:id="rId10oq0hp2c2hnplmy2o9yy">
+      <w:hyperlink w:history="1" r:id="rIdqkzp9uqiuetmjvik3xyt3">
         <w:r>
           <w:rPr>
             <w:rStyle w:val="Hyperlink"/>
@@ -13441,7 +13358,7 @@
         </w:rPr>
         <w:t xml:space="preserve">6　</w:t>
       </w:r>
-      <w:hyperlink w:history="1" r:id="rIdarmdjeie_96wg-twdh51a">
+      <w:hyperlink w:history="1" r:id="rIdz86esvjhihg-qwddn7haq">
         <w:r>
           <w:rPr>
             <w:rStyle w:val="Hyperlink"/>
@@ -13467,7 +13384,7 @@
         </w:rPr>
         <w:t xml:space="preserve">7, 10, 12　</w:t>
       </w:r>
-      <w:hyperlink w:history="1" r:id="rIdb99qbieph1duqujtt9wbv">
+      <w:hyperlink w:history="1" r:id="rId5owea_h30wn_5bvprrlra">
         <w:r>
           <w:rPr>
             <w:rStyle w:val="Hyperlink"/>
@@ -13493,7 +13410,7 @@
         </w:rPr>
         <w:t xml:space="preserve">8　</w:t>
       </w:r>
-      <w:hyperlink w:history="1" r:id="rIdet9edm2gjipqdzqy9727m">
+      <w:hyperlink w:history="1" r:id="rIdki-_y3dxvuntkb4olrutg">
         <w:r>
           <w:rPr>
             <w:rStyle w:val="Hyperlink"/>
@@ -13519,7 +13436,7 @@
         </w:rPr>
         <w:t xml:space="preserve">13　</w:t>
       </w:r>
-      <w:hyperlink w:history="1" r:id="rIddfjdvh001fefygsfvjpqv">
+      <w:hyperlink w:history="1" r:id="rIddrioaxbz3lkelqjz1t8bo">
         <w:r>
           <w:rPr>
             <w:rStyle w:val="Hyperlink"/>
@@ -13545,7 +13462,7 @@
         </w:rPr>
         <w:t xml:space="preserve">15　</w:t>
       </w:r>
-      <w:hyperlink w:history="1" r:id="rIdrnfopwn9vvwnawrihnxzg">
+      <w:hyperlink w:history="1" r:id="rIdisynsmeuxyzcmsilkhea3">
         <w:r>
           <w:rPr>
             <w:rStyle w:val="Hyperlink"/>
@@ -13571,7 +13488,7 @@
         </w:rPr>
         <w:t xml:space="preserve">16　</w:t>
       </w:r>
-      <w:hyperlink w:history="1" r:id="rIdz1u16lfqqatzhdr2a0voy">
+      <w:hyperlink w:history="1" r:id="rIdhxvsu4rbr2lk8ech8qekq">
         <w:r>
           <w:rPr>
             <w:rStyle w:val="Hyperlink"/>
@@ -13597,7 +13514,7 @@
         </w:rPr>
         <w:t xml:space="preserve">17　</w:t>
       </w:r>
-      <w:hyperlink w:history="1" r:id="rIdhxemlkcl-jlqugtlsenjg">
+      <w:hyperlink w:history="1" r:id="rId9p5tsoudjkzm9yfxsb4k9">
         <w:r>
           <w:rPr>
             <w:rStyle w:val="Hyperlink"/>
@@ -13623,7 +13540,7 @@
         </w:rPr>
         <w:t xml:space="preserve">18, 20　</w:t>
       </w:r>
-      <w:hyperlink w:history="1" r:id="rId-jtnyir94ivrvh8h4j80_">
+      <w:hyperlink w:history="1" r:id="rId_kzju9dvm8b8ac6n085rd">
         <w:r>
           <w:rPr>
             <w:rStyle w:val="Hyperlink"/>
@@ -13649,7 +13566,7 @@
         </w:rPr>
         <w:t xml:space="preserve">19　</w:t>
       </w:r>
-      <w:hyperlink w:history="1" r:id="rIdxu8bplva3monpin5fzdb_">
+      <w:hyperlink w:history="1" r:id="rId-wnybzxqz8afaa-g1y6rf">
         <w:r>
           <w:rPr>
             <w:rStyle w:val="Hyperlink"/>
@@ -14210,24 +14127,7 @@
           <w:sz w:val="22"/>
           <w:szCs w:val="22"/>
         </w:rPr>
-        <w:t xml:space="preserve">教師完成教育局資優教育深造課程全數六個模組課程（共18小時）後，將可獲頒發「資優教育深造課程」電子證書。本校鼓勵教師修讀該深造課程，並</w:t>
-      </w:r>
-      <w:r>
-        <w:rPr>
-          <w:rFonts w:ascii="Microsoft JhengHei" w:cs="Microsoft JhengHei" w:eastAsia="Microsoft JhengHei" w:hAnsi="Microsoft JhengHei"/>
-          <w:sz w:val="22"/>
-          <w:szCs w:val="22"/>
-          <w:shd w:fill="FFF2B8" w:val="clear"/>
-        </w:rPr>
-        <w:t xml:space="preserve">將完成情況納入教師專業發展記錄</w:t>
-      </w:r>
-      <w:r>
-        <w:rPr>
-          <w:rFonts w:ascii="Microsoft JhengHei" w:cs="Microsoft JhengHei" w:eastAsia="Microsoft JhengHei" w:hAnsi="Microsoft JhengHei"/>
-          <w:sz w:val="22"/>
-          <w:szCs w:val="22"/>
-        </w:rPr>
-        <w:t xml:space="preserve">。</w:t>
+        <w:t xml:space="preserve">教師完成教育局資優教育深造課程全數六個模組課程（共18小時）後，將可獲頒發「資優教育深造課程」電子證書。</w:t>
       </w:r>
       <w:r>
         <w:rPr>
@@ -14356,7 +14256,7 @@
         </w:rPr>
         <w:t xml:space="preserve">1　</w:t>
       </w:r>
-      <w:hyperlink w:history="1" r:id="rId_tixpy15knephxqmaljds">
+      <w:hyperlink w:history="1" r:id="rIdzxhfetdvxyx7zhu6d6op8">
         <w:r>
           <w:rPr>
             <w:rStyle w:val="Hyperlink"/>
@@ -14382,7 +14282,7 @@
         </w:rPr>
         <w:t xml:space="preserve">2　</w:t>
       </w:r>
-      <w:hyperlink w:history="1" r:id="rIdhzjfludtzp-wx8odse5oh">
+      <w:hyperlink w:history="1" r:id="rIdzpr4op7_gr4xiidnumluj">
         <w:r>
           <w:rPr>
             <w:rStyle w:val="Hyperlink"/>
@@ -14408,7 +14308,7 @@
         </w:rPr>
         <w:t xml:space="preserve">3　</w:t>
       </w:r>
-      <w:hyperlink w:history="1" r:id="rIduey2u2_eflo71smfjzsib">
+      <w:hyperlink w:history="1" r:id="rIdaglmwc_bryik6ylcuf4z0">
         <w:r>
           <w:rPr>
             <w:rStyle w:val="Hyperlink"/>
@@ -14434,7 +14334,7 @@
         </w:rPr>
         <w:t xml:space="preserve">4　</w:t>
       </w:r>
-      <w:hyperlink w:history="1" r:id="rIditw_fbggv1tcefwxfpcsd">
+      <w:hyperlink w:history="1" r:id="rIdg7s7a4daoshqlgh7mfrad">
         <w:r>
           <w:rPr>
             <w:rStyle w:val="Hyperlink"/>
@@ -14460,7 +14360,7 @@
         </w:rPr>
         <w:t xml:space="preserve">5　</w:t>
       </w:r>
-      <w:hyperlink w:history="1" r:id="rIdvrswawpoqwqpgrwrasxqx">
+      <w:hyperlink w:history="1" r:id="rIdjbp9_r8rq3qmkftjyte8n">
         <w:r>
           <w:rPr>
             <w:rStyle w:val="Hyperlink"/>
@@ -14486,7 +14386,7 @@
         </w:rPr>
         <w:t xml:space="preserve">6　</w:t>
       </w:r>
-      <w:hyperlink w:history="1" r:id="rIdxbuzhyspysxx8ydjm3qwu">
+      <w:hyperlink w:history="1" r:id="rIdeq6merbfljctqqu41xnql">
         <w:r>
           <w:rPr>
             <w:rStyle w:val="Hyperlink"/>
@@ -14512,7 +14412,7 @@
         </w:rPr>
         <w:t xml:space="preserve">7　</w:t>
       </w:r>
-      <w:hyperlink w:history="1" r:id="rId71vbgn7awj4rbyuwksmxl">
+      <w:hyperlink w:history="1" r:id="rIdgvoqwb0kr-vmxdvi1us7_">
         <w:r>
           <w:rPr>
             <w:rStyle w:val="Hyperlink"/>
@@ -14538,7 +14438,7 @@
         </w:rPr>
         <w:t xml:space="preserve">8　</w:t>
       </w:r>
-      <w:hyperlink w:history="1" r:id="rIdf06mjwfpcbvoktibmpabs">
+      <w:hyperlink w:history="1" r:id="rIdw_mkg2quidutipamay6ym">
         <w:r>
           <w:rPr>
             <w:rStyle w:val="Hyperlink"/>
@@ -14605,7 +14505,7 @@
           <w:sz w:val="22"/>
           <w:szCs w:val="22"/>
         </w:rPr>
-        <w:t xml:space="preserve">，內容涵蓋資優學生及雙重特殊資優學生的特質、學習困難及情意需要，協助家長深入了解子女的發展需求。</w:t>
+        <w:t xml:space="preserve">，內容涵蓋資優學生及雙重特殊資優學生的特質、困難及情意需要，協助家長深入了解子女的發展需求。</w:t>
       </w:r>
       <w:r>
         <w:rPr>
@@ -14656,7 +14556,7 @@
           <w:sz w:val="22"/>
           <w:szCs w:val="22"/>
         </w:rPr>
-        <w:t xml:space="preserve">之間的協調與交流，以確保各方對資優學生（尤其是面對心理或情緒健康風險之學生）維持一致的期望，並能及時掌握學生出現的任何新行為或突發事件。必要時，應諮詢相關專業人士。本校各溝通渠道及相應職責如下表所示：</w:t>
+        <w:t xml:space="preserve">之間的協調與交流，以確保各方對資優學生（尤其是面對心理或情緒健康風險之學生）維持一致的期望，並能及時掌握學生出現的任何新行為。必要時，應諮詢相關專業人士。本校各溝通渠道及相應職責如下表所示：</w:t>
       </w:r>
       <w:r>
         <w:rPr>
@@ -14975,7 +14875,7 @@
                 <w:sz w:val="20"/>
                 <w:szCs w:val="20"/>
               </w:rPr>
-              <w:t xml:space="preserve">調整雙方對學生的期望，保持一致，及時跟進新行為或突發事件</w:t>
+              <w:t xml:space="preserve">調整雙方對學生的期望，保持一致，及時跟進新行為</w:t>
             </w:r>
           </w:p>
         </w:tc>
@@ -15058,7 +14958,7 @@
                 <w:sz w:val="20"/>
                 <w:szCs w:val="20"/>
               </w:rPr>
-              <w:t xml:space="preserve">就學生心理或情緒健康風險進行評估，協調支援策略</w:t>
+              <w:t xml:space="preserve">就學生心理或情緒健康風險協調支援策略</w:t>
             </w:r>
           </w:p>
         </w:tc>
@@ -15107,7 +15007,7 @@
         </w:rPr>
         <w:t xml:space="preserve">1, 2　</w:t>
       </w:r>
-      <w:hyperlink w:history="1" r:id="rIdjdyz6chrjy15nbm_y_ti5">
+      <w:hyperlink w:history="1" r:id="rIdd0onmmml-epkqsekrnon9">
         <w:r>
           <w:rPr>
             <w:rStyle w:val="Hyperlink"/>
@@ -15133,7 +15033,7 @@
         </w:rPr>
         <w:t xml:space="preserve">3　</w:t>
       </w:r>
-      <w:hyperlink w:history="1" r:id="rIdxoofikuo5uri0dav9rxhx">
+      <w:hyperlink w:history="1" r:id="rIdtnce1h0t4c_vgsg-loij9">
         <w:r>
           <w:rPr>
             <w:rStyle w:val="Hyperlink"/>
@@ -15159,7 +15059,7 @@
         </w:rPr>
         <w:t xml:space="preserve">4　</w:t>
       </w:r>
-      <w:hyperlink w:history="1" r:id="rIdsnkpvxikmyxhary94kllz">
+      <w:hyperlink w:history="1" r:id="rIddhroriu8vcocnp8yl_duy">
         <w:r>
           <w:rPr>
             <w:rStyle w:val="Hyperlink"/>
@@ -15813,7 +15713,7 @@
         </w:rPr>
         <w:t xml:space="preserve">1　</w:t>
       </w:r>
-      <w:hyperlink w:history="1" r:id="rIdquyn072dpjfn5sdgn34aq">
+      <w:hyperlink w:history="1" r:id="rIdzfoyzciqdb4t1yfsm86c6">
         <w:r>
           <w:rPr>
             <w:rStyle w:val="Hyperlink"/>
@@ -15839,7 +15739,7 @@
         </w:rPr>
         <w:t xml:space="preserve">2, 16　</w:t>
       </w:r>
-      <w:hyperlink w:history="1" r:id="rIdkmbo3wkjlqsdgcscvmtam">
+      <w:hyperlink w:history="1" r:id="rIdfw5nii0j8abqgiihtzeej">
         <w:r>
           <w:rPr>
             <w:rStyle w:val="Hyperlink"/>
@@ -15865,7 +15765,7 @@
         </w:rPr>
         <w:t xml:space="preserve">3　</w:t>
       </w:r>
-      <w:hyperlink w:history="1" r:id="rIdfipm2rk1xyzadeipahmsy">
+      <w:hyperlink w:history="1" r:id="rId8ynopl_e1fxkbrzg6ck1i">
         <w:r>
           <w:rPr>
             <w:rStyle w:val="Hyperlink"/>
@@ -15891,7 +15791,7 @@
         </w:rPr>
         <w:t xml:space="preserve">4, 5　</w:t>
       </w:r>
-      <w:hyperlink w:history="1" r:id="rId1lrr1osgkjxksslwqzuy2">
+      <w:hyperlink w:history="1" r:id="rIdfmbuec2a3itxenu-ace87">
         <w:r>
           <w:rPr>
             <w:rStyle w:val="Hyperlink"/>
@@ -15917,7 +15817,7 @@
         </w:rPr>
         <w:t xml:space="preserve">6　</w:t>
       </w:r>
-      <w:hyperlink w:history="1" r:id="rIdrhvvaeh4efrgzyl4gr4n5">
+      <w:hyperlink w:history="1" r:id="rIdbat8ccxojlpe-egums5et">
         <w:r>
           <w:rPr>
             <w:rStyle w:val="Hyperlink"/>
@@ -15943,7 +15843,7 @@
         </w:rPr>
         <w:t xml:space="preserve">7　</w:t>
       </w:r>
-      <w:hyperlink w:history="1" r:id="rIdb2cbeqk3zc4grz0knptmr">
+      <w:hyperlink w:history="1" r:id="rIdkkmhkvp1r8iur24zfyq7f">
         <w:r>
           <w:rPr>
             <w:rStyle w:val="Hyperlink"/>
@@ -15969,7 +15869,7 @@
         </w:rPr>
         <w:t xml:space="preserve">8　</w:t>
       </w:r>
-      <w:hyperlink w:history="1" r:id="rIdgjedoetqaewzn6srazupt">
+      <w:hyperlink w:history="1" r:id="rIdi3rdkcvvw1gtrpbuw-ok7">
         <w:r>
           <w:rPr>
             <w:rStyle w:val="Hyperlink"/>
@@ -15995,7 +15895,7 @@
         </w:rPr>
         <w:t xml:space="preserve">9　</w:t>
       </w:r>
-      <w:hyperlink w:history="1" r:id="rIdfilzeajxlbkppfenu7qqv">
+      <w:hyperlink w:history="1" r:id="rIdfe0_ymibehdskoiiv792s">
         <w:r>
           <w:rPr>
             <w:rStyle w:val="Hyperlink"/>
@@ -16021,7 +15921,7 @@
         </w:rPr>
         <w:t xml:space="preserve">10　</w:t>
       </w:r>
-      <w:hyperlink w:history="1" r:id="rIdjgrfrjpgzexklcdspjqwo">
+      <w:hyperlink w:history="1" r:id="rIduq34ufaedbnpcxd3ff2s_">
         <w:r>
           <w:rPr>
             <w:rStyle w:val="Hyperlink"/>
@@ -16047,7 +15947,7 @@
         </w:rPr>
         <w:t xml:space="preserve">11　</w:t>
       </w:r>
-      <w:hyperlink w:history="1" r:id="rIdx_62inzw-8eyma33hcr_3">
+      <w:hyperlink w:history="1" r:id="rId3nfgm0asdnlam-shgqvxd">
         <w:r>
           <w:rPr>
             <w:rStyle w:val="Hyperlink"/>
@@ -16073,7 +15973,7 @@
         </w:rPr>
         <w:t xml:space="preserve">12　</w:t>
       </w:r>
-      <w:hyperlink w:history="1" r:id="rIdnc8f-zarw9cytdhqlgd6b">
+      <w:hyperlink w:history="1" r:id="rId5olphw2mtrgytzkiw1hur">
         <w:r>
           <w:rPr>
             <w:rStyle w:val="Hyperlink"/>
@@ -16099,7 +15999,7 @@
         </w:rPr>
         <w:t xml:space="preserve">13　</w:t>
       </w:r>
-      <w:hyperlink w:history="1" r:id="rIduxcb5g1s6l4k3s9rwuokp">
+      <w:hyperlink w:history="1" r:id="rId052fqrpqq2r4kg-2npm4e">
         <w:r>
           <w:rPr>
             <w:rStyle w:val="Hyperlink"/>
@@ -16125,7 +16025,7 @@
         </w:rPr>
         <w:t xml:space="preserve">14　</w:t>
       </w:r>
-      <w:hyperlink w:history="1" r:id="rId84krlcniwyeuhcozm1cec">
+      <w:hyperlink w:history="1" r:id="rId7dfqe_fwygemmoeno9obd">
         <w:r>
           <w:rPr>
             <w:rStyle w:val="Hyperlink"/>
@@ -16151,7 +16051,7 @@
         </w:rPr>
         <w:t xml:space="preserve">15, 18　</w:t>
       </w:r>
-      <w:hyperlink w:history="1" r:id="rIdk8xcfhgvtcxzxj6sfbo6f">
+      <w:hyperlink w:history="1" r:id="rIdql1-ovbamupx_qlej7bis">
         <w:r>
           <w:rPr>
             <w:rStyle w:val="Hyperlink"/>
@@ -16177,7 +16077,7 @@
         </w:rPr>
         <w:t xml:space="preserve">17　</w:t>
       </w:r>
-      <w:hyperlink w:history="1" r:id="rIdfbkdhh3_sqqg3f31vtsnp">
+      <w:hyperlink w:history="1" r:id="rIdamcpsa1sfdrmuxgrjrr2n">
         <w:r>
           <w:rPr>
             <w:rStyle w:val="Hyperlink"/>
@@ -16203,7 +16103,7 @@
         </w:rPr>
         <w:t xml:space="preserve">19　</w:t>
       </w:r>
-      <w:hyperlink w:history="1" r:id="rIdupleiye3aaeshuzmot-9w">
+      <w:hyperlink w:history="1" r:id="rIdwrdxu0wldrdo1qlae5cwk">
         <w:r>
           <w:rPr>
             <w:rStyle w:val="Hyperlink"/>
@@ -16229,7 +16129,7 @@
         </w:rPr>
         <w:t xml:space="preserve">20　</w:t>
       </w:r>
-      <w:hyperlink w:history="1" r:id="rIdiwy5hy0gnuzljwm0ywasm">
+      <w:hyperlink w:history="1" r:id="rIdjrovhek3fez-21vwhwfuk">
         <w:r>
           <w:rPr>
             <w:rStyle w:val="Hyperlink"/>
@@ -16255,7 +16155,7 @@
         </w:rPr>
         <w:t xml:space="preserve">21　</w:t>
       </w:r>
-      <w:hyperlink w:history="1" r:id="rIdbkkywx0krazc8wceqbaed">
+      <w:hyperlink w:history="1" r:id="rIdlrptzgohsoa3dahofezov">
         <w:r>
           <w:rPr>
             <w:rStyle w:val="Hyperlink"/>
@@ -16645,7 +16545,7 @@
         </w:rPr>
         <w:t xml:space="preserve">1, 3　</w:t>
       </w:r>
-      <w:hyperlink w:history="1" r:id="rIdwwomvhnbiofxx-zjtfxgj">
+      <w:hyperlink w:history="1" r:id="rIduq-0hgzrvdmo4mx16vqnh">
         <w:r>
           <w:rPr>
             <w:rStyle w:val="Hyperlink"/>
@@ -16671,7 +16571,7 @@
         </w:rPr>
         <w:t xml:space="preserve">2　</w:t>
       </w:r>
-      <w:hyperlink w:history="1" r:id="rIdygpnnbscuaezqz0remxsn">
+      <w:hyperlink w:history="1" r:id="rIdhnq2szf9orlgaqijfs7bn">
         <w:r>
           <w:rPr>
             <w:rStyle w:val="Hyperlink"/>
@@ -16697,7 +16597,7 @@
         </w:rPr>
         <w:t xml:space="preserve">4　</w:t>
       </w:r>
-      <w:hyperlink w:history="1" r:id="rIdoqlyog9kta9h3gtamn1d1">
+      <w:hyperlink w:history="1" r:id="rIdiqlpjkihcuz3qsqvdwgwo">
         <w:r>
           <w:rPr>
             <w:rStyle w:val="Hyperlink"/>

</xml_diff>